<commit_message>
Update summary operating system
</commit_message>
<xml_diff>
--- a/OPERATING_SYSTEM.docx
+++ b/OPERATING_SYSTEM.docx
@@ -3916,6 +3916,1841 @@
       <w:pPr>
         <w:rPr>
           <w:rFonts w:asciiTheme="majorHAnsi" w:hAnsiTheme="majorHAnsi" w:cstheme="majorHAnsi"/>
+          <w:b/>
+          <w:bCs/>
+          <w:i/>
+          <w:iCs/>
+          <w:color w:val="00B0F0"/>
+          <w:sz w:val="28"/>
+          <w:szCs w:val="28"/>
+        </w:rPr>
+      </w:pPr>
+      <w:r>
+        <w:rPr>
+          <w:rFonts w:asciiTheme="majorHAnsi" w:hAnsiTheme="majorHAnsi" w:cstheme="majorHAnsi"/>
+          <w:b/>
+          <w:bCs/>
+          <w:i/>
+          <w:iCs/>
+          <w:color w:val="00B0F0"/>
+          <w:sz w:val="28"/>
+          <w:szCs w:val="28"/>
+        </w:rPr>
+        <w:t xml:space="preserve">9. </w:t>
+      </w:r>
+      <w:r>
+        <w:rPr>
+          <w:rFonts w:asciiTheme="majorHAnsi" w:hAnsiTheme="majorHAnsi" w:cstheme="majorHAnsi"/>
+          <w:b/>
+          <w:bCs/>
+          <w:i/>
+          <w:iCs/>
+          <w:color w:val="00B0F0"/>
+          <w:sz w:val="28"/>
+          <w:szCs w:val="28"/>
+        </w:rPr>
+        <w:t>CPU Scheduling</w:t>
+      </w:r>
+    </w:p>
+    <w:p>
+      <w:pPr>
+        <w:rPr>
+          <w:rFonts w:asciiTheme="majorHAnsi" w:hAnsiTheme="majorHAnsi" w:cstheme="majorHAnsi"/>
+          <w:sz w:val="28"/>
+          <w:szCs w:val="28"/>
+        </w:rPr>
+      </w:pPr>
+      <w:r>
+        <w:rPr>
+          <w:rFonts w:asciiTheme="majorHAnsi" w:hAnsiTheme="majorHAnsi" w:cstheme="majorHAnsi"/>
+          <w:sz w:val="28"/>
+          <w:szCs w:val="28"/>
+        </w:rPr>
+        <w:t>The goal of CPU scheduling is to optimize system performance by selecting processes from the ready queue to allocate CPU time.</w:t>
+      </w:r>
+    </w:p>
+    <w:p>
+      <w:pPr>
+        <w:rPr>
+          <w:rFonts w:asciiTheme="majorHAnsi" w:hAnsiTheme="majorHAnsi" w:cstheme="majorHAnsi"/>
+          <w:b/>
+          <w:bCs/>
+          <w:sz w:val="28"/>
+          <w:szCs w:val="28"/>
+        </w:rPr>
+      </w:pPr>
+      <w:r>
+        <w:rPr>
+          <w:rFonts w:asciiTheme="majorHAnsi" w:hAnsiTheme="majorHAnsi" w:cstheme="majorHAnsi"/>
+          <w:b/>
+          <w:bCs/>
+          <w:sz w:val="28"/>
+          <w:szCs w:val="28"/>
+        </w:rPr>
+        <w:t>Scheduling Criteria</w:t>
+      </w:r>
+    </w:p>
+    <w:p>
+      <w:pPr>
+        <w:numPr>
+          <w:ilvl w:val="0"/>
+          <w:numId w:val="12"/>
+        </w:numPr>
+        <w:rPr>
+          <w:rFonts w:asciiTheme="majorHAnsi" w:hAnsiTheme="majorHAnsi" w:cstheme="majorHAnsi"/>
+          <w:sz w:val="28"/>
+          <w:szCs w:val="28"/>
+        </w:rPr>
+      </w:pPr>
+      <w:r>
+        <w:rPr>
+          <w:rFonts w:asciiTheme="majorHAnsi" w:hAnsiTheme="majorHAnsi" w:cstheme="majorHAnsi"/>
+          <w:b/>
+          <w:bCs/>
+          <w:sz w:val="28"/>
+          <w:szCs w:val="28"/>
+        </w:rPr>
+        <w:t>CPU utilization:</w:t>
+      </w:r>
+      <w:r>
+        <w:rPr>
+          <w:rFonts w:asciiTheme="majorHAnsi" w:hAnsiTheme="majorHAnsi" w:cstheme="majorHAnsi"/>
+          <w:sz w:val="28"/>
+          <w:szCs w:val="28"/>
+        </w:rPr>
+        <w:t xml:space="preserve"> The percentage of time the CPU is actively working.</w:t>
+      </w:r>
+    </w:p>
+    <w:p>
+      <w:pPr>
+        <w:numPr>
+          <w:ilvl w:val="0"/>
+          <w:numId w:val="12"/>
+        </w:numPr>
+        <w:rPr>
+          <w:rFonts w:asciiTheme="majorHAnsi" w:hAnsiTheme="majorHAnsi" w:cstheme="majorHAnsi"/>
+          <w:sz w:val="28"/>
+          <w:szCs w:val="28"/>
+        </w:rPr>
+      </w:pPr>
+      <w:r>
+        <w:rPr>
+          <w:rFonts w:asciiTheme="majorHAnsi" w:hAnsiTheme="majorHAnsi" w:cstheme="majorHAnsi"/>
+          <w:b/>
+          <w:bCs/>
+          <w:sz w:val="28"/>
+          <w:szCs w:val="28"/>
+        </w:rPr>
+        <w:t>Throughput:</w:t>
+      </w:r>
+      <w:r>
+        <w:rPr>
+          <w:rFonts w:asciiTheme="majorHAnsi" w:hAnsiTheme="majorHAnsi" w:cstheme="majorHAnsi"/>
+          <w:sz w:val="28"/>
+          <w:szCs w:val="28"/>
+        </w:rPr>
+        <w:t xml:space="preserve"> The number of processes completed per unit of time.</w:t>
+      </w:r>
+    </w:p>
+    <w:p>
+      <w:pPr>
+        <w:numPr>
+          <w:ilvl w:val="0"/>
+          <w:numId w:val="12"/>
+        </w:numPr>
+        <w:rPr>
+          <w:rFonts w:asciiTheme="majorHAnsi" w:hAnsiTheme="majorHAnsi" w:cstheme="majorHAnsi"/>
+          <w:sz w:val="28"/>
+          <w:szCs w:val="28"/>
+        </w:rPr>
+      </w:pPr>
+      <w:r>
+        <w:rPr>
+          <w:rFonts w:asciiTheme="majorHAnsi" w:hAnsiTheme="majorHAnsi" w:cstheme="majorHAnsi"/>
+          <w:b/>
+          <w:bCs/>
+          <w:sz w:val="28"/>
+          <w:szCs w:val="28"/>
+        </w:rPr>
+        <w:t>Turnaround time:</w:t>
+      </w:r>
+      <w:r>
+        <w:rPr>
+          <w:rFonts w:asciiTheme="majorHAnsi" w:hAnsiTheme="majorHAnsi" w:cstheme="majorHAnsi"/>
+          <w:sz w:val="28"/>
+          <w:szCs w:val="28"/>
+        </w:rPr>
+        <w:t xml:space="preserve"> The total time from when a process is submitted to when it finishes execution.</w:t>
+      </w:r>
+    </w:p>
+    <w:p>
+      <w:pPr>
+        <w:numPr>
+          <w:ilvl w:val="0"/>
+          <w:numId w:val="12"/>
+        </w:numPr>
+        <w:rPr>
+          <w:rFonts w:asciiTheme="majorHAnsi" w:hAnsiTheme="majorHAnsi" w:cstheme="majorHAnsi"/>
+          <w:sz w:val="28"/>
+          <w:szCs w:val="28"/>
+        </w:rPr>
+      </w:pPr>
+      <w:r>
+        <w:rPr>
+          <w:rFonts w:asciiTheme="majorHAnsi" w:hAnsiTheme="majorHAnsi" w:cstheme="majorHAnsi"/>
+          <w:b/>
+          <w:bCs/>
+          <w:sz w:val="28"/>
+          <w:szCs w:val="28"/>
+        </w:rPr>
+        <w:t>Waiting time:</w:t>
+      </w:r>
+      <w:r>
+        <w:rPr>
+          <w:rFonts w:asciiTheme="majorHAnsi" w:hAnsiTheme="majorHAnsi" w:cstheme="majorHAnsi"/>
+          <w:sz w:val="28"/>
+          <w:szCs w:val="28"/>
+        </w:rPr>
+        <w:t xml:space="preserve"> The total time a process spends waiting in the ready queue.</w:t>
+      </w:r>
+    </w:p>
+    <w:p>
+      <w:pPr>
+        <w:numPr>
+          <w:ilvl w:val="0"/>
+          <w:numId w:val="12"/>
+        </w:numPr>
+        <w:rPr>
+          <w:rFonts w:asciiTheme="majorHAnsi" w:hAnsiTheme="majorHAnsi" w:cstheme="majorHAnsi"/>
+          <w:sz w:val="28"/>
+          <w:szCs w:val="28"/>
+        </w:rPr>
+      </w:pPr>
+      <w:r>
+        <w:rPr>
+          <w:rFonts w:asciiTheme="majorHAnsi" w:hAnsiTheme="majorHAnsi" w:cstheme="majorHAnsi"/>
+          <w:b/>
+          <w:bCs/>
+          <w:sz w:val="28"/>
+          <w:szCs w:val="28"/>
+        </w:rPr>
+        <w:t>Response time:</w:t>
+      </w:r>
+      <w:r>
+        <w:rPr>
+          <w:rFonts w:asciiTheme="majorHAnsi" w:hAnsiTheme="majorHAnsi" w:cstheme="majorHAnsi"/>
+          <w:sz w:val="28"/>
+          <w:szCs w:val="28"/>
+        </w:rPr>
+        <w:t xml:space="preserve"> The time from when a request is submitted until the first response is produced.</w:t>
+      </w:r>
+    </w:p>
+    <w:p>
+      <w:pPr>
+        <w:rPr>
+          <w:rFonts w:asciiTheme="majorHAnsi" w:hAnsiTheme="majorHAnsi" w:cstheme="majorHAnsi"/>
+          <w:b/>
+          <w:bCs/>
+          <w:sz w:val="28"/>
+          <w:szCs w:val="28"/>
+        </w:rPr>
+      </w:pPr>
+      <w:r>
+        <w:rPr>
+          <w:rFonts w:asciiTheme="majorHAnsi" w:hAnsiTheme="majorHAnsi" w:cstheme="majorHAnsi"/>
+          <w:b/>
+          <w:bCs/>
+          <w:sz w:val="28"/>
+          <w:szCs w:val="28"/>
+        </w:rPr>
+        <w:t>Common Scheduling Algorithms</w:t>
+      </w:r>
+    </w:p>
+    <w:p>
+      <w:pPr>
+        <w:numPr>
+          <w:ilvl w:val="0"/>
+          <w:numId w:val="13"/>
+        </w:numPr>
+        <w:rPr>
+          <w:rFonts w:asciiTheme="majorHAnsi" w:hAnsiTheme="majorHAnsi" w:cstheme="majorHAnsi"/>
+          <w:sz w:val="28"/>
+          <w:szCs w:val="28"/>
+        </w:rPr>
+      </w:pPr>
+      <w:r>
+        <w:rPr>
+          <w:rFonts w:asciiTheme="majorHAnsi" w:hAnsiTheme="majorHAnsi" w:cstheme="majorHAnsi"/>
+          <w:b/>
+          <w:bCs/>
+          <w:sz w:val="28"/>
+          <w:szCs w:val="28"/>
+        </w:rPr>
+        <w:t>Round-robin:</w:t>
+      </w:r>
+      <w:r>
+        <w:rPr>
+          <w:rFonts w:asciiTheme="majorHAnsi" w:hAnsiTheme="majorHAnsi" w:cstheme="majorHAnsi"/>
+          <w:sz w:val="28"/>
+          <w:szCs w:val="28"/>
+        </w:rPr>
+        <w:t xml:space="preserve"> Processes are executed in a cyclic order with a fixed time slice.</w:t>
+      </w:r>
+    </w:p>
+    <w:p>
+      <w:pPr>
+        <w:numPr>
+          <w:ilvl w:val="0"/>
+          <w:numId w:val="13"/>
+        </w:numPr>
+        <w:rPr>
+          <w:rFonts w:asciiTheme="majorHAnsi" w:hAnsiTheme="majorHAnsi" w:cstheme="majorHAnsi"/>
+          <w:sz w:val="28"/>
+          <w:szCs w:val="28"/>
+        </w:rPr>
+      </w:pPr>
+      <w:r>
+        <w:rPr>
+          <w:rFonts w:asciiTheme="majorHAnsi" w:hAnsiTheme="majorHAnsi" w:cstheme="majorHAnsi"/>
+          <w:b/>
+          <w:bCs/>
+          <w:sz w:val="28"/>
+          <w:szCs w:val="28"/>
+        </w:rPr>
+        <w:t>Priority scheduling:</w:t>
+      </w:r>
+      <w:r>
+        <w:rPr>
+          <w:rFonts w:asciiTheme="majorHAnsi" w:hAnsiTheme="majorHAnsi" w:cstheme="majorHAnsi"/>
+          <w:sz w:val="28"/>
+          <w:szCs w:val="28"/>
+        </w:rPr>
+        <w:t xml:space="preserve"> Processes are executed based on their priority levels.</w:t>
+      </w:r>
+    </w:p>
+    <w:p>
+      <w:pPr>
+        <w:numPr>
+          <w:ilvl w:val="0"/>
+          <w:numId w:val="13"/>
+        </w:numPr>
+        <w:rPr>
+          <w:rFonts w:asciiTheme="majorHAnsi" w:hAnsiTheme="majorHAnsi" w:cstheme="majorHAnsi"/>
+          <w:sz w:val="28"/>
+          <w:szCs w:val="28"/>
+        </w:rPr>
+      </w:pPr>
+      <w:r>
+        <w:rPr>
+          <w:rFonts w:asciiTheme="majorHAnsi" w:hAnsiTheme="majorHAnsi" w:cstheme="majorHAnsi"/>
+          <w:b/>
+          <w:bCs/>
+          <w:sz w:val="28"/>
+          <w:szCs w:val="28"/>
+        </w:rPr>
+        <w:t>Multilevel queue:</w:t>
+      </w:r>
+      <w:r>
+        <w:rPr>
+          <w:rFonts w:asciiTheme="majorHAnsi" w:hAnsiTheme="majorHAnsi" w:cstheme="majorHAnsi"/>
+          <w:sz w:val="28"/>
+          <w:szCs w:val="28"/>
+        </w:rPr>
+        <w:t xml:space="preserve"> The ready queue is divided into multiple queues based on process characteristics.</w:t>
+      </w:r>
+    </w:p>
+    <w:p>
+      <w:pPr>
+        <w:rPr>
+          <w:rFonts w:asciiTheme="majorHAnsi" w:hAnsiTheme="majorHAnsi" w:cstheme="majorHAnsi"/>
+          <w:b/>
+          <w:bCs/>
+          <w:sz w:val="28"/>
+          <w:szCs w:val="28"/>
+        </w:rPr>
+      </w:pPr>
+      <w:r>
+        <w:rPr>
+          <w:rFonts w:asciiTheme="majorHAnsi" w:hAnsiTheme="majorHAnsi" w:cstheme="majorHAnsi"/>
+          <w:b/>
+          <w:bCs/>
+          <w:sz w:val="28"/>
+          <w:szCs w:val="28"/>
+        </w:rPr>
+        <w:t>Scheduling in Multicore Systems</w:t>
+      </w:r>
+    </w:p>
+    <w:p>
+      <w:pPr>
+        <w:rPr>
+          <w:rFonts w:asciiTheme="majorHAnsi" w:hAnsiTheme="majorHAnsi" w:cstheme="majorHAnsi"/>
+          <w:sz w:val="28"/>
+          <w:szCs w:val="28"/>
+        </w:rPr>
+      </w:pPr>
+      <w:r>
+        <w:rPr>
+          <w:rFonts w:asciiTheme="majorHAnsi" w:hAnsiTheme="majorHAnsi" w:cstheme="majorHAnsi"/>
+          <w:sz w:val="28"/>
+          <w:szCs w:val="28"/>
+        </w:rPr>
+        <w:t xml:space="preserve">In multicore systems, </w:t>
+      </w:r>
+      <w:r>
+        <w:rPr>
+          <w:rFonts w:asciiTheme="majorHAnsi" w:hAnsiTheme="majorHAnsi" w:cstheme="majorHAnsi"/>
+          <w:b/>
+          <w:bCs/>
+          <w:sz w:val="28"/>
+          <w:szCs w:val="28"/>
+        </w:rPr>
+        <w:t>load balancing</w:t>
+      </w:r>
+      <w:r>
+        <w:rPr>
+          <w:rFonts w:asciiTheme="majorHAnsi" w:hAnsiTheme="majorHAnsi" w:cstheme="majorHAnsi"/>
+          <w:sz w:val="28"/>
+          <w:szCs w:val="28"/>
+        </w:rPr>
+        <w:t xml:space="preserve"> is essential to distribute workloads evenly across CPU cores. Two main mechanisms are used:</w:t>
+      </w:r>
+    </w:p>
+    <w:p>
+      <w:pPr>
+        <w:numPr>
+          <w:ilvl w:val="0"/>
+          <w:numId w:val="14"/>
+        </w:numPr>
+        <w:rPr>
+          <w:rFonts w:asciiTheme="majorHAnsi" w:hAnsiTheme="majorHAnsi" w:cstheme="majorHAnsi"/>
+          <w:sz w:val="28"/>
+          <w:szCs w:val="28"/>
+        </w:rPr>
+      </w:pPr>
+      <w:r>
+        <w:rPr>
+          <w:rFonts w:asciiTheme="majorHAnsi" w:hAnsiTheme="majorHAnsi" w:cstheme="majorHAnsi"/>
+          <w:b/>
+          <w:bCs/>
+          <w:sz w:val="28"/>
+          <w:szCs w:val="28"/>
+        </w:rPr>
+        <w:t>Push migration:</w:t>
+      </w:r>
+      <w:r>
+        <w:rPr>
+          <w:rFonts w:asciiTheme="majorHAnsi" w:hAnsiTheme="majorHAnsi" w:cstheme="majorHAnsi"/>
+          <w:sz w:val="28"/>
+          <w:szCs w:val="28"/>
+        </w:rPr>
+        <w:t xml:space="preserve"> A specific process periodically checks the workload across cores and moves processes from overloaded cores to idle ones.</w:t>
+      </w:r>
+    </w:p>
+    <w:p>
+      <w:pPr>
+        <w:numPr>
+          <w:ilvl w:val="0"/>
+          <w:numId w:val="14"/>
+        </w:numPr>
+        <w:rPr>
+          <w:rFonts w:asciiTheme="majorHAnsi" w:hAnsiTheme="majorHAnsi" w:cstheme="majorHAnsi"/>
+          <w:sz w:val="28"/>
+          <w:szCs w:val="28"/>
+        </w:rPr>
+      </w:pPr>
+      <w:r>
+        <w:rPr>
+          <w:rFonts w:asciiTheme="majorHAnsi" w:hAnsiTheme="majorHAnsi" w:cstheme="majorHAnsi"/>
+          <w:b/>
+          <w:bCs/>
+          <w:sz w:val="28"/>
+          <w:szCs w:val="28"/>
+        </w:rPr>
+        <w:t>Pull migration:</w:t>
+      </w:r>
+      <w:r>
+        <w:rPr>
+          <w:rFonts w:asciiTheme="majorHAnsi" w:hAnsiTheme="majorHAnsi" w:cstheme="majorHAnsi"/>
+          <w:sz w:val="28"/>
+          <w:szCs w:val="28"/>
+        </w:rPr>
+        <w:t xml:space="preserve"> An idle core pulls a waiting process from the queue of a busy core.</w:t>
+      </w:r>
+    </w:p>
+    <w:p>
+      <w:pPr>
+        <w:rPr>
+          <w:rFonts w:asciiTheme="majorHAnsi" w:hAnsiTheme="majorHAnsi" w:cstheme="majorHAnsi"/>
+          <w:b/>
+          <w:bCs/>
+          <w:i/>
+          <w:iCs/>
+          <w:color w:val="00B0F0"/>
+          <w:sz w:val="28"/>
+          <w:szCs w:val="28"/>
+        </w:rPr>
+      </w:pPr>
+      <w:r>
+        <w:rPr>
+          <w:rFonts w:asciiTheme="majorHAnsi" w:hAnsiTheme="majorHAnsi" w:cstheme="majorHAnsi"/>
+          <w:b/>
+          <w:bCs/>
+          <w:i/>
+          <w:iCs/>
+          <w:color w:val="00B0F0"/>
+          <w:sz w:val="28"/>
+          <w:szCs w:val="28"/>
+        </w:rPr>
+        <w:t>10</w:t>
+      </w:r>
+      <w:r>
+        <w:rPr>
+          <w:rFonts w:asciiTheme="majorHAnsi" w:hAnsiTheme="majorHAnsi" w:cstheme="majorHAnsi"/>
+          <w:b/>
+          <w:bCs/>
+          <w:i/>
+          <w:iCs/>
+          <w:color w:val="00B0F0"/>
+          <w:sz w:val="28"/>
+          <w:szCs w:val="28"/>
+        </w:rPr>
+        <w:t>. Process Synchronization</w:t>
+      </w:r>
+    </w:p>
+    <w:p>
+      <w:pPr>
+        <w:rPr>
+          <w:rFonts w:asciiTheme="majorHAnsi" w:hAnsiTheme="majorHAnsi" w:cstheme="majorHAnsi"/>
+          <w:sz w:val="28"/>
+          <w:szCs w:val="28"/>
+        </w:rPr>
+      </w:pPr>
+      <w:r>
+        <w:rPr>
+          <w:rFonts w:asciiTheme="majorHAnsi" w:hAnsiTheme="majorHAnsi" w:cstheme="majorHAnsi"/>
+          <w:sz w:val="28"/>
+          <w:szCs w:val="28"/>
+        </w:rPr>
+        <w:t xml:space="preserve">Concurrent access to shared data can cause </w:t>
+      </w:r>
+      <w:r>
+        <w:rPr>
+          <w:rFonts w:asciiTheme="majorHAnsi" w:hAnsiTheme="majorHAnsi" w:cstheme="majorHAnsi"/>
+          <w:b/>
+          <w:bCs/>
+          <w:sz w:val="28"/>
+          <w:szCs w:val="28"/>
+        </w:rPr>
+        <w:t>race conditions</w:t>
+      </w:r>
+      <w:r>
+        <w:rPr>
+          <w:rFonts w:asciiTheme="majorHAnsi" w:hAnsiTheme="majorHAnsi" w:cstheme="majorHAnsi"/>
+          <w:sz w:val="28"/>
+          <w:szCs w:val="28"/>
+        </w:rPr>
+        <w:t>.</w:t>
+      </w:r>
+    </w:p>
+    <w:p>
+      <w:pPr>
+        <w:rPr>
+          <w:rFonts w:asciiTheme="majorHAnsi" w:hAnsiTheme="majorHAnsi" w:cstheme="majorHAnsi"/>
+          <w:b/>
+          <w:bCs/>
+          <w:sz w:val="28"/>
+          <w:szCs w:val="28"/>
+        </w:rPr>
+      </w:pPr>
+      <w:r>
+        <w:rPr>
+          <w:rFonts w:asciiTheme="majorHAnsi" w:hAnsiTheme="majorHAnsi" w:cstheme="majorHAnsi"/>
+          <w:b/>
+          <w:bCs/>
+          <w:sz w:val="28"/>
+          <w:szCs w:val="28"/>
+        </w:rPr>
+        <w:t>Critical-Section Problem</w:t>
+      </w:r>
+    </w:p>
+    <w:p>
+      <w:pPr>
+        <w:rPr>
+          <w:rFonts w:asciiTheme="majorHAnsi" w:hAnsiTheme="majorHAnsi" w:cstheme="majorHAnsi"/>
+          <w:sz w:val="28"/>
+          <w:szCs w:val="28"/>
+        </w:rPr>
+      </w:pPr>
+      <w:r>
+        <w:rPr>
+          <w:rFonts w:asciiTheme="majorHAnsi" w:hAnsiTheme="majorHAnsi" w:cstheme="majorHAnsi"/>
+          <w:sz w:val="28"/>
+          <w:szCs w:val="28"/>
+        </w:rPr>
+        <w:t xml:space="preserve">The section of code where a process accesses and modifies shared data is called the </w:t>
+      </w:r>
+      <w:r>
+        <w:rPr>
+          <w:rFonts w:asciiTheme="majorHAnsi" w:hAnsiTheme="majorHAnsi" w:cstheme="majorHAnsi"/>
+          <w:b/>
+          <w:bCs/>
+          <w:sz w:val="28"/>
+          <w:szCs w:val="28"/>
+        </w:rPr>
+        <w:t>critical section</w:t>
+      </w:r>
+      <w:r>
+        <w:rPr>
+          <w:rFonts w:asciiTheme="majorHAnsi" w:hAnsiTheme="majorHAnsi" w:cstheme="majorHAnsi"/>
+          <w:sz w:val="28"/>
+          <w:szCs w:val="28"/>
+        </w:rPr>
+        <w:t>.</w:t>
+      </w:r>
+      <w:r>
+        <w:rPr>
+          <w:rFonts w:asciiTheme="majorHAnsi" w:hAnsiTheme="majorHAnsi" w:cstheme="majorHAnsi"/>
+          <w:sz w:val="28"/>
+          <w:szCs w:val="28"/>
+        </w:rPr>
+        <w:br/>
+        <w:t xml:space="preserve">The operating system must guarantee </w:t>
+      </w:r>
+      <w:r>
+        <w:rPr>
+          <w:rFonts w:asciiTheme="majorHAnsi" w:hAnsiTheme="majorHAnsi" w:cstheme="majorHAnsi"/>
+          <w:b/>
+          <w:bCs/>
+          <w:sz w:val="28"/>
+          <w:szCs w:val="28"/>
+        </w:rPr>
+        <w:t>mutual exclusion</w:t>
+      </w:r>
+      <w:r>
+        <w:rPr>
+          <w:rFonts w:asciiTheme="majorHAnsi" w:hAnsiTheme="majorHAnsi" w:cstheme="majorHAnsi"/>
+          <w:sz w:val="28"/>
+          <w:szCs w:val="28"/>
+        </w:rPr>
+        <w:t>, meaning that only one process can execute in its critical section at any given time.</w:t>
+      </w:r>
+    </w:p>
+    <w:p>
+      <w:pPr>
+        <w:rPr>
+          <w:rFonts w:asciiTheme="majorHAnsi" w:hAnsiTheme="majorHAnsi" w:cstheme="majorHAnsi"/>
+          <w:i/>
+          <w:iCs/>
+          <w:sz w:val="28"/>
+          <w:szCs w:val="28"/>
+          <w:u w:val="single"/>
+        </w:rPr>
+      </w:pPr>
+      <w:r>
+        <w:rPr>
+          <w:rFonts w:asciiTheme="majorHAnsi" w:hAnsiTheme="majorHAnsi" w:cstheme="majorHAnsi"/>
+          <w:i/>
+          <w:iCs/>
+          <w:sz w:val="28"/>
+          <w:szCs w:val="28"/>
+          <w:u w:val="single"/>
+        </w:rPr>
+        <w:t>Synchronization Tools</w:t>
+      </w:r>
+    </w:p>
+    <w:tbl>
+      <w:tblPr>
+        <w:tblStyle w:val="TableGrid"/>
+        <w:tblW w:w="0" w:type="auto"/>
+        <w:tblLook w:val="04A0" w:firstRow="1" w:lastRow="0" w:firstColumn="1" w:lastColumn="0" w:noHBand="0" w:noVBand="1"/>
+      </w:tblPr>
+      <w:tblGrid>
+        <w:gridCol w:w="1717"/>
+        <w:gridCol w:w="7299"/>
+      </w:tblGrid>
+      <w:tr>
+        <w:tc>
+          <w:tcPr>
+            <w:tcW w:w="0" w:type="auto"/>
+            <w:hideMark/>
+          </w:tcPr>
+          <w:p>
+            <w:pPr>
+              <w:spacing w:line="60" w:lineRule="atLeast"/>
+              <w:rPr>
+                <w:rFonts w:asciiTheme="majorHAnsi" w:hAnsiTheme="majorHAnsi" w:cstheme="majorHAnsi"/>
+                <w:b/>
+                <w:bCs/>
+                <w:sz w:val="28"/>
+                <w:szCs w:val="28"/>
+              </w:rPr>
+            </w:pPr>
+            <w:r>
+              <w:rPr>
+                <w:rFonts w:asciiTheme="majorHAnsi" w:hAnsiTheme="majorHAnsi" w:cstheme="majorHAnsi"/>
+                <w:b/>
+                <w:bCs/>
+                <w:sz w:val="28"/>
+                <w:szCs w:val="28"/>
+              </w:rPr>
+              <w:t>Tool</w:t>
+            </w:r>
+          </w:p>
+        </w:tc>
+        <w:tc>
+          <w:tcPr>
+            <w:tcW w:w="0" w:type="auto"/>
+            <w:hideMark/>
+          </w:tcPr>
+          <w:p>
+            <w:pPr>
+              <w:spacing w:line="60" w:lineRule="atLeast"/>
+              <w:rPr>
+                <w:rFonts w:asciiTheme="majorHAnsi" w:hAnsiTheme="majorHAnsi" w:cstheme="majorHAnsi"/>
+                <w:b/>
+                <w:bCs/>
+                <w:sz w:val="28"/>
+                <w:szCs w:val="28"/>
+              </w:rPr>
+            </w:pPr>
+            <w:r>
+              <w:rPr>
+                <w:rFonts w:asciiTheme="majorHAnsi" w:hAnsiTheme="majorHAnsi" w:cstheme="majorHAnsi"/>
+                <w:b/>
+                <w:bCs/>
+                <w:sz w:val="28"/>
+                <w:szCs w:val="28"/>
+              </w:rPr>
+              <w:t>Description</w:t>
+            </w:r>
+          </w:p>
+        </w:tc>
+      </w:tr>
+      <w:tr>
+        <w:tc>
+          <w:tcPr>
+            <w:tcW w:w="0" w:type="auto"/>
+            <w:hideMark/>
+          </w:tcPr>
+          <w:p>
+            <w:pPr>
+              <w:spacing w:line="60" w:lineRule="atLeast"/>
+              <w:rPr>
+                <w:rFonts w:asciiTheme="majorHAnsi" w:hAnsiTheme="majorHAnsi" w:cstheme="majorHAnsi"/>
+                <w:sz w:val="28"/>
+                <w:szCs w:val="28"/>
+              </w:rPr>
+            </w:pPr>
+            <w:r>
+              <w:rPr>
+                <w:rFonts w:asciiTheme="majorHAnsi" w:hAnsiTheme="majorHAnsi" w:cstheme="majorHAnsi"/>
+                <w:b/>
+                <w:bCs/>
+                <w:sz w:val="28"/>
+                <w:szCs w:val="28"/>
+              </w:rPr>
+              <w:t>Mutex Locks</w:t>
+            </w:r>
+          </w:p>
+        </w:tc>
+        <w:tc>
+          <w:tcPr>
+            <w:tcW w:w="0" w:type="auto"/>
+            <w:hideMark/>
+          </w:tcPr>
+          <w:p>
+            <w:pPr>
+              <w:spacing w:line="60" w:lineRule="atLeast"/>
+              <w:rPr>
+                <w:rFonts w:asciiTheme="majorHAnsi" w:hAnsiTheme="majorHAnsi" w:cstheme="majorHAnsi"/>
+                <w:sz w:val="28"/>
+                <w:szCs w:val="28"/>
+              </w:rPr>
+            </w:pPr>
+            <w:r>
+              <w:rPr>
+                <w:rFonts w:asciiTheme="majorHAnsi" w:hAnsiTheme="majorHAnsi" w:cstheme="majorHAnsi"/>
+                <w:sz w:val="28"/>
+                <w:szCs w:val="28"/>
+              </w:rPr>
+              <w:t>A simple binary lock (available/unavailable) used to protect critical sections.</w:t>
+            </w:r>
+          </w:p>
+        </w:tc>
+      </w:tr>
+      <w:tr>
+        <w:tc>
+          <w:tcPr>
+            <w:tcW w:w="0" w:type="auto"/>
+            <w:hideMark/>
+          </w:tcPr>
+          <w:p>
+            <w:pPr>
+              <w:spacing w:line="60" w:lineRule="atLeast"/>
+              <w:rPr>
+                <w:rFonts w:asciiTheme="majorHAnsi" w:hAnsiTheme="majorHAnsi" w:cstheme="majorHAnsi"/>
+                <w:sz w:val="28"/>
+                <w:szCs w:val="28"/>
+              </w:rPr>
+            </w:pPr>
+            <w:r>
+              <w:rPr>
+                <w:rFonts w:asciiTheme="majorHAnsi" w:hAnsiTheme="majorHAnsi" w:cstheme="majorHAnsi"/>
+                <w:b/>
+                <w:bCs/>
+                <w:sz w:val="28"/>
+                <w:szCs w:val="28"/>
+              </w:rPr>
+              <w:t>Semaphores</w:t>
+            </w:r>
+          </w:p>
+        </w:tc>
+        <w:tc>
+          <w:tcPr>
+            <w:tcW w:w="0" w:type="auto"/>
+            <w:hideMark/>
+          </w:tcPr>
+          <w:p>
+            <w:pPr>
+              <w:spacing w:line="60" w:lineRule="atLeast"/>
+              <w:rPr>
+                <w:rFonts w:asciiTheme="majorHAnsi" w:hAnsiTheme="majorHAnsi" w:cstheme="majorHAnsi"/>
+                <w:sz w:val="28"/>
+                <w:szCs w:val="28"/>
+              </w:rPr>
+            </w:pPr>
+            <w:r>
+              <w:rPr>
+                <w:rFonts w:asciiTheme="majorHAnsi" w:hAnsiTheme="majorHAnsi" w:cstheme="majorHAnsi"/>
+                <w:sz w:val="28"/>
+                <w:szCs w:val="28"/>
+              </w:rPr>
+              <w:t>A more powerful synchronization tool using integer variables to control access.</w:t>
+            </w:r>
+          </w:p>
+        </w:tc>
+      </w:tr>
+      <w:tr>
+        <w:tc>
+          <w:tcPr>
+            <w:tcW w:w="0" w:type="auto"/>
+            <w:hideMark/>
+          </w:tcPr>
+          <w:p>
+            <w:pPr>
+              <w:spacing w:line="60" w:lineRule="atLeast"/>
+              <w:rPr>
+                <w:rFonts w:asciiTheme="majorHAnsi" w:hAnsiTheme="majorHAnsi" w:cstheme="majorHAnsi"/>
+                <w:sz w:val="28"/>
+                <w:szCs w:val="28"/>
+              </w:rPr>
+            </w:pPr>
+            <w:r>
+              <w:rPr>
+                <w:rFonts w:asciiTheme="majorHAnsi" w:hAnsiTheme="majorHAnsi" w:cstheme="majorHAnsi"/>
+                <w:b/>
+                <w:bCs/>
+                <w:sz w:val="28"/>
+                <w:szCs w:val="28"/>
+              </w:rPr>
+              <w:lastRenderedPageBreak/>
+              <w:t>Monitors</w:t>
+            </w:r>
+          </w:p>
+        </w:tc>
+        <w:tc>
+          <w:tcPr>
+            <w:tcW w:w="0" w:type="auto"/>
+            <w:hideMark/>
+          </w:tcPr>
+          <w:p>
+            <w:pPr>
+              <w:spacing w:line="60" w:lineRule="atLeast"/>
+              <w:rPr>
+                <w:rFonts w:asciiTheme="majorHAnsi" w:hAnsiTheme="majorHAnsi" w:cstheme="majorHAnsi"/>
+                <w:sz w:val="28"/>
+                <w:szCs w:val="28"/>
+              </w:rPr>
+            </w:pPr>
+            <w:r>
+              <w:rPr>
+                <w:rFonts w:asciiTheme="majorHAnsi" w:hAnsiTheme="majorHAnsi" w:cstheme="majorHAnsi"/>
+                <w:sz w:val="28"/>
+                <w:szCs w:val="28"/>
+              </w:rPr>
+              <w:t>A high-level programming language construct that provides safer and more convenient synchronization than semaphores.</w:t>
+            </w:r>
+          </w:p>
+        </w:tc>
+      </w:tr>
+    </w:tbl>
+    <w:p>
+      <w:pPr>
+        <w:rPr>
+          <w:rFonts w:asciiTheme="majorHAnsi" w:hAnsiTheme="majorHAnsi" w:cstheme="majorHAnsi"/>
+          <w:b/>
+          <w:bCs/>
+          <w:sz w:val="28"/>
+          <w:szCs w:val="28"/>
+        </w:rPr>
+      </w:pPr>
+      <w:r>
+        <w:rPr>
+          <w:rFonts w:asciiTheme="majorHAnsi" w:hAnsiTheme="majorHAnsi" w:cstheme="majorHAnsi"/>
+          <w:b/>
+          <w:bCs/>
+          <w:sz w:val="28"/>
+          <w:szCs w:val="28"/>
+        </w:rPr>
+        <w:t>Liveness Issues</w:t>
+      </w:r>
+    </w:p>
+    <w:p>
+      <w:pPr>
+        <w:rPr>
+          <w:rFonts w:asciiTheme="majorHAnsi" w:hAnsiTheme="majorHAnsi" w:cstheme="majorHAnsi"/>
+          <w:sz w:val="28"/>
+          <w:szCs w:val="28"/>
+        </w:rPr>
+      </w:pPr>
+      <w:r>
+        <w:rPr>
+          <w:rFonts w:asciiTheme="majorHAnsi" w:hAnsiTheme="majorHAnsi" w:cstheme="majorHAnsi"/>
+          <w:sz w:val="28"/>
+          <w:szCs w:val="28"/>
+        </w:rPr>
+        <w:t>Poor synchronization design may lead to liveness problems such as:</w:t>
+      </w:r>
+    </w:p>
+    <w:p>
+      <w:pPr>
+        <w:numPr>
+          <w:ilvl w:val="0"/>
+          <w:numId w:val="15"/>
+        </w:numPr>
+        <w:rPr>
+          <w:rFonts w:asciiTheme="majorHAnsi" w:hAnsiTheme="majorHAnsi" w:cstheme="majorHAnsi"/>
+          <w:sz w:val="28"/>
+          <w:szCs w:val="28"/>
+        </w:rPr>
+      </w:pPr>
+      <w:r>
+        <w:rPr>
+          <w:rFonts w:asciiTheme="majorHAnsi" w:hAnsiTheme="majorHAnsi" w:cstheme="majorHAnsi"/>
+          <w:b/>
+          <w:bCs/>
+          <w:sz w:val="28"/>
+          <w:szCs w:val="28"/>
+        </w:rPr>
+        <w:t>Deadlock:</w:t>
+      </w:r>
+      <w:r>
+        <w:rPr>
+          <w:rFonts w:asciiTheme="majorHAnsi" w:hAnsiTheme="majorHAnsi" w:cstheme="majorHAnsi"/>
+          <w:sz w:val="28"/>
+          <w:szCs w:val="28"/>
+        </w:rPr>
+        <w:t xml:space="preserve"> Processes wait indefinitely for each other.</w:t>
+      </w:r>
+    </w:p>
+    <w:p>
+      <w:pPr>
+        <w:numPr>
+          <w:ilvl w:val="0"/>
+          <w:numId w:val="15"/>
+        </w:numPr>
+        <w:rPr>
+          <w:rFonts w:asciiTheme="majorHAnsi" w:hAnsiTheme="majorHAnsi" w:cstheme="majorHAnsi"/>
+          <w:sz w:val="28"/>
+          <w:szCs w:val="28"/>
+        </w:rPr>
+      </w:pPr>
+      <w:r>
+        <w:rPr>
+          <w:rFonts w:asciiTheme="majorHAnsi" w:hAnsiTheme="majorHAnsi" w:cstheme="majorHAnsi"/>
+          <w:b/>
+          <w:bCs/>
+          <w:sz w:val="28"/>
+          <w:szCs w:val="28"/>
+        </w:rPr>
+        <w:t>Livelock:</w:t>
+      </w:r>
+      <w:r>
+        <w:rPr>
+          <w:rFonts w:asciiTheme="majorHAnsi" w:hAnsiTheme="majorHAnsi" w:cstheme="majorHAnsi"/>
+          <w:sz w:val="28"/>
+          <w:szCs w:val="28"/>
+        </w:rPr>
+        <w:t xml:space="preserve"> Processes continuously change states in response to one another but make no real progress.</w:t>
+      </w:r>
+    </w:p>
+    <w:p>
+      <w:pPr>
+        <w:rPr>
+          <w:rFonts w:asciiTheme="majorHAnsi" w:hAnsiTheme="majorHAnsi" w:cstheme="majorHAnsi"/>
+          <w:b/>
+          <w:bCs/>
+          <w:i/>
+          <w:iCs/>
+          <w:color w:val="00B0F0"/>
+          <w:sz w:val="28"/>
+          <w:szCs w:val="28"/>
+        </w:rPr>
+      </w:pPr>
+      <w:r>
+        <w:rPr>
+          <w:rFonts w:asciiTheme="majorHAnsi" w:hAnsiTheme="majorHAnsi" w:cstheme="majorHAnsi"/>
+          <w:b/>
+          <w:bCs/>
+          <w:i/>
+          <w:iCs/>
+          <w:color w:val="00B0F0"/>
+          <w:sz w:val="28"/>
+          <w:szCs w:val="28"/>
+        </w:rPr>
+        <w:t>11</w:t>
+      </w:r>
+      <w:r>
+        <w:rPr>
+          <w:rFonts w:asciiTheme="majorHAnsi" w:hAnsiTheme="majorHAnsi" w:cstheme="majorHAnsi"/>
+          <w:b/>
+          <w:bCs/>
+          <w:i/>
+          <w:iCs/>
+          <w:color w:val="00B0F0"/>
+          <w:sz w:val="28"/>
+          <w:szCs w:val="28"/>
+        </w:rPr>
+        <w:t>. Deadlocks</w:t>
+      </w:r>
+    </w:p>
+    <w:p>
+      <w:pPr>
+        <w:rPr>
+          <w:rFonts w:asciiTheme="majorHAnsi" w:hAnsiTheme="majorHAnsi" w:cstheme="majorHAnsi"/>
+          <w:i/>
+          <w:iCs/>
+          <w:sz w:val="28"/>
+          <w:szCs w:val="28"/>
+          <w:u w:val="single"/>
+        </w:rPr>
+      </w:pPr>
+      <w:r>
+        <w:rPr>
+          <w:rFonts w:asciiTheme="majorHAnsi" w:hAnsiTheme="majorHAnsi" w:cstheme="majorHAnsi"/>
+          <w:i/>
+          <w:iCs/>
+          <w:sz w:val="28"/>
+          <w:szCs w:val="28"/>
+          <w:u w:val="single"/>
+        </w:rPr>
+        <w:t>Four Necessary Conditions for Deadlock</w:t>
+      </w:r>
+    </w:p>
+    <w:p>
+      <w:pPr>
+        <w:numPr>
+          <w:ilvl w:val="0"/>
+          <w:numId w:val="16"/>
+        </w:numPr>
+        <w:rPr>
+          <w:rFonts w:asciiTheme="majorHAnsi" w:hAnsiTheme="majorHAnsi" w:cstheme="majorHAnsi"/>
+          <w:sz w:val="28"/>
+          <w:szCs w:val="28"/>
+        </w:rPr>
+      </w:pPr>
+      <w:r>
+        <w:rPr>
+          <w:rFonts w:asciiTheme="majorHAnsi" w:hAnsiTheme="majorHAnsi" w:cstheme="majorHAnsi"/>
+          <w:b/>
+          <w:bCs/>
+          <w:sz w:val="28"/>
+          <w:szCs w:val="28"/>
+        </w:rPr>
+        <w:t>Mutual exclusion:</w:t>
+      </w:r>
+      <w:r>
+        <w:rPr>
+          <w:rFonts w:asciiTheme="majorHAnsi" w:hAnsiTheme="majorHAnsi" w:cstheme="majorHAnsi"/>
+          <w:sz w:val="28"/>
+          <w:szCs w:val="28"/>
+        </w:rPr>
+        <w:t xml:space="preserve"> Resources cannot be shared.</w:t>
+      </w:r>
+    </w:p>
+    <w:p>
+      <w:pPr>
+        <w:numPr>
+          <w:ilvl w:val="0"/>
+          <w:numId w:val="16"/>
+        </w:numPr>
+        <w:rPr>
+          <w:rFonts w:asciiTheme="majorHAnsi" w:hAnsiTheme="majorHAnsi" w:cstheme="majorHAnsi"/>
+          <w:sz w:val="28"/>
+          <w:szCs w:val="28"/>
+        </w:rPr>
+      </w:pPr>
+      <w:r>
+        <w:rPr>
+          <w:rFonts w:asciiTheme="majorHAnsi" w:hAnsiTheme="majorHAnsi" w:cstheme="majorHAnsi"/>
+          <w:b/>
+          <w:bCs/>
+          <w:sz w:val="28"/>
+          <w:szCs w:val="28"/>
+        </w:rPr>
+        <w:t>Hold and wait:</w:t>
+      </w:r>
+      <w:r>
+        <w:rPr>
+          <w:rFonts w:asciiTheme="majorHAnsi" w:hAnsiTheme="majorHAnsi" w:cstheme="majorHAnsi"/>
+          <w:sz w:val="28"/>
+          <w:szCs w:val="28"/>
+        </w:rPr>
+        <w:t xml:space="preserve"> A process holds resources while waiting for additional ones.</w:t>
+      </w:r>
+    </w:p>
+    <w:p>
+      <w:pPr>
+        <w:numPr>
+          <w:ilvl w:val="0"/>
+          <w:numId w:val="16"/>
+        </w:numPr>
+        <w:rPr>
+          <w:rFonts w:asciiTheme="majorHAnsi" w:hAnsiTheme="majorHAnsi" w:cstheme="majorHAnsi"/>
+          <w:sz w:val="28"/>
+          <w:szCs w:val="28"/>
+        </w:rPr>
+      </w:pPr>
+      <w:r>
+        <w:rPr>
+          <w:rFonts w:asciiTheme="majorHAnsi" w:hAnsiTheme="majorHAnsi" w:cstheme="majorHAnsi"/>
+          <w:b/>
+          <w:bCs/>
+          <w:sz w:val="28"/>
+          <w:szCs w:val="28"/>
+        </w:rPr>
+        <w:t>No preemption:</w:t>
+      </w:r>
+      <w:r>
+        <w:rPr>
+          <w:rFonts w:asciiTheme="majorHAnsi" w:hAnsiTheme="majorHAnsi" w:cstheme="majorHAnsi"/>
+          <w:sz w:val="28"/>
+          <w:szCs w:val="28"/>
+        </w:rPr>
+        <w:t xml:space="preserve"> Resources cannot be forcibly taken away; they must be released voluntarily.</w:t>
+      </w:r>
+    </w:p>
+    <w:p>
+      <w:pPr>
+        <w:numPr>
+          <w:ilvl w:val="0"/>
+          <w:numId w:val="16"/>
+        </w:numPr>
+        <w:rPr>
+          <w:rFonts w:asciiTheme="majorHAnsi" w:hAnsiTheme="majorHAnsi" w:cstheme="majorHAnsi"/>
+          <w:sz w:val="28"/>
+          <w:szCs w:val="28"/>
+        </w:rPr>
+      </w:pPr>
+      <w:r>
+        <w:rPr>
+          <w:rFonts w:asciiTheme="majorHAnsi" w:hAnsiTheme="majorHAnsi" w:cstheme="majorHAnsi"/>
+          <w:b/>
+          <w:bCs/>
+          <w:sz w:val="28"/>
+          <w:szCs w:val="28"/>
+        </w:rPr>
+        <w:t>Circular wait:</w:t>
+      </w:r>
+      <w:r>
+        <w:rPr>
+          <w:rFonts w:asciiTheme="majorHAnsi" w:hAnsiTheme="majorHAnsi" w:cstheme="majorHAnsi"/>
+          <w:sz w:val="28"/>
+          <w:szCs w:val="28"/>
+        </w:rPr>
+        <w:t xml:space="preserve"> A circular chain of processes exists where each process waits for a resource held by the next.</w:t>
+      </w:r>
+    </w:p>
+    <w:p>
+      <w:pPr>
+        <w:rPr>
+          <w:rFonts w:asciiTheme="majorHAnsi" w:hAnsiTheme="majorHAnsi" w:cstheme="majorHAnsi"/>
+          <w:i/>
+          <w:iCs/>
+          <w:sz w:val="28"/>
+          <w:szCs w:val="28"/>
+          <w:u w:val="single"/>
+        </w:rPr>
+      </w:pPr>
+      <w:r>
+        <w:rPr>
+          <w:rFonts w:asciiTheme="majorHAnsi" w:hAnsiTheme="majorHAnsi" w:cstheme="majorHAnsi"/>
+          <w:i/>
+          <w:iCs/>
+          <w:sz w:val="28"/>
+          <w:szCs w:val="28"/>
+          <w:u w:val="single"/>
+        </w:rPr>
+        <w:t>Methods for Handling Deadlocks</w:t>
+      </w:r>
+    </w:p>
+    <w:p>
+      <w:pPr>
+        <w:numPr>
+          <w:ilvl w:val="0"/>
+          <w:numId w:val="17"/>
+        </w:numPr>
+        <w:rPr>
+          <w:rFonts w:asciiTheme="majorHAnsi" w:hAnsiTheme="majorHAnsi" w:cstheme="majorHAnsi"/>
+          <w:sz w:val="28"/>
+          <w:szCs w:val="28"/>
+        </w:rPr>
+      </w:pPr>
+      <w:r>
+        <w:rPr>
+          <w:rFonts w:asciiTheme="majorHAnsi" w:hAnsiTheme="majorHAnsi" w:cstheme="majorHAnsi"/>
+          <w:b/>
+          <w:bCs/>
+          <w:sz w:val="28"/>
+          <w:szCs w:val="28"/>
+        </w:rPr>
+        <w:t>Prevention and Avoidance:</w:t>
+      </w:r>
+      <w:r>
+        <w:rPr>
+          <w:rFonts w:asciiTheme="majorHAnsi" w:hAnsiTheme="majorHAnsi" w:cstheme="majorHAnsi"/>
+          <w:sz w:val="28"/>
+          <w:szCs w:val="28"/>
+        </w:rPr>
+        <w:t xml:space="preserve"> Break one of the four necessary conditions or use the </w:t>
+      </w:r>
+      <w:r>
+        <w:rPr>
+          <w:rFonts w:asciiTheme="majorHAnsi" w:hAnsiTheme="majorHAnsi" w:cstheme="majorHAnsi"/>
+          <w:b/>
+          <w:bCs/>
+          <w:sz w:val="28"/>
+          <w:szCs w:val="28"/>
+        </w:rPr>
+        <w:t>Banker’s Algorithm</w:t>
+      </w:r>
+      <w:r>
+        <w:rPr>
+          <w:rFonts w:asciiTheme="majorHAnsi" w:hAnsiTheme="majorHAnsi" w:cstheme="majorHAnsi"/>
+          <w:sz w:val="28"/>
+          <w:szCs w:val="28"/>
+        </w:rPr>
+        <w:t xml:space="preserve"> to ensure the system remains in a safe state.</w:t>
+      </w:r>
+    </w:p>
+    <w:p>
+      <w:pPr>
+        <w:numPr>
+          <w:ilvl w:val="0"/>
+          <w:numId w:val="17"/>
+        </w:numPr>
+        <w:rPr>
+          <w:rFonts w:asciiTheme="majorHAnsi" w:hAnsiTheme="majorHAnsi" w:cstheme="majorHAnsi"/>
+          <w:sz w:val="28"/>
+          <w:szCs w:val="28"/>
+        </w:rPr>
+      </w:pPr>
+      <w:r>
+        <w:rPr>
+          <w:rFonts w:asciiTheme="majorHAnsi" w:hAnsiTheme="majorHAnsi" w:cstheme="majorHAnsi"/>
+          <w:b/>
+          <w:bCs/>
+          <w:sz w:val="28"/>
+          <w:szCs w:val="28"/>
+        </w:rPr>
+        <w:t>Detection:</w:t>
+      </w:r>
+      <w:r>
+        <w:rPr>
+          <w:rFonts w:asciiTheme="majorHAnsi" w:hAnsiTheme="majorHAnsi" w:cstheme="majorHAnsi"/>
+          <w:sz w:val="28"/>
+          <w:szCs w:val="28"/>
+        </w:rPr>
+        <w:t xml:space="preserve"> Use algorithms to detect cycles in resource allocation graphs. In the Linux kernel, tools such as </w:t>
+      </w:r>
+      <w:r>
+        <w:rPr>
+          <w:rFonts w:asciiTheme="majorHAnsi" w:hAnsiTheme="majorHAnsi" w:cstheme="majorHAnsi"/>
+          <w:b/>
+          <w:bCs/>
+          <w:sz w:val="28"/>
+          <w:szCs w:val="28"/>
+        </w:rPr>
+        <w:t>lockdep</w:t>
+      </w:r>
+      <w:r>
+        <w:rPr>
+          <w:rFonts w:asciiTheme="majorHAnsi" w:hAnsiTheme="majorHAnsi" w:cstheme="majorHAnsi"/>
+          <w:sz w:val="28"/>
+          <w:szCs w:val="28"/>
+        </w:rPr>
+        <w:t xml:space="preserve"> and </w:t>
+      </w:r>
+      <w:r>
+        <w:rPr>
+          <w:rFonts w:asciiTheme="majorHAnsi" w:hAnsiTheme="majorHAnsi" w:cstheme="majorHAnsi"/>
+          <w:b/>
+          <w:bCs/>
+          <w:sz w:val="28"/>
+          <w:szCs w:val="28"/>
+        </w:rPr>
+        <w:t>deadlock_detector</w:t>
+      </w:r>
+      <w:r>
+        <w:rPr>
+          <w:rFonts w:asciiTheme="majorHAnsi" w:hAnsiTheme="majorHAnsi" w:cstheme="majorHAnsi"/>
+          <w:sz w:val="28"/>
+          <w:szCs w:val="28"/>
+        </w:rPr>
+        <w:t xml:space="preserve"> are used to detect these risks.</w:t>
+      </w:r>
+    </w:p>
+    <w:p>
+      <w:pPr>
+        <w:numPr>
+          <w:ilvl w:val="0"/>
+          <w:numId w:val="17"/>
+        </w:numPr>
+        <w:rPr>
+          <w:rFonts w:asciiTheme="majorHAnsi" w:hAnsiTheme="majorHAnsi" w:cstheme="majorHAnsi"/>
+          <w:sz w:val="28"/>
+          <w:szCs w:val="28"/>
+        </w:rPr>
+      </w:pPr>
+      <w:r>
+        <w:rPr>
+          <w:rFonts w:asciiTheme="majorHAnsi" w:hAnsiTheme="majorHAnsi" w:cstheme="majorHAnsi"/>
+          <w:b/>
+          <w:bCs/>
+          <w:sz w:val="28"/>
+          <w:szCs w:val="28"/>
+        </w:rPr>
+        <w:t>Recovery:</w:t>
+      </w:r>
+      <w:r>
+        <w:rPr>
+          <w:rFonts w:asciiTheme="majorHAnsi" w:hAnsiTheme="majorHAnsi" w:cstheme="majorHAnsi"/>
+          <w:sz w:val="28"/>
+          <w:szCs w:val="28"/>
+        </w:rPr>
+        <w:t xml:space="preserve"> Terminate processes or reclaim resources (preemption).</w:t>
+      </w:r>
+    </w:p>
+    <w:p>
+      <w:pPr>
+        <w:rPr>
+          <w:rFonts w:asciiTheme="majorHAnsi" w:hAnsiTheme="majorHAnsi" w:cstheme="majorHAnsi"/>
+          <w:b/>
+          <w:bCs/>
+          <w:i/>
+          <w:iCs/>
+          <w:color w:val="00B0F0"/>
+          <w:sz w:val="28"/>
+          <w:szCs w:val="28"/>
+        </w:rPr>
+      </w:pPr>
+      <w:r>
+        <w:rPr>
+          <w:rFonts w:asciiTheme="majorHAnsi" w:hAnsiTheme="majorHAnsi" w:cstheme="majorHAnsi"/>
+          <w:b/>
+          <w:bCs/>
+          <w:i/>
+          <w:iCs/>
+          <w:color w:val="00B0F0"/>
+          <w:sz w:val="28"/>
+          <w:szCs w:val="28"/>
+        </w:rPr>
+        <w:t>12</w:t>
+      </w:r>
+      <w:r>
+        <w:rPr>
+          <w:rFonts w:asciiTheme="majorHAnsi" w:hAnsiTheme="majorHAnsi" w:cstheme="majorHAnsi"/>
+          <w:b/>
+          <w:bCs/>
+          <w:i/>
+          <w:iCs/>
+          <w:color w:val="00B0F0"/>
+          <w:sz w:val="28"/>
+          <w:szCs w:val="28"/>
+        </w:rPr>
+        <w:t>. Memory Management</w:t>
+      </w:r>
+    </w:p>
+    <w:p>
+      <w:pPr>
+        <w:rPr>
+          <w:rFonts w:asciiTheme="majorHAnsi" w:hAnsiTheme="majorHAnsi" w:cstheme="majorHAnsi"/>
+          <w:i/>
+          <w:iCs/>
+          <w:sz w:val="28"/>
+          <w:szCs w:val="28"/>
+          <w:u w:val="single"/>
+        </w:rPr>
+      </w:pPr>
+      <w:r>
+        <w:rPr>
+          <w:rFonts w:asciiTheme="majorHAnsi" w:hAnsiTheme="majorHAnsi" w:cstheme="majorHAnsi"/>
+          <w:i/>
+          <w:iCs/>
+          <w:sz w:val="28"/>
+          <w:szCs w:val="28"/>
+          <w:u w:val="single"/>
+        </w:rPr>
+        <w:t>Paging</w:t>
+      </w:r>
+    </w:p>
+    <w:p>
+      <w:pPr>
+        <w:rPr>
+          <w:rFonts w:asciiTheme="majorHAnsi" w:hAnsiTheme="majorHAnsi" w:cstheme="majorHAnsi"/>
+          <w:sz w:val="28"/>
+          <w:szCs w:val="28"/>
+        </w:rPr>
+      </w:pPr>
+      <w:r>
+        <w:rPr>
+          <w:rFonts w:asciiTheme="majorHAnsi" w:hAnsiTheme="majorHAnsi" w:cstheme="majorHAnsi"/>
+          <w:sz w:val="28"/>
+          <w:szCs w:val="28"/>
+        </w:rPr>
+        <w:t xml:space="preserve">Paging is a non-contiguous memory management technique. Logical address space is divided into </w:t>
+      </w:r>
+      <w:r>
+        <w:rPr>
+          <w:rFonts w:asciiTheme="majorHAnsi" w:hAnsiTheme="majorHAnsi" w:cstheme="majorHAnsi"/>
+          <w:b/>
+          <w:bCs/>
+          <w:sz w:val="28"/>
+          <w:szCs w:val="28"/>
+        </w:rPr>
+        <w:t>pages</w:t>
+      </w:r>
+      <w:r>
+        <w:rPr>
+          <w:rFonts w:asciiTheme="majorHAnsi" w:hAnsiTheme="majorHAnsi" w:cstheme="majorHAnsi"/>
+          <w:sz w:val="28"/>
+          <w:szCs w:val="28"/>
+        </w:rPr>
+        <w:t xml:space="preserve">, while physical memory is divided into </w:t>
+      </w:r>
+      <w:r>
+        <w:rPr>
+          <w:rFonts w:asciiTheme="majorHAnsi" w:hAnsiTheme="majorHAnsi" w:cstheme="majorHAnsi"/>
+          <w:b/>
+          <w:bCs/>
+          <w:sz w:val="28"/>
+          <w:szCs w:val="28"/>
+        </w:rPr>
+        <w:t>frames</w:t>
+      </w:r>
+      <w:r>
+        <w:rPr>
+          <w:rFonts w:asciiTheme="majorHAnsi" w:hAnsiTheme="majorHAnsi" w:cstheme="majorHAnsi"/>
+          <w:sz w:val="28"/>
+          <w:szCs w:val="28"/>
+        </w:rPr>
+        <w:t xml:space="preserve">. The mapping between them is maintained using a </w:t>
+      </w:r>
+      <w:r>
+        <w:rPr>
+          <w:rFonts w:asciiTheme="majorHAnsi" w:hAnsiTheme="majorHAnsi" w:cstheme="majorHAnsi"/>
+          <w:b/>
+          <w:bCs/>
+          <w:sz w:val="28"/>
+          <w:szCs w:val="28"/>
+        </w:rPr>
+        <w:t>Page Table</w:t>
+      </w:r>
+      <w:r>
+        <w:rPr>
+          <w:rFonts w:asciiTheme="majorHAnsi" w:hAnsiTheme="majorHAnsi" w:cstheme="majorHAnsi"/>
+          <w:sz w:val="28"/>
+          <w:szCs w:val="28"/>
+        </w:rPr>
+        <w:t>.</w:t>
+      </w:r>
+    </w:p>
+    <w:p>
+      <w:pPr>
+        <w:rPr>
+          <w:rFonts w:asciiTheme="majorHAnsi" w:hAnsiTheme="majorHAnsi" w:cstheme="majorHAnsi"/>
+          <w:i/>
+          <w:iCs/>
+          <w:sz w:val="28"/>
+          <w:szCs w:val="28"/>
+          <w:u w:val="single"/>
+        </w:rPr>
+      </w:pPr>
+      <w:r>
+        <w:rPr>
+          <w:rFonts w:asciiTheme="majorHAnsi" w:hAnsiTheme="majorHAnsi" w:cstheme="majorHAnsi"/>
+          <w:i/>
+          <w:iCs/>
+          <w:sz w:val="28"/>
+          <w:szCs w:val="28"/>
+          <w:u w:val="single"/>
+        </w:rPr>
+        <w:t>Virtual Memory</w:t>
+      </w:r>
+    </w:p>
+    <w:p>
+      <w:pPr>
+        <w:rPr>
+          <w:rFonts w:asciiTheme="majorHAnsi" w:hAnsiTheme="majorHAnsi" w:cstheme="majorHAnsi"/>
+          <w:sz w:val="28"/>
+          <w:szCs w:val="28"/>
+        </w:rPr>
+      </w:pPr>
+      <w:r>
+        <w:rPr>
+          <w:rFonts w:asciiTheme="majorHAnsi" w:hAnsiTheme="majorHAnsi" w:cstheme="majorHAnsi"/>
+          <w:sz w:val="28"/>
+          <w:szCs w:val="28"/>
+        </w:rPr>
+        <w:t xml:space="preserve">Virtual memory allows processes larger than the physical memory to execute by using </w:t>
+      </w:r>
+      <w:r>
+        <w:rPr>
+          <w:rFonts w:asciiTheme="majorHAnsi" w:hAnsiTheme="majorHAnsi" w:cstheme="majorHAnsi"/>
+          <w:b/>
+          <w:bCs/>
+          <w:sz w:val="28"/>
+          <w:szCs w:val="28"/>
+        </w:rPr>
+        <w:t>Demand Paging</w:t>
+      </w:r>
+      <w:r>
+        <w:rPr>
+          <w:rFonts w:asciiTheme="majorHAnsi" w:hAnsiTheme="majorHAnsi" w:cstheme="majorHAnsi"/>
+          <w:sz w:val="28"/>
+          <w:szCs w:val="28"/>
+        </w:rPr>
+        <w:t xml:space="preserve">. When a process accesses a page that is not currently in RAM, a </w:t>
+      </w:r>
+      <w:r>
+        <w:rPr>
+          <w:rFonts w:asciiTheme="majorHAnsi" w:hAnsiTheme="majorHAnsi" w:cstheme="majorHAnsi"/>
+          <w:b/>
+          <w:bCs/>
+          <w:sz w:val="28"/>
+          <w:szCs w:val="28"/>
+        </w:rPr>
+        <w:t>page fault</w:t>
+      </w:r>
+      <w:r>
+        <w:rPr>
+          <w:rFonts w:asciiTheme="majorHAnsi" w:hAnsiTheme="majorHAnsi" w:cstheme="majorHAnsi"/>
+          <w:sz w:val="28"/>
+          <w:szCs w:val="28"/>
+        </w:rPr>
+        <w:t xml:space="preserve"> occurs, triggering the page replacement process.</w:t>
+      </w:r>
+    </w:p>
+    <w:p>
+      <w:pPr>
+        <w:rPr>
+          <w:rFonts w:asciiTheme="majorHAnsi" w:hAnsiTheme="majorHAnsi" w:cstheme="majorHAnsi"/>
+          <w:i/>
+          <w:iCs/>
+          <w:sz w:val="28"/>
+          <w:szCs w:val="28"/>
+          <w:u w:val="single"/>
+        </w:rPr>
+      </w:pPr>
+      <w:r>
+        <w:rPr>
+          <w:rFonts w:asciiTheme="majorHAnsi" w:hAnsiTheme="majorHAnsi" w:cstheme="majorHAnsi"/>
+          <w:i/>
+          <w:iCs/>
+          <w:sz w:val="28"/>
+          <w:szCs w:val="28"/>
+          <w:u w:val="single"/>
+        </w:rPr>
+        <w:t>Thrashing</w:t>
+      </w:r>
+    </w:p>
+    <w:p>
+      <w:pPr>
+        <w:rPr>
+          <w:rFonts w:asciiTheme="majorHAnsi" w:hAnsiTheme="majorHAnsi" w:cstheme="majorHAnsi"/>
+          <w:sz w:val="28"/>
+          <w:szCs w:val="28"/>
+        </w:rPr>
+      </w:pPr>
+      <w:r>
+        <w:rPr>
+          <w:rFonts w:asciiTheme="majorHAnsi" w:hAnsiTheme="majorHAnsi" w:cstheme="majorHAnsi"/>
+          <w:sz w:val="28"/>
+          <w:szCs w:val="28"/>
+        </w:rPr>
+        <w:t>Thrashing occurs when the system spends more time swapping pages in and out of memory than executing actual instructions. This happens when a process does not have enough frames to maintain its working set.</w:t>
+      </w:r>
+    </w:p>
+    <w:p>
+      <w:pPr>
+        <w:rPr>
+          <w:rFonts w:asciiTheme="majorHAnsi" w:hAnsiTheme="majorHAnsi" w:cstheme="majorHAnsi"/>
+          <w:b/>
+          <w:bCs/>
+          <w:i/>
+          <w:iCs/>
+          <w:color w:val="00B0F0"/>
+          <w:sz w:val="28"/>
+          <w:szCs w:val="28"/>
+        </w:rPr>
+      </w:pPr>
+      <w:r>
+        <w:rPr>
+          <w:rFonts w:asciiTheme="majorHAnsi" w:hAnsiTheme="majorHAnsi" w:cstheme="majorHAnsi"/>
+          <w:b/>
+          <w:bCs/>
+          <w:i/>
+          <w:iCs/>
+          <w:color w:val="00B0F0"/>
+          <w:sz w:val="28"/>
+          <w:szCs w:val="28"/>
+        </w:rPr>
+        <w:t>13</w:t>
+      </w:r>
+      <w:r>
+        <w:rPr>
+          <w:rFonts w:asciiTheme="majorHAnsi" w:hAnsiTheme="majorHAnsi" w:cstheme="majorHAnsi"/>
+          <w:b/>
+          <w:bCs/>
+          <w:i/>
+          <w:iCs/>
+          <w:color w:val="00B0F0"/>
+          <w:sz w:val="28"/>
+          <w:szCs w:val="28"/>
+        </w:rPr>
+        <w:t>. File Systems and Storage</w:t>
+      </w:r>
+    </w:p>
+    <w:p>
+      <w:pPr>
+        <w:rPr>
+          <w:rFonts w:asciiTheme="majorHAnsi" w:hAnsiTheme="majorHAnsi" w:cstheme="majorHAnsi"/>
+          <w:sz w:val="28"/>
+          <w:szCs w:val="28"/>
+        </w:rPr>
+      </w:pPr>
+      <w:r>
+        <w:rPr>
+          <w:rFonts w:asciiTheme="majorHAnsi" w:hAnsiTheme="majorHAnsi" w:cstheme="majorHAnsi"/>
+          <w:sz w:val="28"/>
+          <w:szCs w:val="28"/>
+        </w:rPr>
+        <w:t xml:space="preserve">A </w:t>
+      </w:r>
+      <w:r>
+        <w:rPr>
+          <w:rFonts w:asciiTheme="majorHAnsi" w:hAnsiTheme="majorHAnsi" w:cstheme="majorHAnsi"/>
+          <w:b/>
+          <w:bCs/>
+          <w:sz w:val="28"/>
+          <w:szCs w:val="28"/>
+        </w:rPr>
+        <w:t>file</w:t>
+      </w:r>
+      <w:r>
+        <w:rPr>
+          <w:rFonts w:asciiTheme="majorHAnsi" w:hAnsiTheme="majorHAnsi" w:cstheme="majorHAnsi"/>
+          <w:sz w:val="28"/>
+          <w:szCs w:val="28"/>
+        </w:rPr>
+        <w:t xml:space="preserve"> is a logical storage unit on a physical device.</w:t>
+      </w:r>
+    </w:p>
+    <w:p>
+      <w:pPr>
+        <w:rPr>
+          <w:rFonts w:asciiTheme="majorHAnsi" w:hAnsiTheme="majorHAnsi" w:cstheme="majorHAnsi"/>
+          <w:i/>
+          <w:iCs/>
+          <w:sz w:val="28"/>
+          <w:szCs w:val="28"/>
+          <w:u w:val="single"/>
+        </w:rPr>
+      </w:pPr>
+      <w:r>
+        <w:rPr>
+          <w:rFonts w:asciiTheme="majorHAnsi" w:hAnsiTheme="majorHAnsi" w:cstheme="majorHAnsi"/>
+          <w:i/>
+          <w:iCs/>
+          <w:sz w:val="28"/>
+          <w:szCs w:val="28"/>
+          <w:u w:val="single"/>
+        </w:rPr>
+        <w:t>Disk Allocation Methods</w:t>
+      </w:r>
+    </w:p>
+    <w:p>
+      <w:pPr>
+        <w:numPr>
+          <w:ilvl w:val="0"/>
+          <w:numId w:val="18"/>
+        </w:numPr>
+        <w:rPr>
+          <w:rFonts w:asciiTheme="majorHAnsi" w:hAnsiTheme="majorHAnsi" w:cstheme="majorHAnsi"/>
+          <w:sz w:val="28"/>
+          <w:szCs w:val="28"/>
+        </w:rPr>
+      </w:pPr>
+      <w:r>
+        <w:rPr>
+          <w:rFonts w:asciiTheme="majorHAnsi" w:hAnsiTheme="majorHAnsi" w:cstheme="majorHAnsi"/>
+          <w:sz w:val="28"/>
+          <w:szCs w:val="28"/>
+        </w:rPr>
+        <w:t>Contiguous allocation</w:t>
+      </w:r>
+    </w:p>
+    <w:p>
+      <w:pPr>
+        <w:numPr>
+          <w:ilvl w:val="0"/>
+          <w:numId w:val="18"/>
+        </w:numPr>
+        <w:rPr>
+          <w:rFonts w:asciiTheme="majorHAnsi" w:hAnsiTheme="majorHAnsi" w:cstheme="majorHAnsi"/>
+          <w:sz w:val="28"/>
+          <w:szCs w:val="28"/>
+        </w:rPr>
+      </w:pPr>
+      <w:r>
+        <w:rPr>
+          <w:rFonts w:asciiTheme="majorHAnsi" w:hAnsiTheme="majorHAnsi" w:cstheme="majorHAnsi"/>
+          <w:sz w:val="28"/>
+          <w:szCs w:val="28"/>
+        </w:rPr>
+        <w:t>Linked allocation</w:t>
+      </w:r>
+    </w:p>
+    <w:p>
+      <w:pPr>
+        <w:numPr>
+          <w:ilvl w:val="0"/>
+          <w:numId w:val="18"/>
+        </w:numPr>
+        <w:rPr>
+          <w:rFonts w:asciiTheme="majorHAnsi" w:hAnsiTheme="majorHAnsi" w:cstheme="majorHAnsi"/>
+          <w:sz w:val="28"/>
+          <w:szCs w:val="28"/>
+        </w:rPr>
+      </w:pPr>
+      <w:r>
+        <w:rPr>
+          <w:rFonts w:asciiTheme="majorHAnsi" w:hAnsiTheme="majorHAnsi" w:cstheme="majorHAnsi"/>
+          <w:sz w:val="28"/>
+          <w:szCs w:val="28"/>
+        </w:rPr>
+        <w:t>Indexed allocation</w:t>
+      </w:r>
+    </w:p>
+    <w:p>
+      <w:pPr>
+        <w:rPr>
+          <w:rFonts w:asciiTheme="majorHAnsi" w:hAnsiTheme="majorHAnsi" w:cstheme="majorHAnsi"/>
+          <w:i/>
+          <w:iCs/>
+          <w:sz w:val="28"/>
+          <w:szCs w:val="28"/>
+          <w:u w:val="single"/>
+        </w:rPr>
+      </w:pPr>
+      <w:r>
+        <w:rPr>
+          <w:rFonts w:asciiTheme="majorHAnsi" w:hAnsiTheme="majorHAnsi" w:cstheme="majorHAnsi"/>
+          <w:i/>
+          <w:iCs/>
+          <w:sz w:val="28"/>
+          <w:szCs w:val="28"/>
+          <w:u w:val="single"/>
+        </w:rPr>
+        <w:lastRenderedPageBreak/>
+        <w:t>Role of the Virtual File System (VFS)</w:t>
+      </w:r>
+    </w:p>
+    <w:p>
+      <w:pPr>
+        <w:rPr>
+          <w:rFonts w:asciiTheme="majorHAnsi" w:hAnsiTheme="majorHAnsi" w:cstheme="majorHAnsi"/>
+          <w:sz w:val="28"/>
+          <w:szCs w:val="28"/>
+        </w:rPr>
+      </w:pPr>
+      <w:r>
+        <w:rPr>
+          <w:rFonts w:asciiTheme="majorHAnsi" w:hAnsiTheme="majorHAnsi" w:cstheme="majorHAnsi"/>
+          <w:sz w:val="28"/>
+          <w:szCs w:val="28"/>
+        </w:rPr>
+        <w:t xml:space="preserve">The </w:t>
+      </w:r>
+      <w:r>
+        <w:rPr>
+          <w:rFonts w:asciiTheme="majorHAnsi" w:hAnsiTheme="majorHAnsi" w:cstheme="majorHAnsi"/>
+          <w:b/>
+          <w:bCs/>
+          <w:sz w:val="28"/>
+          <w:szCs w:val="28"/>
+        </w:rPr>
+        <w:t>Virtual File System (VFS)</w:t>
+      </w:r>
+      <w:r>
+        <w:rPr>
+          <w:rFonts w:asciiTheme="majorHAnsi" w:hAnsiTheme="majorHAnsi" w:cstheme="majorHAnsi"/>
+          <w:sz w:val="28"/>
+          <w:szCs w:val="28"/>
+        </w:rPr>
+        <w:t xml:space="preserve"> provides a unified interface for different types of file systems.</w:t>
+      </w:r>
+      <w:r>
+        <w:rPr>
+          <w:rFonts w:asciiTheme="majorHAnsi" w:hAnsiTheme="majorHAnsi" w:cstheme="majorHAnsi"/>
+          <w:sz w:val="28"/>
+          <w:szCs w:val="28"/>
+        </w:rPr>
+        <w:br/>
+        <w:t xml:space="preserve">It uses an </w:t>
+      </w:r>
+      <w:r>
+        <w:rPr>
+          <w:rFonts w:asciiTheme="majorHAnsi" w:hAnsiTheme="majorHAnsi" w:cstheme="majorHAnsi"/>
+          <w:b/>
+          <w:bCs/>
+          <w:sz w:val="28"/>
+          <w:szCs w:val="28"/>
+        </w:rPr>
+        <w:t>object-oriented approach</w:t>
+      </w:r>
+      <w:r>
+        <w:rPr>
+          <w:rFonts w:asciiTheme="majorHAnsi" w:hAnsiTheme="majorHAnsi" w:cstheme="majorHAnsi"/>
+          <w:sz w:val="28"/>
+          <w:szCs w:val="28"/>
+        </w:rPr>
+        <w:t xml:space="preserve"> to define a common set of methods, allowing system calls to interact with various file systems (such as NTFS, ext4, etc.) without needing to know their underlying implementation details.</w:t>
+      </w:r>
+    </w:p>
+    <w:p>
+      <w:pPr>
+        <w:rPr>
+          <w:rFonts w:asciiTheme="majorHAnsi" w:hAnsiTheme="majorHAnsi" w:cstheme="majorHAnsi"/>
+          <w:sz w:val="28"/>
+          <w:szCs w:val="28"/>
+        </w:rPr>
+      </w:pPr>
+    </w:p>
+    <w:p>
+      <w:pPr>
+        <w:rPr>
+          <w:rFonts w:asciiTheme="majorHAnsi" w:hAnsiTheme="majorHAnsi" w:cstheme="majorHAnsi"/>
           <w:sz w:val="28"/>
           <w:szCs w:val="28"/>
         </w:rPr>
@@ -4228,6 +6063,155 @@
     </w:lvl>
   </w:abstractNum>
   <w:abstractNum w:abstractNumId="2" w15:restartNumberingAfterBreak="0">
+    <w:nsid w:val="183551BB"/>
+    <w:multiLevelType w:val="multilevel"/>
+    <w:tmpl w:val="7D8ABA52"/>
+    <w:lvl w:ilvl="0">
+      <w:start w:val="1"/>
+      <w:numFmt w:val="bullet"/>
+      <w:lvlText w:val=""/>
+      <w:lvlJc w:val="left"/>
+      <w:pPr>
+        <w:tabs>
+          <w:tab w:val="num" w:pos="720"/>
+        </w:tabs>
+        <w:ind w:left="720" w:hanging="360"/>
+      </w:pPr>
+      <w:rPr>
+        <w:rFonts w:ascii="Symbol" w:hAnsi="Symbol" w:hint="default"/>
+        <w:sz w:val="20"/>
+      </w:rPr>
+    </w:lvl>
+    <w:lvl w:ilvl="1" w:tentative="1">
+      <w:start w:val="1"/>
+      <w:numFmt w:val="bullet"/>
+      <w:lvlText w:val="o"/>
+      <w:lvlJc w:val="left"/>
+      <w:pPr>
+        <w:tabs>
+          <w:tab w:val="num" w:pos="1440"/>
+        </w:tabs>
+        <w:ind w:left="1440" w:hanging="360"/>
+      </w:pPr>
+      <w:rPr>
+        <w:rFonts w:ascii="Courier New" w:hAnsi="Courier New" w:hint="default"/>
+        <w:sz w:val="20"/>
+      </w:rPr>
+    </w:lvl>
+    <w:lvl w:ilvl="2" w:tentative="1">
+      <w:start w:val="1"/>
+      <w:numFmt w:val="bullet"/>
+      <w:lvlText w:val=""/>
+      <w:lvlJc w:val="left"/>
+      <w:pPr>
+        <w:tabs>
+          <w:tab w:val="num" w:pos="2160"/>
+        </w:tabs>
+        <w:ind w:left="2160" w:hanging="360"/>
+      </w:pPr>
+      <w:rPr>
+        <w:rFonts w:ascii="Wingdings" w:hAnsi="Wingdings" w:hint="default"/>
+        <w:sz w:val="20"/>
+      </w:rPr>
+    </w:lvl>
+    <w:lvl w:ilvl="3" w:tentative="1">
+      <w:start w:val="1"/>
+      <w:numFmt w:val="bullet"/>
+      <w:lvlText w:val=""/>
+      <w:lvlJc w:val="left"/>
+      <w:pPr>
+        <w:tabs>
+          <w:tab w:val="num" w:pos="2880"/>
+        </w:tabs>
+        <w:ind w:left="2880" w:hanging="360"/>
+      </w:pPr>
+      <w:rPr>
+        <w:rFonts w:ascii="Wingdings" w:hAnsi="Wingdings" w:hint="default"/>
+        <w:sz w:val="20"/>
+      </w:rPr>
+    </w:lvl>
+    <w:lvl w:ilvl="4" w:tentative="1">
+      <w:start w:val="1"/>
+      <w:numFmt w:val="bullet"/>
+      <w:lvlText w:val=""/>
+      <w:lvlJc w:val="left"/>
+      <w:pPr>
+        <w:tabs>
+          <w:tab w:val="num" w:pos="3600"/>
+        </w:tabs>
+        <w:ind w:left="3600" w:hanging="360"/>
+      </w:pPr>
+      <w:rPr>
+        <w:rFonts w:ascii="Wingdings" w:hAnsi="Wingdings" w:hint="default"/>
+        <w:sz w:val="20"/>
+      </w:rPr>
+    </w:lvl>
+    <w:lvl w:ilvl="5" w:tentative="1">
+      <w:start w:val="1"/>
+      <w:numFmt w:val="bullet"/>
+      <w:lvlText w:val=""/>
+      <w:lvlJc w:val="left"/>
+      <w:pPr>
+        <w:tabs>
+          <w:tab w:val="num" w:pos="4320"/>
+        </w:tabs>
+        <w:ind w:left="4320" w:hanging="360"/>
+      </w:pPr>
+      <w:rPr>
+        <w:rFonts w:ascii="Wingdings" w:hAnsi="Wingdings" w:hint="default"/>
+        <w:sz w:val="20"/>
+      </w:rPr>
+    </w:lvl>
+    <w:lvl w:ilvl="6" w:tentative="1">
+      <w:start w:val="1"/>
+      <w:numFmt w:val="bullet"/>
+      <w:lvlText w:val=""/>
+      <w:lvlJc w:val="left"/>
+      <w:pPr>
+        <w:tabs>
+          <w:tab w:val="num" w:pos="5040"/>
+        </w:tabs>
+        <w:ind w:left="5040" w:hanging="360"/>
+      </w:pPr>
+      <w:rPr>
+        <w:rFonts w:ascii="Wingdings" w:hAnsi="Wingdings" w:hint="default"/>
+        <w:sz w:val="20"/>
+      </w:rPr>
+    </w:lvl>
+    <w:lvl w:ilvl="7" w:tentative="1">
+      <w:start w:val="1"/>
+      <w:numFmt w:val="bullet"/>
+      <w:lvlText w:val=""/>
+      <w:lvlJc w:val="left"/>
+      <w:pPr>
+        <w:tabs>
+          <w:tab w:val="num" w:pos="5760"/>
+        </w:tabs>
+        <w:ind w:left="5760" w:hanging="360"/>
+      </w:pPr>
+      <w:rPr>
+        <w:rFonts w:ascii="Wingdings" w:hAnsi="Wingdings" w:hint="default"/>
+        <w:sz w:val="20"/>
+      </w:rPr>
+    </w:lvl>
+    <w:lvl w:ilvl="8" w:tentative="1">
+      <w:start w:val="1"/>
+      <w:numFmt w:val="bullet"/>
+      <w:lvlText w:val=""/>
+      <w:lvlJc w:val="left"/>
+      <w:pPr>
+        <w:tabs>
+          <w:tab w:val="num" w:pos="6480"/>
+        </w:tabs>
+        <w:ind w:left="6480" w:hanging="360"/>
+      </w:pPr>
+      <w:rPr>
+        <w:rFonts w:ascii="Wingdings" w:hAnsi="Wingdings" w:hint="default"/>
+        <w:sz w:val="20"/>
+      </w:rPr>
+    </w:lvl>
+  </w:abstractNum>
+  <w:abstractNum w:abstractNumId="3" w15:restartNumberingAfterBreak="0">
     <w:nsid w:val="195C0518"/>
     <w:multiLevelType w:val="multilevel"/>
     <w:tmpl w:val="382C378E"/>
@@ -4376,7 +6360,7 @@
       </w:rPr>
     </w:lvl>
   </w:abstractNum>
-  <w:abstractNum w:abstractNumId="3" w15:restartNumberingAfterBreak="0">
+  <w:abstractNum w:abstractNumId="4" w15:restartNumberingAfterBreak="0">
     <w:nsid w:val="31554504"/>
     <w:multiLevelType w:val="multilevel"/>
     <w:tmpl w:val="F3DCCF70"/>
@@ -4525,7 +6509,7 @@
       </w:rPr>
     </w:lvl>
   </w:abstractNum>
-  <w:abstractNum w:abstractNumId="4" w15:restartNumberingAfterBreak="0">
+  <w:abstractNum w:abstractNumId="5" w15:restartNumberingAfterBreak="0">
     <w:nsid w:val="3CD16946"/>
     <w:multiLevelType w:val="multilevel"/>
     <w:tmpl w:val="C0C0FC0A"/>
@@ -4674,7 +6658,156 @@
       </w:rPr>
     </w:lvl>
   </w:abstractNum>
-  <w:abstractNum w:abstractNumId="5" w15:restartNumberingAfterBreak="0">
+  <w:abstractNum w:abstractNumId="6" w15:restartNumberingAfterBreak="0">
+    <w:nsid w:val="3EED4913"/>
+    <w:multiLevelType w:val="multilevel"/>
+    <w:tmpl w:val="4DE48ED6"/>
+    <w:lvl w:ilvl="0">
+      <w:start w:val="1"/>
+      <w:numFmt w:val="bullet"/>
+      <w:lvlText w:val=""/>
+      <w:lvlJc w:val="left"/>
+      <w:pPr>
+        <w:tabs>
+          <w:tab w:val="num" w:pos="720"/>
+        </w:tabs>
+        <w:ind w:left="720" w:hanging="360"/>
+      </w:pPr>
+      <w:rPr>
+        <w:rFonts w:ascii="Symbol" w:hAnsi="Symbol" w:hint="default"/>
+        <w:sz w:val="20"/>
+      </w:rPr>
+    </w:lvl>
+    <w:lvl w:ilvl="1" w:tentative="1">
+      <w:start w:val="1"/>
+      <w:numFmt w:val="bullet"/>
+      <w:lvlText w:val="o"/>
+      <w:lvlJc w:val="left"/>
+      <w:pPr>
+        <w:tabs>
+          <w:tab w:val="num" w:pos="1440"/>
+        </w:tabs>
+        <w:ind w:left="1440" w:hanging="360"/>
+      </w:pPr>
+      <w:rPr>
+        <w:rFonts w:ascii="Courier New" w:hAnsi="Courier New" w:hint="default"/>
+        <w:sz w:val="20"/>
+      </w:rPr>
+    </w:lvl>
+    <w:lvl w:ilvl="2" w:tentative="1">
+      <w:start w:val="1"/>
+      <w:numFmt w:val="bullet"/>
+      <w:lvlText w:val=""/>
+      <w:lvlJc w:val="left"/>
+      <w:pPr>
+        <w:tabs>
+          <w:tab w:val="num" w:pos="2160"/>
+        </w:tabs>
+        <w:ind w:left="2160" w:hanging="360"/>
+      </w:pPr>
+      <w:rPr>
+        <w:rFonts w:ascii="Wingdings" w:hAnsi="Wingdings" w:hint="default"/>
+        <w:sz w:val="20"/>
+      </w:rPr>
+    </w:lvl>
+    <w:lvl w:ilvl="3" w:tentative="1">
+      <w:start w:val="1"/>
+      <w:numFmt w:val="bullet"/>
+      <w:lvlText w:val=""/>
+      <w:lvlJc w:val="left"/>
+      <w:pPr>
+        <w:tabs>
+          <w:tab w:val="num" w:pos="2880"/>
+        </w:tabs>
+        <w:ind w:left="2880" w:hanging="360"/>
+      </w:pPr>
+      <w:rPr>
+        <w:rFonts w:ascii="Wingdings" w:hAnsi="Wingdings" w:hint="default"/>
+        <w:sz w:val="20"/>
+      </w:rPr>
+    </w:lvl>
+    <w:lvl w:ilvl="4" w:tentative="1">
+      <w:start w:val="1"/>
+      <w:numFmt w:val="bullet"/>
+      <w:lvlText w:val=""/>
+      <w:lvlJc w:val="left"/>
+      <w:pPr>
+        <w:tabs>
+          <w:tab w:val="num" w:pos="3600"/>
+        </w:tabs>
+        <w:ind w:left="3600" w:hanging="360"/>
+      </w:pPr>
+      <w:rPr>
+        <w:rFonts w:ascii="Wingdings" w:hAnsi="Wingdings" w:hint="default"/>
+        <w:sz w:val="20"/>
+      </w:rPr>
+    </w:lvl>
+    <w:lvl w:ilvl="5" w:tentative="1">
+      <w:start w:val="1"/>
+      <w:numFmt w:val="bullet"/>
+      <w:lvlText w:val=""/>
+      <w:lvlJc w:val="left"/>
+      <w:pPr>
+        <w:tabs>
+          <w:tab w:val="num" w:pos="4320"/>
+        </w:tabs>
+        <w:ind w:left="4320" w:hanging="360"/>
+      </w:pPr>
+      <w:rPr>
+        <w:rFonts w:ascii="Wingdings" w:hAnsi="Wingdings" w:hint="default"/>
+        <w:sz w:val="20"/>
+      </w:rPr>
+    </w:lvl>
+    <w:lvl w:ilvl="6" w:tentative="1">
+      <w:start w:val="1"/>
+      <w:numFmt w:val="bullet"/>
+      <w:lvlText w:val=""/>
+      <w:lvlJc w:val="left"/>
+      <w:pPr>
+        <w:tabs>
+          <w:tab w:val="num" w:pos="5040"/>
+        </w:tabs>
+        <w:ind w:left="5040" w:hanging="360"/>
+      </w:pPr>
+      <w:rPr>
+        <w:rFonts w:ascii="Wingdings" w:hAnsi="Wingdings" w:hint="default"/>
+        <w:sz w:val="20"/>
+      </w:rPr>
+    </w:lvl>
+    <w:lvl w:ilvl="7" w:tentative="1">
+      <w:start w:val="1"/>
+      <w:numFmt w:val="bullet"/>
+      <w:lvlText w:val=""/>
+      <w:lvlJc w:val="left"/>
+      <w:pPr>
+        <w:tabs>
+          <w:tab w:val="num" w:pos="5760"/>
+        </w:tabs>
+        <w:ind w:left="5760" w:hanging="360"/>
+      </w:pPr>
+      <w:rPr>
+        <w:rFonts w:ascii="Wingdings" w:hAnsi="Wingdings" w:hint="default"/>
+        <w:sz w:val="20"/>
+      </w:rPr>
+    </w:lvl>
+    <w:lvl w:ilvl="8" w:tentative="1">
+      <w:start w:val="1"/>
+      <w:numFmt w:val="bullet"/>
+      <w:lvlText w:val=""/>
+      <w:lvlJc w:val="left"/>
+      <w:pPr>
+        <w:tabs>
+          <w:tab w:val="num" w:pos="6480"/>
+        </w:tabs>
+        <w:ind w:left="6480" w:hanging="360"/>
+      </w:pPr>
+      <w:rPr>
+        <w:rFonts w:ascii="Wingdings" w:hAnsi="Wingdings" w:hint="default"/>
+        <w:sz w:val="20"/>
+      </w:rPr>
+    </w:lvl>
+  </w:abstractNum>
+  <w:abstractNum w:abstractNumId="7" w15:restartNumberingAfterBreak="0">
     <w:nsid w:val="4BF11CB0"/>
     <w:multiLevelType w:val="multilevel"/>
     <w:tmpl w:val="A75881AC"/>
@@ -4823,7 +6956,156 @@
       </w:rPr>
     </w:lvl>
   </w:abstractNum>
-  <w:abstractNum w:abstractNumId="6" w15:restartNumberingAfterBreak="0">
+  <w:abstractNum w:abstractNumId="8" w15:restartNumberingAfterBreak="0">
+    <w:nsid w:val="4EC11734"/>
+    <w:multiLevelType w:val="multilevel"/>
+    <w:tmpl w:val="9E0EE654"/>
+    <w:lvl w:ilvl="0">
+      <w:start w:val="1"/>
+      <w:numFmt w:val="bullet"/>
+      <w:lvlText w:val=""/>
+      <w:lvlJc w:val="left"/>
+      <w:pPr>
+        <w:tabs>
+          <w:tab w:val="num" w:pos="720"/>
+        </w:tabs>
+        <w:ind w:left="720" w:hanging="360"/>
+      </w:pPr>
+      <w:rPr>
+        <w:rFonts w:ascii="Symbol" w:hAnsi="Symbol" w:hint="default"/>
+        <w:sz w:val="20"/>
+      </w:rPr>
+    </w:lvl>
+    <w:lvl w:ilvl="1" w:tentative="1">
+      <w:start w:val="1"/>
+      <w:numFmt w:val="bullet"/>
+      <w:lvlText w:val="o"/>
+      <w:lvlJc w:val="left"/>
+      <w:pPr>
+        <w:tabs>
+          <w:tab w:val="num" w:pos="1440"/>
+        </w:tabs>
+        <w:ind w:left="1440" w:hanging="360"/>
+      </w:pPr>
+      <w:rPr>
+        <w:rFonts w:ascii="Courier New" w:hAnsi="Courier New" w:hint="default"/>
+        <w:sz w:val="20"/>
+      </w:rPr>
+    </w:lvl>
+    <w:lvl w:ilvl="2" w:tentative="1">
+      <w:start w:val="1"/>
+      <w:numFmt w:val="bullet"/>
+      <w:lvlText w:val=""/>
+      <w:lvlJc w:val="left"/>
+      <w:pPr>
+        <w:tabs>
+          <w:tab w:val="num" w:pos="2160"/>
+        </w:tabs>
+        <w:ind w:left="2160" w:hanging="360"/>
+      </w:pPr>
+      <w:rPr>
+        <w:rFonts w:ascii="Wingdings" w:hAnsi="Wingdings" w:hint="default"/>
+        <w:sz w:val="20"/>
+      </w:rPr>
+    </w:lvl>
+    <w:lvl w:ilvl="3" w:tentative="1">
+      <w:start w:val="1"/>
+      <w:numFmt w:val="bullet"/>
+      <w:lvlText w:val=""/>
+      <w:lvlJc w:val="left"/>
+      <w:pPr>
+        <w:tabs>
+          <w:tab w:val="num" w:pos="2880"/>
+        </w:tabs>
+        <w:ind w:left="2880" w:hanging="360"/>
+      </w:pPr>
+      <w:rPr>
+        <w:rFonts w:ascii="Wingdings" w:hAnsi="Wingdings" w:hint="default"/>
+        <w:sz w:val="20"/>
+      </w:rPr>
+    </w:lvl>
+    <w:lvl w:ilvl="4" w:tentative="1">
+      <w:start w:val="1"/>
+      <w:numFmt w:val="bullet"/>
+      <w:lvlText w:val=""/>
+      <w:lvlJc w:val="left"/>
+      <w:pPr>
+        <w:tabs>
+          <w:tab w:val="num" w:pos="3600"/>
+        </w:tabs>
+        <w:ind w:left="3600" w:hanging="360"/>
+      </w:pPr>
+      <w:rPr>
+        <w:rFonts w:ascii="Wingdings" w:hAnsi="Wingdings" w:hint="default"/>
+        <w:sz w:val="20"/>
+      </w:rPr>
+    </w:lvl>
+    <w:lvl w:ilvl="5" w:tentative="1">
+      <w:start w:val="1"/>
+      <w:numFmt w:val="bullet"/>
+      <w:lvlText w:val=""/>
+      <w:lvlJc w:val="left"/>
+      <w:pPr>
+        <w:tabs>
+          <w:tab w:val="num" w:pos="4320"/>
+        </w:tabs>
+        <w:ind w:left="4320" w:hanging="360"/>
+      </w:pPr>
+      <w:rPr>
+        <w:rFonts w:ascii="Wingdings" w:hAnsi="Wingdings" w:hint="default"/>
+        <w:sz w:val="20"/>
+      </w:rPr>
+    </w:lvl>
+    <w:lvl w:ilvl="6" w:tentative="1">
+      <w:start w:val="1"/>
+      <w:numFmt w:val="bullet"/>
+      <w:lvlText w:val=""/>
+      <w:lvlJc w:val="left"/>
+      <w:pPr>
+        <w:tabs>
+          <w:tab w:val="num" w:pos="5040"/>
+        </w:tabs>
+        <w:ind w:left="5040" w:hanging="360"/>
+      </w:pPr>
+      <w:rPr>
+        <w:rFonts w:ascii="Wingdings" w:hAnsi="Wingdings" w:hint="default"/>
+        <w:sz w:val="20"/>
+      </w:rPr>
+    </w:lvl>
+    <w:lvl w:ilvl="7" w:tentative="1">
+      <w:start w:val="1"/>
+      <w:numFmt w:val="bullet"/>
+      <w:lvlText w:val=""/>
+      <w:lvlJc w:val="left"/>
+      <w:pPr>
+        <w:tabs>
+          <w:tab w:val="num" w:pos="5760"/>
+        </w:tabs>
+        <w:ind w:left="5760" w:hanging="360"/>
+      </w:pPr>
+      <w:rPr>
+        <w:rFonts w:ascii="Wingdings" w:hAnsi="Wingdings" w:hint="default"/>
+        <w:sz w:val="20"/>
+      </w:rPr>
+    </w:lvl>
+    <w:lvl w:ilvl="8" w:tentative="1">
+      <w:start w:val="1"/>
+      <w:numFmt w:val="bullet"/>
+      <w:lvlText w:val=""/>
+      <w:lvlJc w:val="left"/>
+      <w:pPr>
+        <w:tabs>
+          <w:tab w:val="num" w:pos="6480"/>
+        </w:tabs>
+        <w:ind w:left="6480" w:hanging="360"/>
+      </w:pPr>
+      <w:rPr>
+        <w:rFonts w:ascii="Wingdings" w:hAnsi="Wingdings" w:hint="default"/>
+        <w:sz w:val="20"/>
+      </w:rPr>
+    </w:lvl>
+  </w:abstractNum>
+  <w:abstractNum w:abstractNumId="9" w15:restartNumberingAfterBreak="0">
     <w:nsid w:val="503846A5"/>
     <w:multiLevelType w:val="multilevel"/>
     <w:tmpl w:val="B22259A4"/>
@@ -4972,7 +7254,7 @@
       </w:rPr>
     </w:lvl>
   </w:abstractNum>
-  <w:abstractNum w:abstractNumId="7" w15:restartNumberingAfterBreak="0">
+  <w:abstractNum w:abstractNumId="10" w15:restartNumberingAfterBreak="0">
     <w:nsid w:val="57ED58EC"/>
     <w:multiLevelType w:val="multilevel"/>
     <w:tmpl w:val="173EF97C"/>
@@ -5085,7 +7367,7 @@
       </w:pPr>
     </w:lvl>
   </w:abstractNum>
-  <w:abstractNum w:abstractNumId="8" w15:restartNumberingAfterBreak="0">
+  <w:abstractNum w:abstractNumId="11" w15:restartNumberingAfterBreak="0">
     <w:nsid w:val="629C4714"/>
     <w:multiLevelType w:val="multilevel"/>
     <w:tmpl w:val="2B84B87C"/>
@@ -5234,7 +7516,418 @@
       </w:rPr>
     </w:lvl>
   </w:abstractNum>
-  <w:abstractNum w:abstractNumId="9" w15:restartNumberingAfterBreak="0">
+  <w:abstractNum w:abstractNumId="12" w15:restartNumberingAfterBreak="0">
+    <w:nsid w:val="65FA771D"/>
+    <w:multiLevelType w:val="multilevel"/>
+    <w:tmpl w:val="E03040B0"/>
+    <w:lvl w:ilvl="0">
+      <w:start w:val="1"/>
+      <w:numFmt w:val="decimal"/>
+      <w:lvlText w:val="%1."/>
+      <w:lvlJc w:val="left"/>
+      <w:pPr>
+        <w:tabs>
+          <w:tab w:val="num" w:pos="720"/>
+        </w:tabs>
+        <w:ind w:left="720" w:hanging="360"/>
+      </w:pPr>
+    </w:lvl>
+    <w:lvl w:ilvl="1" w:tentative="1">
+      <w:start w:val="1"/>
+      <w:numFmt w:val="decimal"/>
+      <w:lvlText w:val="%2."/>
+      <w:lvlJc w:val="left"/>
+      <w:pPr>
+        <w:tabs>
+          <w:tab w:val="num" w:pos="1440"/>
+        </w:tabs>
+        <w:ind w:left="1440" w:hanging="360"/>
+      </w:pPr>
+    </w:lvl>
+    <w:lvl w:ilvl="2" w:tentative="1">
+      <w:start w:val="1"/>
+      <w:numFmt w:val="decimal"/>
+      <w:lvlText w:val="%3."/>
+      <w:lvlJc w:val="left"/>
+      <w:pPr>
+        <w:tabs>
+          <w:tab w:val="num" w:pos="2160"/>
+        </w:tabs>
+        <w:ind w:left="2160" w:hanging="360"/>
+      </w:pPr>
+    </w:lvl>
+    <w:lvl w:ilvl="3" w:tentative="1">
+      <w:start w:val="1"/>
+      <w:numFmt w:val="decimal"/>
+      <w:lvlText w:val="%4."/>
+      <w:lvlJc w:val="left"/>
+      <w:pPr>
+        <w:tabs>
+          <w:tab w:val="num" w:pos="2880"/>
+        </w:tabs>
+        <w:ind w:left="2880" w:hanging="360"/>
+      </w:pPr>
+    </w:lvl>
+    <w:lvl w:ilvl="4" w:tentative="1">
+      <w:start w:val="1"/>
+      <w:numFmt w:val="decimal"/>
+      <w:lvlText w:val="%5."/>
+      <w:lvlJc w:val="left"/>
+      <w:pPr>
+        <w:tabs>
+          <w:tab w:val="num" w:pos="3600"/>
+        </w:tabs>
+        <w:ind w:left="3600" w:hanging="360"/>
+      </w:pPr>
+    </w:lvl>
+    <w:lvl w:ilvl="5" w:tentative="1">
+      <w:start w:val="1"/>
+      <w:numFmt w:val="decimal"/>
+      <w:lvlText w:val="%6."/>
+      <w:lvlJc w:val="left"/>
+      <w:pPr>
+        <w:tabs>
+          <w:tab w:val="num" w:pos="4320"/>
+        </w:tabs>
+        <w:ind w:left="4320" w:hanging="360"/>
+      </w:pPr>
+    </w:lvl>
+    <w:lvl w:ilvl="6" w:tentative="1">
+      <w:start w:val="1"/>
+      <w:numFmt w:val="decimal"/>
+      <w:lvlText w:val="%7."/>
+      <w:lvlJc w:val="left"/>
+      <w:pPr>
+        <w:tabs>
+          <w:tab w:val="num" w:pos="5040"/>
+        </w:tabs>
+        <w:ind w:left="5040" w:hanging="360"/>
+      </w:pPr>
+    </w:lvl>
+    <w:lvl w:ilvl="7" w:tentative="1">
+      <w:start w:val="1"/>
+      <w:numFmt w:val="decimal"/>
+      <w:lvlText w:val="%8."/>
+      <w:lvlJc w:val="left"/>
+      <w:pPr>
+        <w:tabs>
+          <w:tab w:val="num" w:pos="5760"/>
+        </w:tabs>
+        <w:ind w:left="5760" w:hanging="360"/>
+      </w:pPr>
+    </w:lvl>
+    <w:lvl w:ilvl="8" w:tentative="1">
+      <w:start w:val="1"/>
+      <w:numFmt w:val="decimal"/>
+      <w:lvlText w:val="%9."/>
+      <w:lvlJc w:val="left"/>
+      <w:pPr>
+        <w:tabs>
+          <w:tab w:val="num" w:pos="6480"/>
+        </w:tabs>
+        <w:ind w:left="6480" w:hanging="360"/>
+      </w:pPr>
+    </w:lvl>
+  </w:abstractNum>
+  <w:abstractNum w:abstractNumId="13" w15:restartNumberingAfterBreak="0">
+    <w:nsid w:val="6E9175AA"/>
+    <w:multiLevelType w:val="multilevel"/>
+    <w:tmpl w:val="A84CF9C4"/>
+    <w:lvl w:ilvl="0">
+      <w:start w:val="1"/>
+      <w:numFmt w:val="bullet"/>
+      <w:lvlText w:val=""/>
+      <w:lvlJc w:val="left"/>
+      <w:pPr>
+        <w:tabs>
+          <w:tab w:val="num" w:pos="720"/>
+        </w:tabs>
+        <w:ind w:left="720" w:hanging="360"/>
+      </w:pPr>
+      <w:rPr>
+        <w:rFonts w:ascii="Symbol" w:hAnsi="Symbol" w:hint="default"/>
+        <w:sz w:val="20"/>
+      </w:rPr>
+    </w:lvl>
+    <w:lvl w:ilvl="1" w:tentative="1">
+      <w:start w:val="1"/>
+      <w:numFmt w:val="bullet"/>
+      <w:lvlText w:val="o"/>
+      <w:lvlJc w:val="left"/>
+      <w:pPr>
+        <w:tabs>
+          <w:tab w:val="num" w:pos="1440"/>
+        </w:tabs>
+        <w:ind w:left="1440" w:hanging="360"/>
+      </w:pPr>
+      <w:rPr>
+        <w:rFonts w:ascii="Courier New" w:hAnsi="Courier New" w:hint="default"/>
+        <w:sz w:val="20"/>
+      </w:rPr>
+    </w:lvl>
+    <w:lvl w:ilvl="2" w:tentative="1">
+      <w:start w:val="1"/>
+      <w:numFmt w:val="bullet"/>
+      <w:lvlText w:val=""/>
+      <w:lvlJc w:val="left"/>
+      <w:pPr>
+        <w:tabs>
+          <w:tab w:val="num" w:pos="2160"/>
+        </w:tabs>
+        <w:ind w:left="2160" w:hanging="360"/>
+      </w:pPr>
+      <w:rPr>
+        <w:rFonts w:ascii="Wingdings" w:hAnsi="Wingdings" w:hint="default"/>
+        <w:sz w:val="20"/>
+      </w:rPr>
+    </w:lvl>
+    <w:lvl w:ilvl="3" w:tentative="1">
+      <w:start w:val="1"/>
+      <w:numFmt w:val="bullet"/>
+      <w:lvlText w:val=""/>
+      <w:lvlJc w:val="left"/>
+      <w:pPr>
+        <w:tabs>
+          <w:tab w:val="num" w:pos="2880"/>
+        </w:tabs>
+        <w:ind w:left="2880" w:hanging="360"/>
+      </w:pPr>
+      <w:rPr>
+        <w:rFonts w:ascii="Wingdings" w:hAnsi="Wingdings" w:hint="default"/>
+        <w:sz w:val="20"/>
+      </w:rPr>
+    </w:lvl>
+    <w:lvl w:ilvl="4" w:tentative="1">
+      <w:start w:val="1"/>
+      <w:numFmt w:val="bullet"/>
+      <w:lvlText w:val=""/>
+      <w:lvlJc w:val="left"/>
+      <w:pPr>
+        <w:tabs>
+          <w:tab w:val="num" w:pos="3600"/>
+        </w:tabs>
+        <w:ind w:left="3600" w:hanging="360"/>
+      </w:pPr>
+      <w:rPr>
+        <w:rFonts w:ascii="Wingdings" w:hAnsi="Wingdings" w:hint="default"/>
+        <w:sz w:val="20"/>
+      </w:rPr>
+    </w:lvl>
+    <w:lvl w:ilvl="5" w:tentative="1">
+      <w:start w:val="1"/>
+      <w:numFmt w:val="bullet"/>
+      <w:lvlText w:val=""/>
+      <w:lvlJc w:val="left"/>
+      <w:pPr>
+        <w:tabs>
+          <w:tab w:val="num" w:pos="4320"/>
+        </w:tabs>
+        <w:ind w:left="4320" w:hanging="360"/>
+      </w:pPr>
+      <w:rPr>
+        <w:rFonts w:ascii="Wingdings" w:hAnsi="Wingdings" w:hint="default"/>
+        <w:sz w:val="20"/>
+      </w:rPr>
+    </w:lvl>
+    <w:lvl w:ilvl="6" w:tentative="1">
+      <w:start w:val="1"/>
+      <w:numFmt w:val="bullet"/>
+      <w:lvlText w:val=""/>
+      <w:lvlJc w:val="left"/>
+      <w:pPr>
+        <w:tabs>
+          <w:tab w:val="num" w:pos="5040"/>
+        </w:tabs>
+        <w:ind w:left="5040" w:hanging="360"/>
+      </w:pPr>
+      <w:rPr>
+        <w:rFonts w:ascii="Wingdings" w:hAnsi="Wingdings" w:hint="default"/>
+        <w:sz w:val="20"/>
+      </w:rPr>
+    </w:lvl>
+    <w:lvl w:ilvl="7" w:tentative="1">
+      <w:start w:val="1"/>
+      <w:numFmt w:val="bullet"/>
+      <w:lvlText w:val=""/>
+      <w:lvlJc w:val="left"/>
+      <w:pPr>
+        <w:tabs>
+          <w:tab w:val="num" w:pos="5760"/>
+        </w:tabs>
+        <w:ind w:left="5760" w:hanging="360"/>
+      </w:pPr>
+      <w:rPr>
+        <w:rFonts w:ascii="Wingdings" w:hAnsi="Wingdings" w:hint="default"/>
+        <w:sz w:val="20"/>
+      </w:rPr>
+    </w:lvl>
+    <w:lvl w:ilvl="8" w:tentative="1">
+      <w:start w:val="1"/>
+      <w:numFmt w:val="bullet"/>
+      <w:lvlText w:val=""/>
+      <w:lvlJc w:val="left"/>
+      <w:pPr>
+        <w:tabs>
+          <w:tab w:val="num" w:pos="6480"/>
+        </w:tabs>
+        <w:ind w:left="6480" w:hanging="360"/>
+      </w:pPr>
+      <w:rPr>
+        <w:rFonts w:ascii="Wingdings" w:hAnsi="Wingdings" w:hint="default"/>
+        <w:sz w:val="20"/>
+      </w:rPr>
+    </w:lvl>
+  </w:abstractNum>
+  <w:abstractNum w:abstractNumId="14" w15:restartNumberingAfterBreak="0">
+    <w:nsid w:val="75A87048"/>
+    <w:multiLevelType w:val="multilevel"/>
+    <w:tmpl w:val="A4E44142"/>
+    <w:lvl w:ilvl="0">
+      <w:start w:val="1"/>
+      <w:numFmt w:val="bullet"/>
+      <w:lvlText w:val=""/>
+      <w:lvlJc w:val="left"/>
+      <w:pPr>
+        <w:tabs>
+          <w:tab w:val="num" w:pos="720"/>
+        </w:tabs>
+        <w:ind w:left="720" w:hanging="360"/>
+      </w:pPr>
+      <w:rPr>
+        <w:rFonts w:ascii="Symbol" w:hAnsi="Symbol" w:hint="default"/>
+        <w:sz w:val="20"/>
+      </w:rPr>
+    </w:lvl>
+    <w:lvl w:ilvl="1" w:tentative="1">
+      <w:start w:val="1"/>
+      <w:numFmt w:val="bullet"/>
+      <w:lvlText w:val="o"/>
+      <w:lvlJc w:val="left"/>
+      <w:pPr>
+        <w:tabs>
+          <w:tab w:val="num" w:pos="1440"/>
+        </w:tabs>
+        <w:ind w:left="1440" w:hanging="360"/>
+      </w:pPr>
+      <w:rPr>
+        <w:rFonts w:ascii="Courier New" w:hAnsi="Courier New" w:hint="default"/>
+        <w:sz w:val="20"/>
+      </w:rPr>
+    </w:lvl>
+    <w:lvl w:ilvl="2" w:tentative="1">
+      <w:start w:val="1"/>
+      <w:numFmt w:val="bullet"/>
+      <w:lvlText w:val=""/>
+      <w:lvlJc w:val="left"/>
+      <w:pPr>
+        <w:tabs>
+          <w:tab w:val="num" w:pos="2160"/>
+        </w:tabs>
+        <w:ind w:left="2160" w:hanging="360"/>
+      </w:pPr>
+      <w:rPr>
+        <w:rFonts w:ascii="Wingdings" w:hAnsi="Wingdings" w:hint="default"/>
+        <w:sz w:val="20"/>
+      </w:rPr>
+    </w:lvl>
+    <w:lvl w:ilvl="3" w:tentative="1">
+      <w:start w:val="1"/>
+      <w:numFmt w:val="bullet"/>
+      <w:lvlText w:val=""/>
+      <w:lvlJc w:val="left"/>
+      <w:pPr>
+        <w:tabs>
+          <w:tab w:val="num" w:pos="2880"/>
+        </w:tabs>
+        <w:ind w:left="2880" w:hanging="360"/>
+      </w:pPr>
+      <w:rPr>
+        <w:rFonts w:ascii="Wingdings" w:hAnsi="Wingdings" w:hint="default"/>
+        <w:sz w:val="20"/>
+      </w:rPr>
+    </w:lvl>
+    <w:lvl w:ilvl="4" w:tentative="1">
+      <w:start w:val="1"/>
+      <w:numFmt w:val="bullet"/>
+      <w:lvlText w:val=""/>
+      <w:lvlJc w:val="left"/>
+      <w:pPr>
+        <w:tabs>
+          <w:tab w:val="num" w:pos="3600"/>
+        </w:tabs>
+        <w:ind w:left="3600" w:hanging="360"/>
+      </w:pPr>
+      <w:rPr>
+        <w:rFonts w:ascii="Wingdings" w:hAnsi="Wingdings" w:hint="default"/>
+        <w:sz w:val="20"/>
+      </w:rPr>
+    </w:lvl>
+    <w:lvl w:ilvl="5" w:tentative="1">
+      <w:start w:val="1"/>
+      <w:numFmt w:val="bullet"/>
+      <w:lvlText w:val=""/>
+      <w:lvlJc w:val="left"/>
+      <w:pPr>
+        <w:tabs>
+          <w:tab w:val="num" w:pos="4320"/>
+        </w:tabs>
+        <w:ind w:left="4320" w:hanging="360"/>
+      </w:pPr>
+      <w:rPr>
+        <w:rFonts w:ascii="Wingdings" w:hAnsi="Wingdings" w:hint="default"/>
+        <w:sz w:val="20"/>
+      </w:rPr>
+    </w:lvl>
+    <w:lvl w:ilvl="6" w:tentative="1">
+      <w:start w:val="1"/>
+      <w:numFmt w:val="bullet"/>
+      <w:lvlText w:val=""/>
+      <w:lvlJc w:val="left"/>
+      <w:pPr>
+        <w:tabs>
+          <w:tab w:val="num" w:pos="5040"/>
+        </w:tabs>
+        <w:ind w:left="5040" w:hanging="360"/>
+      </w:pPr>
+      <w:rPr>
+        <w:rFonts w:ascii="Wingdings" w:hAnsi="Wingdings" w:hint="default"/>
+        <w:sz w:val="20"/>
+      </w:rPr>
+    </w:lvl>
+    <w:lvl w:ilvl="7" w:tentative="1">
+      <w:start w:val="1"/>
+      <w:numFmt w:val="bullet"/>
+      <w:lvlText w:val=""/>
+      <w:lvlJc w:val="left"/>
+      <w:pPr>
+        <w:tabs>
+          <w:tab w:val="num" w:pos="5760"/>
+        </w:tabs>
+        <w:ind w:left="5760" w:hanging="360"/>
+      </w:pPr>
+      <w:rPr>
+        <w:rFonts w:ascii="Wingdings" w:hAnsi="Wingdings" w:hint="default"/>
+        <w:sz w:val="20"/>
+      </w:rPr>
+    </w:lvl>
+    <w:lvl w:ilvl="8" w:tentative="1">
+      <w:start w:val="1"/>
+      <w:numFmt w:val="bullet"/>
+      <w:lvlText w:val=""/>
+      <w:lvlJc w:val="left"/>
+      <w:pPr>
+        <w:tabs>
+          <w:tab w:val="num" w:pos="6480"/>
+        </w:tabs>
+        <w:ind w:left="6480" w:hanging="360"/>
+      </w:pPr>
+      <w:rPr>
+        <w:rFonts w:ascii="Wingdings" w:hAnsi="Wingdings" w:hint="default"/>
+        <w:sz w:val="20"/>
+      </w:rPr>
+    </w:lvl>
+  </w:abstractNum>
+  <w:abstractNum w:abstractNumId="15" w15:restartNumberingAfterBreak="0">
     <w:nsid w:val="78F05EE3"/>
     <w:multiLevelType w:val="multilevel"/>
     <w:tmpl w:val="E9529A0A"/>
@@ -5383,7 +8076,7 @@
       </w:rPr>
     </w:lvl>
   </w:abstractNum>
-  <w:abstractNum w:abstractNumId="10" w15:restartNumberingAfterBreak="0">
+  <w:abstractNum w:abstractNumId="16" w15:restartNumberingAfterBreak="0">
     <w:nsid w:val="7BD43704"/>
     <w:multiLevelType w:val="multilevel"/>
     <w:tmpl w:val="BC42DA02"/>
@@ -5532,11 +8225,160 @@
       </w:rPr>
     </w:lvl>
   </w:abstractNum>
+  <w:abstractNum w:abstractNumId="17" w15:restartNumberingAfterBreak="0">
+    <w:nsid w:val="7F8D2559"/>
+    <w:multiLevelType w:val="multilevel"/>
+    <w:tmpl w:val="FB266DF0"/>
+    <w:lvl w:ilvl="0">
+      <w:start w:val="1"/>
+      <w:numFmt w:val="bullet"/>
+      <w:lvlText w:val=""/>
+      <w:lvlJc w:val="left"/>
+      <w:pPr>
+        <w:tabs>
+          <w:tab w:val="num" w:pos="720"/>
+        </w:tabs>
+        <w:ind w:left="720" w:hanging="360"/>
+      </w:pPr>
+      <w:rPr>
+        <w:rFonts w:ascii="Symbol" w:hAnsi="Symbol" w:hint="default"/>
+        <w:sz w:val="20"/>
+      </w:rPr>
+    </w:lvl>
+    <w:lvl w:ilvl="1" w:tentative="1">
+      <w:start w:val="1"/>
+      <w:numFmt w:val="bullet"/>
+      <w:lvlText w:val="o"/>
+      <w:lvlJc w:val="left"/>
+      <w:pPr>
+        <w:tabs>
+          <w:tab w:val="num" w:pos="1440"/>
+        </w:tabs>
+        <w:ind w:left="1440" w:hanging="360"/>
+      </w:pPr>
+      <w:rPr>
+        <w:rFonts w:ascii="Courier New" w:hAnsi="Courier New" w:hint="default"/>
+        <w:sz w:val="20"/>
+      </w:rPr>
+    </w:lvl>
+    <w:lvl w:ilvl="2" w:tentative="1">
+      <w:start w:val="1"/>
+      <w:numFmt w:val="bullet"/>
+      <w:lvlText w:val=""/>
+      <w:lvlJc w:val="left"/>
+      <w:pPr>
+        <w:tabs>
+          <w:tab w:val="num" w:pos="2160"/>
+        </w:tabs>
+        <w:ind w:left="2160" w:hanging="360"/>
+      </w:pPr>
+      <w:rPr>
+        <w:rFonts w:ascii="Wingdings" w:hAnsi="Wingdings" w:hint="default"/>
+        <w:sz w:val="20"/>
+      </w:rPr>
+    </w:lvl>
+    <w:lvl w:ilvl="3" w:tentative="1">
+      <w:start w:val="1"/>
+      <w:numFmt w:val="bullet"/>
+      <w:lvlText w:val=""/>
+      <w:lvlJc w:val="left"/>
+      <w:pPr>
+        <w:tabs>
+          <w:tab w:val="num" w:pos="2880"/>
+        </w:tabs>
+        <w:ind w:left="2880" w:hanging="360"/>
+      </w:pPr>
+      <w:rPr>
+        <w:rFonts w:ascii="Wingdings" w:hAnsi="Wingdings" w:hint="default"/>
+        <w:sz w:val="20"/>
+      </w:rPr>
+    </w:lvl>
+    <w:lvl w:ilvl="4" w:tentative="1">
+      <w:start w:val="1"/>
+      <w:numFmt w:val="bullet"/>
+      <w:lvlText w:val=""/>
+      <w:lvlJc w:val="left"/>
+      <w:pPr>
+        <w:tabs>
+          <w:tab w:val="num" w:pos="3600"/>
+        </w:tabs>
+        <w:ind w:left="3600" w:hanging="360"/>
+      </w:pPr>
+      <w:rPr>
+        <w:rFonts w:ascii="Wingdings" w:hAnsi="Wingdings" w:hint="default"/>
+        <w:sz w:val="20"/>
+      </w:rPr>
+    </w:lvl>
+    <w:lvl w:ilvl="5" w:tentative="1">
+      <w:start w:val="1"/>
+      <w:numFmt w:val="bullet"/>
+      <w:lvlText w:val=""/>
+      <w:lvlJc w:val="left"/>
+      <w:pPr>
+        <w:tabs>
+          <w:tab w:val="num" w:pos="4320"/>
+        </w:tabs>
+        <w:ind w:left="4320" w:hanging="360"/>
+      </w:pPr>
+      <w:rPr>
+        <w:rFonts w:ascii="Wingdings" w:hAnsi="Wingdings" w:hint="default"/>
+        <w:sz w:val="20"/>
+      </w:rPr>
+    </w:lvl>
+    <w:lvl w:ilvl="6" w:tentative="1">
+      <w:start w:val="1"/>
+      <w:numFmt w:val="bullet"/>
+      <w:lvlText w:val=""/>
+      <w:lvlJc w:val="left"/>
+      <w:pPr>
+        <w:tabs>
+          <w:tab w:val="num" w:pos="5040"/>
+        </w:tabs>
+        <w:ind w:left="5040" w:hanging="360"/>
+      </w:pPr>
+      <w:rPr>
+        <w:rFonts w:ascii="Wingdings" w:hAnsi="Wingdings" w:hint="default"/>
+        <w:sz w:val="20"/>
+      </w:rPr>
+    </w:lvl>
+    <w:lvl w:ilvl="7" w:tentative="1">
+      <w:start w:val="1"/>
+      <w:numFmt w:val="bullet"/>
+      <w:lvlText w:val=""/>
+      <w:lvlJc w:val="left"/>
+      <w:pPr>
+        <w:tabs>
+          <w:tab w:val="num" w:pos="5760"/>
+        </w:tabs>
+        <w:ind w:left="5760" w:hanging="360"/>
+      </w:pPr>
+      <w:rPr>
+        <w:rFonts w:ascii="Wingdings" w:hAnsi="Wingdings" w:hint="default"/>
+        <w:sz w:val="20"/>
+      </w:rPr>
+    </w:lvl>
+    <w:lvl w:ilvl="8" w:tentative="1">
+      <w:start w:val="1"/>
+      <w:numFmt w:val="bullet"/>
+      <w:lvlText w:val=""/>
+      <w:lvlJc w:val="left"/>
+      <w:pPr>
+        <w:tabs>
+          <w:tab w:val="num" w:pos="6480"/>
+        </w:tabs>
+        <w:ind w:left="6480" w:hanging="360"/>
+      </w:pPr>
+      <w:rPr>
+        <w:rFonts w:ascii="Wingdings" w:hAnsi="Wingdings" w:hint="default"/>
+        <w:sz w:val="20"/>
+      </w:rPr>
+    </w:lvl>
+  </w:abstractNum>
   <w:num w:numId="1" w16cid:durableId="977999628">
-    <w:abstractNumId w:val="3"/>
+    <w:abstractNumId w:val="4"/>
   </w:num>
   <w:num w:numId="2" w16cid:durableId="1965621477">
-    <w:abstractNumId w:val="8"/>
+    <w:abstractNumId w:val="11"/>
   </w:num>
   <w:num w:numId="3" w16cid:durableId="1496728574">
     <w:abstractNumId w:val="0"/>
@@ -5545,25 +8387,46 @@
     <w:abstractNumId w:val="1"/>
   </w:num>
   <w:num w:numId="5" w16cid:durableId="950403894">
+    <w:abstractNumId w:val="9"/>
+  </w:num>
+  <w:num w:numId="6" w16cid:durableId="28142274">
+    <w:abstractNumId w:val="7"/>
+  </w:num>
+  <w:num w:numId="7" w16cid:durableId="1730693395">
+    <w:abstractNumId w:val="10"/>
+  </w:num>
+  <w:num w:numId="8" w16cid:durableId="1577933549">
+    <w:abstractNumId w:val="3"/>
+  </w:num>
+  <w:num w:numId="9" w16cid:durableId="511603050">
+    <w:abstractNumId w:val="16"/>
+  </w:num>
+  <w:num w:numId="10" w16cid:durableId="1502352030">
+    <w:abstractNumId w:val="5"/>
+  </w:num>
+  <w:num w:numId="11" w16cid:durableId="186262547">
+    <w:abstractNumId w:val="15"/>
+  </w:num>
+  <w:num w:numId="12" w16cid:durableId="1849755015">
+    <w:abstractNumId w:val="8"/>
+  </w:num>
+  <w:num w:numId="13" w16cid:durableId="230775166">
     <w:abstractNumId w:val="6"/>
   </w:num>
-  <w:num w:numId="6" w16cid:durableId="28142274">
-    <w:abstractNumId w:val="5"/>
+  <w:num w:numId="14" w16cid:durableId="1986157041">
+    <w:abstractNumId w:val="17"/>
   </w:num>
-  <w:num w:numId="7" w16cid:durableId="1730693395">
-    <w:abstractNumId w:val="7"/>
+  <w:num w:numId="15" w16cid:durableId="1836606139">
+    <w:abstractNumId w:val="14"/>
   </w:num>
-  <w:num w:numId="8" w16cid:durableId="1577933549">
+  <w:num w:numId="16" w16cid:durableId="2082679833">
+    <w:abstractNumId w:val="12"/>
+  </w:num>
+  <w:num w:numId="17" w16cid:durableId="1356081708">
+    <w:abstractNumId w:val="13"/>
+  </w:num>
+  <w:num w:numId="18" w16cid:durableId="844051918">
     <w:abstractNumId w:val="2"/>
-  </w:num>
-  <w:num w:numId="9" w16cid:durableId="511603050">
-    <w:abstractNumId w:val="10"/>
-  </w:num>
-  <w:num w:numId="10" w16cid:durableId="1502352030">
-    <w:abstractNumId w:val="4"/>
-  </w:num>
-  <w:num w:numId="11" w16cid:durableId="186262547">
-    <w:abstractNumId w:val="9"/>
   </w:num>
 </w:numbering>
 </file>

</xml_diff>

<commit_message>
Add quiz for summary operating system
</commit_message>
<xml_diff>
--- a/OPERATING_SYSTEM.docx
+++ b/OPERATING_SYSTEM.docx
@@ -3936,20 +3936,7 @@
           <w:sz w:val="28"/>
           <w:szCs w:val="28"/>
         </w:rPr>
-        <w:t xml:space="preserve">9. </w:t>
-      </w:r>
-      <w:r>
-        <w:rPr>
-          <w:rFonts w:asciiTheme="majorHAnsi" w:hAnsiTheme="majorHAnsi" w:cstheme="majorHAnsi"/>
-          <w:b/>
-          <w:bCs/>
-          <w:i/>
-          <w:iCs/>
-          <w:color w:val="00B0F0"/>
-          <w:sz w:val="28"/>
-          <w:szCs w:val="28"/>
-        </w:rPr>
-        <w:t>CPU Scheduling</w:t>
+        <w:t>9. CPU Scheduling</w:t>
       </w:r>
     </w:p>
     <w:p>
@@ -4401,20 +4388,7 @@
           <w:sz w:val="28"/>
           <w:szCs w:val="28"/>
         </w:rPr>
-        <w:t>10</w:t>
-      </w:r>
-      <w:r>
-        <w:rPr>
-          <w:rFonts w:asciiTheme="majorHAnsi" w:hAnsiTheme="majorHAnsi" w:cstheme="majorHAnsi"/>
-          <w:b/>
-          <w:bCs/>
-          <w:i/>
-          <w:iCs/>
-          <w:color w:val="00B0F0"/>
-          <w:sz w:val="28"/>
-          <w:szCs w:val="28"/>
-        </w:rPr>
-        <w:t>. Process Synchronization</w:t>
+        <w:t>10. Process Synchronization</w:t>
       </w:r>
     </w:p>
     <w:p>
@@ -4908,20 +4882,7 @@
           <w:sz w:val="28"/>
           <w:szCs w:val="28"/>
         </w:rPr>
-        <w:t>11</w:t>
-      </w:r>
-      <w:r>
-        <w:rPr>
-          <w:rFonts w:asciiTheme="majorHAnsi" w:hAnsiTheme="majorHAnsi" w:cstheme="majorHAnsi"/>
-          <w:b/>
-          <w:bCs/>
-          <w:i/>
-          <w:iCs/>
-          <w:color w:val="00B0F0"/>
-          <w:sz w:val="28"/>
-          <w:szCs w:val="28"/>
-        </w:rPr>
-        <w:t>. Deadlocks</w:t>
+        <w:t>11. Deadlocks</w:t>
       </w:r>
     </w:p>
     <w:p>
@@ -5265,9 +5226,221 @@
           <w:sz w:val="28"/>
           <w:szCs w:val="28"/>
         </w:rPr>
-        <w:t>12</w:t>
-      </w:r>
-      <w:r>
+        <w:t>12. Memory Management</w:t>
+      </w:r>
+    </w:p>
+    <w:p>
+      <w:pPr>
+        <w:rPr>
+          <w:rFonts w:asciiTheme="majorHAnsi" w:hAnsiTheme="majorHAnsi" w:cstheme="majorHAnsi"/>
+          <w:i/>
+          <w:iCs/>
+          <w:sz w:val="28"/>
+          <w:szCs w:val="28"/>
+          <w:u w:val="single"/>
+        </w:rPr>
+      </w:pPr>
+      <w:r>
+        <w:rPr>
+          <w:rFonts w:asciiTheme="majorHAnsi" w:hAnsiTheme="majorHAnsi" w:cstheme="majorHAnsi"/>
+          <w:i/>
+          <w:iCs/>
+          <w:sz w:val="28"/>
+          <w:szCs w:val="28"/>
+          <w:u w:val="single"/>
+        </w:rPr>
+        <w:t>Paging</w:t>
+      </w:r>
+    </w:p>
+    <w:p>
+      <w:pPr>
+        <w:rPr>
+          <w:rFonts w:asciiTheme="majorHAnsi" w:hAnsiTheme="majorHAnsi" w:cstheme="majorHAnsi"/>
+          <w:sz w:val="28"/>
+          <w:szCs w:val="28"/>
+        </w:rPr>
+      </w:pPr>
+      <w:r>
+        <w:rPr>
+          <w:rFonts w:asciiTheme="majorHAnsi" w:hAnsiTheme="majorHAnsi" w:cstheme="majorHAnsi"/>
+          <w:sz w:val="28"/>
+          <w:szCs w:val="28"/>
+        </w:rPr>
+        <w:t xml:space="preserve">Paging is a non-contiguous memory management technique. Logical address space is divided into </w:t>
+      </w:r>
+      <w:r>
+        <w:rPr>
+          <w:rFonts w:asciiTheme="majorHAnsi" w:hAnsiTheme="majorHAnsi" w:cstheme="majorHAnsi"/>
+          <w:b/>
+          <w:bCs/>
+          <w:sz w:val="28"/>
+          <w:szCs w:val="28"/>
+        </w:rPr>
+        <w:t>pages</w:t>
+      </w:r>
+      <w:r>
+        <w:rPr>
+          <w:rFonts w:asciiTheme="majorHAnsi" w:hAnsiTheme="majorHAnsi" w:cstheme="majorHAnsi"/>
+          <w:sz w:val="28"/>
+          <w:szCs w:val="28"/>
+        </w:rPr>
+        <w:t xml:space="preserve">, while physical memory is divided into </w:t>
+      </w:r>
+      <w:r>
+        <w:rPr>
+          <w:rFonts w:asciiTheme="majorHAnsi" w:hAnsiTheme="majorHAnsi" w:cstheme="majorHAnsi"/>
+          <w:b/>
+          <w:bCs/>
+          <w:sz w:val="28"/>
+          <w:szCs w:val="28"/>
+        </w:rPr>
+        <w:t>frames</w:t>
+      </w:r>
+      <w:r>
+        <w:rPr>
+          <w:rFonts w:asciiTheme="majorHAnsi" w:hAnsiTheme="majorHAnsi" w:cstheme="majorHAnsi"/>
+          <w:sz w:val="28"/>
+          <w:szCs w:val="28"/>
+        </w:rPr>
+        <w:t xml:space="preserve">. The mapping between them is maintained using a </w:t>
+      </w:r>
+      <w:r>
+        <w:rPr>
+          <w:rFonts w:asciiTheme="majorHAnsi" w:hAnsiTheme="majorHAnsi" w:cstheme="majorHAnsi"/>
+          <w:b/>
+          <w:bCs/>
+          <w:sz w:val="28"/>
+          <w:szCs w:val="28"/>
+        </w:rPr>
+        <w:t>Page Table</w:t>
+      </w:r>
+      <w:r>
+        <w:rPr>
+          <w:rFonts w:asciiTheme="majorHAnsi" w:hAnsiTheme="majorHAnsi" w:cstheme="majorHAnsi"/>
+          <w:sz w:val="28"/>
+          <w:szCs w:val="28"/>
+        </w:rPr>
+        <w:t>.</w:t>
+      </w:r>
+    </w:p>
+    <w:p>
+      <w:pPr>
+        <w:rPr>
+          <w:rFonts w:asciiTheme="majorHAnsi" w:hAnsiTheme="majorHAnsi" w:cstheme="majorHAnsi"/>
+          <w:i/>
+          <w:iCs/>
+          <w:sz w:val="28"/>
+          <w:szCs w:val="28"/>
+          <w:u w:val="single"/>
+        </w:rPr>
+      </w:pPr>
+      <w:r>
+        <w:rPr>
+          <w:rFonts w:asciiTheme="majorHAnsi" w:hAnsiTheme="majorHAnsi" w:cstheme="majorHAnsi"/>
+          <w:i/>
+          <w:iCs/>
+          <w:sz w:val="28"/>
+          <w:szCs w:val="28"/>
+          <w:u w:val="single"/>
+        </w:rPr>
+        <w:t>Virtual Memory</w:t>
+      </w:r>
+    </w:p>
+    <w:p>
+      <w:pPr>
+        <w:rPr>
+          <w:rFonts w:asciiTheme="majorHAnsi" w:hAnsiTheme="majorHAnsi" w:cstheme="majorHAnsi"/>
+          <w:sz w:val="28"/>
+          <w:szCs w:val="28"/>
+        </w:rPr>
+      </w:pPr>
+      <w:r>
+        <w:rPr>
+          <w:rFonts w:asciiTheme="majorHAnsi" w:hAnsiTheme="majorHAnsi" w:cstheme="majorHAnsi"/>
+          <w:sz w:val="28"/>
+          <w:szCs w:val="28"/>
+        </w:rPr>
+        <w:t xml:space="preserve">Virtual memory allows processes larger than the physical memory to execute by using </w:t>
+      </w:r>
+      <w:r>
+        <w:rPr>
+          <w:rFonts w:asciiTheme="majorHAnsi" w:hAnsiTheme="majorHAnsi" w:cstheme="majorHAnsi"/>
+          <w:b/>
+          <w:bCs/>
+          <w:sz w:val="28"/>
+          <w:szCs w:val="28"/>
+        </w:rPr>
+        <w:t>Demand Paging</w:t>
+      </w:r>
+      <w:r>
+        <w:rPr>
+          <w:rFonts w:asciiTheme="majorHAnsi" w:hAnsiTheme="majorHAnsi" w:cstheme="majorHAnsi"/>
+          <w:sz w:val="28"/>
+          <w:szCs w:val="28"/>
+        </w:rPr>
+        <w:t xml:space="preserve">. When a process accesses a page that is not currently in RAM, a </w:t>
+      </w:r>
+      <w:r>
+        <w:rPr>
+          <w:rFonts w:asciiTheme="majorHAnsi" w:hAnsiTheme="majorHAnsi" w:cstheme="majorHAnsi"/>
+          <w:b/>
+          <w:bCs/>
+          <w:sz w:val="28"/>
+          <w:szCs w:val="28"/>
+        </w:rPr>
+        <w:t>page fault</w:t>
+      </w:r>
+      <w:r>
+        <w:rPr>
+          <w:rFonts w:asciiTheme="majorHAnsi" w:hAnsiTheme="majorHAnsi" w:cstheme="majorHAnsi"/>
+          <w:sz w:val="28"/>
+          <w:szCs w:val="28"/>
+        </w:rPr>
+        <w:t xml:space="preserve"> occurs, triggering the page replacement process.</w:t>
+      </w:r>
+    </w:p>
+    <w:p>
+      <w:pPr>
+        <w:rPr>
+          <w:rFonts w:asciiTheme="majorHAnsi" w:hAnsiTheme="majorHAnsi" w:cstheme="majorHAnsi"/>
+          <w:i/>
+          <w:iCs/>
+          <w:sz w:val="28"/>
+          <w:szCs w:val="28"/>
+          <w:u w:val="single"/>
+        </w:rPr>
+      </w:pPr>
+      <w:r>
+        <w:rPr>
+          <w:rFonts w:asciiTheme="majorHAnsi" w:hAnsiTheme="majorHAnsi" w:cstheme="majorHAnsi"/>
+          <w:i/>
+          <w:iCs/>
+          <w:sz w:val="28"/>
+          <w:szCs w:val="28"/>
+          <w:u w:val="single"/>
+        </w:rPr>
+        <w:t>Thrashing</w:t>
+      </w:r>
+    </w:p>
+    <w:p>
+      <w:pPr>
+        <w:rPr>
+          <w:rFonts w:asciiTheme="majorHAnsi" w:hAnsiTheme="majorHAnsi" w:cstheme="majorHAnsi"/>
+          <w:sz w:val="28"/>
+          <w:szCs w:val="28"/>
+        </w:rPr>
+      </w:pPr>
+      <w:r>
+        <w:rPr>
+          <w:rFonts w:asciiTheme="majorHAnsi" w:hAnsiTheme="majorHAnsi" w:cstheme="majorHAnsi"/>
+          <w:sz w:val="28"/>
+          <w:szCs w:val="28"/>
+        </w:rPr>
+        <w:t>Thrashing occurs when the system spends more time swapping pages in and out of memory than executing actual instructions. This happens when a process does not have enough frames to maintain its working set.</w:t>
+      </w:r>
+    </w:p>
+    <w:p>
+      <w:pPr>
         <w:rPr>
           <w:rFonts w:asciiTheme="majorHAnsi" w:hAnsiTheme="majorHAnsi" w:cstheme="majorHAnsi"/>
           <w:b/>
@@ -5278,221 +5451,8 @@
           <w:sz w:val="28"/>
           <w:szCs w:val="28"/>
         </w:rPr>
-        <w:t>. Memory Management</w:t>
-      </w:r>
-    </w:p>
-    <w:p>
-      <w:pPr>
-        <w:rPr>
-          <w:rFonts w:asciiTheme="majorHAnsi" w:hAnsiTheme="majorHAnsi" w:cstheme="majorHAnsi"/>
-          <w:i/>
-          <w:iCs/>
-          <w:sz w:val="28"/>
-          <w:szCs w:val="28"/>
-          <w:u w:val="single"/>
-        </w:rPr>
-      </w:pPr>
-      <w:r>
-        <w:rPr>
-          <w:rFonts w:asciiTheme="majorHAnsi" w:hAnsiTheme="majorHAnsi" w:cstheme="majorHAnsi"/>
-          <w:i/>
-          <w:iCs/>
-          <w:sz w:val="28"/>
-          <w:szCs w:val="28"/>
-          <w:u w:val="single"/>
-        </w:rPr>
-        <w:t>Paging</w:t>
-      </w:r>
-    </w:p>
-    <w:p>
-      <w:pPr>
-        <w:rPr>
-          <w:rFonts w:asciiTheme="majorHAnsi" w:hAnsiTheme="majorHAnsi" w:cstheme="majorHAnsi"/>
-          <w:sz w:val="28"/>
-          <w:szCs w:val="28"/>
-        </w:rPr>
-      </w:pPr>
-      <w:r>
-        <w:rPr>
-          <w:rFonts w:asciiTheme="majorHAnsi" w:hAnsiTheme="majorHAnsi" w:cstheme="majorHAnsi"/>
-          <w:sz w:val="28"/>
-          <w:szCs w:val="28"/>
-        </w:rPr>
-        <w:t xml:space="preserve">Paging is a non-contiguous memory management technique. Logical address space is divided into </w:t>
-      </w:r>
-      <w:r>
-        <w:rPr>
-          <w:rFonts w:asciiTheme="majorHAnsi" w:hAnsiTheme="majorHAnsi" w:cstheme="majorHAnsi"/>
-          <w:b/>
-          <w:bCs/>
-          <w:sz w:val="28"/>
-          <w:szCs w:val="28"/>
-        </w:rPr>
-        <w:t>pages</w:t>
-      </w:r>
-      <w:r>
-        <w:rPr>
-          <w:rFonts w:asciiTheme="majorHAnsi" w:hAnsiTheme="majorHAnsi" w:cstheme="majorHAnsi"/>
-          <w:sz w:val="28"/>
-          <w:szCs w:val="28"/>
-        </w:rPr>
-        <w:t xml:space="preserve">, while physical memory is divided into </w:t>
-      </w:r>
-      <w:r>
-        <w:rPr>
-          <w:rFonts w:asciiTheme="majorHAnsi" w:hAnsiTheme="majorHAnsi" w:cstheme="majorHAnsi"/>
-          <w:b/>
-          <w:bCs/>
-          <w:sz w:val="28"/>
-          <w:szCs w:val="28"/>
-        </w:rPr>
-        <w:t>frames</w:t>
-      </w:r>
-      <w:r>
-        <w:rPr>
-          <w:rFonts w:asciiTheme="majorHAnsi" w:hAnsiTheme="majorHAnsi" w:cstheme="majorHAnsi"/>
-          <w:sz w:val="28"/>
-          <w:szCs w:val="28"/>
-        </w:rPr>
-        <w:t xml:space="preserve">. The mapping between them is maintained using a </w:t>
-      </w:r>
-      <w:r>
-        <w:rPr>
-          <w:rFonts w:asciiTheme="majorHAnsi" w:hAnsiTheme="majorHAnsi" w:cstheme="majorHAnsi"/>
-          <w:b/>
-          <w:bCs/>
-          <w:sz w:val="28"/>
-          <w:szCs w:val="28"/>
-        </w:rPr>
-        <w:t>Page Table</w:t>
-      </w:r>
-      <w:r>
-        <w:rPr>
-          <w:rFonts w:asciiTheme="majorHAnsi" w:hAnsiTheme="majorHAnsi" w:cstheme="majorHAnsi"/>
-          <w:sz w:val="28"/>
-          <w:szCs w:val="28"/>
-        </w:rPr>
-        <w:t>.</w:t>
-      </w:r>
-    </w:p>
-    <w:p>
-      <w:pPr>
-        <w:rPr>
-          <w:rFonts w:asciiTheme="majorHAnsi" w:hAnsiTheme="majorHAnsi" w:cstheme="majorHAnsi"/>
-          <w:i/>
-          <w:iCs/>
-          <w:sz w:val="28"/>
-          <w:szCs w:val="28"/>
-          <w:u w:val="single"/>
-        </w:rPr>
-      </w:pPr>
-      <w:r>
-        <w:rPr>
-          <w:rFonts w:asciiTheme="majorHAnsi" w:hAnsiTheme="majorHAnsi" w:cstheme="majorHAnsi"/>
-          <w:i/>
-          <w:iCs/>
-          <w:sz w:val="28"/>
-          <w:szCs w:val="28"/>
-          <w:u w:val="single"/>
-        </w:rPr>
-        <w:t>Virtual Memory</w:t>
-      </w:r>
-    </w:p>
-    <w:p>
-      <w:pPr>
-        <w:rPr>
-          <w:rFonts w:asciiTheme="majorHAnsi" w:hAnsiTheme="majorHAnsi" w:cstheme="majorHAnsi"/>
-          <w:sz w:val="28"/>
-          <w:szCs w:val="28"/>
-        </w:rPr>
-      </w:pPr>
-      <w:r>
-        <w:rPr>
-          <w:rFonts w:asciiTheme="majorHAnsi" w:hAnsiTheme="majorHAnsi" w:cstheme="majorHAnsi"/>
-          <w:sz w:val="28"/>
-          <w:szCs w:val="28"/>
-        </w:rPr>
-        <w:t xml:space="preserve">Virtual memory allows processes larger than the physical memory to execute by using </w:t>
-      </w:r>
-      <w:r>
-        <w:rPr>
-          <w:rFonts w:asciiTheme="majorHAnsi" w:hAnsiTheme="majorHAnsi" w:cstheme="majorHAnsi"/>
-          <w:b/>
-          <w:bCs/>
-          <w:sz w:val="28"/>
-          <w:szCs w:val="28"/>
-        </w:rPr>
-        <w:t>Demand Paging</w:t>
-      </w:r>
-      <w:r>
-        <w:rPr>
-          <w:rFonts w:asciiTheme="majorHAnsi" w:hAnsiTheme="majorHAnsi" w:cstheme="majorHAnsi"/>
-          <w:sz w:val="28"/>
-          <w:szCs w:val="28"/>
-        </w:rPr>
-        <w:t xml:space="preserve">. When a process accesses a page that is not currently in RAM, a </w:t>
-      </w:r>
-      <w:r>
-        <w:rPr>
-          <w:rFonts w:asciiTheme="majorHAnsi" w:hAnsiTheme="majorHAnsi" w:cstheme="majorHAnsi"/>
-          <w:b/>
-          <w:bCs/>
-          <w:sz w:val="28"/>
-          <w:szCs w:val="28"/>
-        </w:rPr>
-        <w:t>page fault</w:t>
-      </w:r>
-      <w:r>
-        <w:rPr>
-          <w:rFonts w:asciiTheme="majorHAnsi" w:hAnsiTheme="majorHAnsi" w:cstheme="majorHAnsi"/>
-          <w:sz w:val="28"/>
-          <w:szCs w:val="28"/>
-        </w:rPr>
-        <w:t xml:space="preserve"> occurs, triggering the page replacement process.</w:t>
-      </w:r>
-    </w:p>
-    <w:p>
-      <w:pPr>
-        <w:rPr>
-          <w:rFonts w:asciiTheme="majorHAnsi" w:hAnsiTheme="majorHAnsi" w:cstheme="majorHAnsi"/>
-          <w:i/>
-          <w:iCs/>
-          <w:sz w:val="28"/>
-          <w:szCs w:val="28"/>
-          <w:u w:val="single"/>
-        </w:rPr>
-      </w:pPr>
-      <w:r>
-        <w:rPr>
-          <w:rFonts w:asciiTheme="majorHAnsi" w:hAnsiTheme="majorHAnsi" w:cstheme="majorHAnsi"/>
-          <w:i/>
-          <w:iCs/>
-          <w:sz w:val="28"/>
-          <w:szCs w:val="28"/>
-          <w:u w:val="single"/>
-        </w:rPr>
-        <w:t>Thrashing</w:t>
-      </w:r>
-    </w:p>
-    <w:p>
-      <w:pPr>
-        <w:rPr>
-          <w:rFonts w:asciiTheme="majorHAnsi" w:hAnsiTheme="majorHAnsi" w:cstheme="majorHAnsi"/>
-          <w:sz w:val="28"/>
-          <w:szCs w:val="28"/>
-        </w:rPr>
-      </w:pPr>
-      <w:r>
-        <w:rPr>
-          <w:rFonts w:asciiTheme="majorHAnsi" w:hAnsiTheme="majorHAnsi" w:cstheme="majorHAnsi"/>
-          <w:sz w:val="28"/>
-          <w:szCs w:val="28"/>
-        </w:rPr>
-        <w:t>Thrashing occurs when the system spends more time swapping pages in and out of memory than executing actual instructions. This happens when a process does not have enough frames to maintain its working set.</w:t>
-      </w:r>
-    </w:p>
-    <w:p>
-      <w:pPr>
+      </w:pPr>
+      <w:r>
         <w:rPr>
           <w:rFonts w:asciiTheme="majorHAnsi" w:hAnsiTheme="majorHAnsi" w:cstheme="majorHAnsi"/>
           <w:b/>
@@ -5503,32 +5463,7 @@
           <w:sz w:val="28"/>
           <w:szCs w:val="28"/>
         </w:rPr>
-      </w:pPr>
-      <w:r>
-        <w:rPr>
-          <w:rFonts w:asciiTheme="majorHAnsi" w:hAnsiTheme="majorHAnsi" w:cstheme="majorHAnsi"/>
-          <w:b/>
-          <w:bCs/>
-          <w:i/>
-          <w:iCs/>
-          <w:color w:val="00B0F0"/>
-          <w:sz w:val="28"/>
-          <w:szCs w:val="28"/>
-        </w:rPr>
-        <w:t>13</w:t>
-      </w:r>
-      <w:r>
-        <w:rPr>
-          <w:rFonts w:asciiTheme="majorHAnsi" w:hAnsiTheme="majorHAnsi" w:cstheme="majorHAnsi"/>
-          <w:b/>
-          <w:bCs/>
-          <w:i/>
-          <w:iCs/>
-          <w:color w:val="00B0F0"/>
-          <w:sz w:val="28"/>
-          <w:szCs w:val="28"/>
-        </w:rPr>
-        <w:t>. File Systems and Storage</w:t>
+        <w:t>13. File Systems and Storage</w:t>
       </w:r>
     </w:p>
     <w:p>
@@ -5740,8 +5675,1776 @@
     </w:p>
     <w:p>
       <w:pPr>
-        <w:rPr>
-          <w:rFonts w:asciiTheme="majorHAnsi" w:hAnsiTheme="majorHAnsi" w:cstheme="majorHAnsi"/>
+        <w:jc w:val="center"/>
+        <w:rPr>
+          <w:rFonts w:asciiTheme="majorHAnsi" w:hAnsiTheme="majorHAnsi" w:cstheme="majorHAnsi"/>
+          <w:b/>
+          <w:bCs/>
+          <w:color w:val="EE0000"/>
+          <w:sz w:val="32"/>
+          <w:szCs w:val="32"/>
+        </w:rPr>
+      </w:pPr>
+      <w:r>
+        <w:rPr>
+          <w:rFonts w:asciiTheme="majorHAnsi" w:hAnsiTheme="majorHAnsi" w:cstheme="majorHAnsi"/>
+          <w:b/>
+          <w:bCs/>
+          <w:color w:val="EE0000"/>
+          <w:sz w:val="32"/>
+          <w:szCs w:val="32"/>
+        </w:rPr>
+        <w:t>QUIZZES</w:t>
+      </w:r>
+    </w:p>
+    <w:p>
+      <w:pPr>
+        <w:rPr>
+          <w:rFonts w:asciiTheme="majorHAnsi" w:hAnsiTheme="majorHAnsi" w:cstheme="majorHAnsi"/>
+          <w:b/>
+          <w:bCs/>
+          <w:i/>
+          <w:iCs/>
+          <w:color w:val="45B0E1" w:themeColor="accent1" w:themeTint="99"/>
+          <w:sz w:val="28"/>
+          <w:szCs w:val="28"/>
+        </w:rPr>
+      </w:pPr>
+      <w:r>
+        <w:rPr>
+          <w:rFonts w:asciiTheme="majorHAnsi" w:hAnsiTheme="majorHAnsi" w:cstheme="majorHAnsi"/>
+          <w:b/>
+          <w:bCs/>
+          <w:i/>
+          <w:iCs/>
+          <w:color w:val="45B0E1" w:themeColor="accent1" w:themeTint="99"/>
+          <w:sz w:val="28"/>
+          <w:szCs w:val="28"/>
+        </w:rPr>
+        <w:t>1. CPU Scheduling</w:t>
+      </w:r>
+    </w:p>
+    <w:p>
+      <w:pPr>
+        <w:rPr>
+          <w:rFonts w:asciiTheme="majorHAnsi" w:hAnsiTheme="majorHAnsi" w:cstheme="majorHAnsi"/>
+          <w:color w:val="000000" w:themeColor="text1"/>
+          <w:sz w:val="28"/>
+          <w:szCs w:val="28"/>
+        </w:rPr>
+      </w:pPr>
+      <w:r>
+        <w:rPr>
+          <w:rFonts w:asciiTheme="majorHAnsi" w:hAnsiTheme="majorHAnsi" w:cstheme="majorHAnsi"/>
+          <w:b/>
+          <w:bCs/>
+          <w:color w:val="000000" w:themeColor="text1"/>
+          <w:sz w:val="28"/>
+          <w:szCs w:val="28"/>
+        </w:rPr>
+        <w:t>1. What is the main goal of CPU scheduling?</w:t>
+      </w:r>
+    </w:p>
+    <w:p>
+      <w:pPr>
+        <w:rPr>
+          <w:rFonts w:asciiTheme="majorHAnsi" w:hAnsiTheme="majorHAnsi" w:cstheme="majorHAnsi"/>
+          <w:color w:val="000000" w:themeColor="text1"/>
+          <w:sz w:val="28"/>
+          <w:szCs w:val="28"/>
+        </w:rPr>
+      </w:pPr>
+      <w:r>
+        <w:rPr>
+          <w:rFonts w:asciiTheme="majorHAnsi" w:hAnsiTheme="majorHAnsi" w:cstheme="majorHAnsi"/>
+          <w:color w:val="000000" w:themeColor="text1"/>
+          <w:sz w:val="28"/>
+          <w:szCs w:val="28"/>
+        </w:rPr>
+        <w:t>A. Increase disk storage</w:t>
+      </w:r>
+      <w:r>
+        <w:rPr>
+          <w:rFonts w:asciiTheme="majorHAnsi" w:hAnsiTheme="majorHAnsi" w:cstheme="majorHAnsi"/>
+          <w:color w:val="000000" w:themeColor="text1"/>
+          <w:sz w:val="28"/>
+          <w:szCs w:val="28"/>
+        </w:rPr>
+        <w:br/>
+        <w:t>B. Improve system performance by selecting processes for CPU execution</w:t>
+      </w:r>
+      <w:r>
+        <w:rPr>
+          <w:rFonts w:asciiTheme="majorHAnsi" w:hAnsiTheme="majorHAnsi" w:cstheme="majorHAnsi"/>
+          <w:color w:val="000000" w:themeColor="text1"/>
+          <w:sz w:val="28"/>
+          <w:szCs w:val="28"/>
+        </w:rPr>
+        <w:br/>
+        <w:t>C. Reduce memory usage</w:t>
+      </w:r>
+      <w:r>
+        <w:rPr>
+          <w:rFonts w:asciiTheme="majorHAnsi" w:hAnsiTheme="majorHAnsi" w:cstheme="majorHAnsi"/>
+          <w:color w:val="000000" w:themeColor="text1"/>
+          <w:sz w:val="28"/>
+          <w:szCs w:val="28"/>
+        </w:rPr>
+        <w:br/>
+        <w:t>D. Manage input devices</w:t>
+      </w:r>
+    </w:p>
+    <w:p>
+      <w:pPr>
+        <w:rPr>
+          <w:rFonts w:asciiTheme="majorHAnsi" w:hAnsiTheme="majorHAnsi" w:cstheme="majorHAnsi"/>
+          <w:color w:val="000000" w:themeColor="text1"/>
+          <w:sz w:val="28"/>
+          <w:szCs w:val="28"/>
+        </w:rPr>
+      </w:pPr>
+      <w:r>
+        <w:rPr>
+          <w:rFonts w:asciiTheme="majorHAnsi" w:hAnsiTheme="majorHAnsi" w:cstheme="majorHAnsi"/>
+          <w:b/>
+          <w:bCs/>
+          <w:color w:val="000000" w:themeColor="text1"/>
+          <w:sz w:val="28"/>
+          <w:szCs w:val="28"/>
+        </w:rPr>
+        <w:t>Answer:</w:t>
+      </w:r>
+      <w:r>
+        <w:rPr>
+          <w:rFonts w:asciiTheme="majorHAnsi" w:hAnsiTheme="majorHAnsi" w:cstheme="majorHAnsi"/>
+          <w:color w:val="000000" w:themeColor="text1"/>
+          <w:sz w:val="28"/>
+          <w:szCs w:val="28"/>
+        </w:rPr>
+        <w:t xml:space="preserve"> B</w:t>
+      </w:r>
+    </w:p>
+    <w:p>
+      <w:pPr>
+        <w:rPr>
+          <w:rFonts w:asciiTheme="majorHAnsi" w:hAnsiTheme="majorHAnsi" w:cstheme="majorHAnsi"/>
+          <w:sz w:val="28"/>
+          <w:szCs w:val="28"/>
+        </w:rPr>
+      </w:pPr>
+      <w:r>
+        <w:rPr>
+          <w:rFonts w:asciiTheme="majorHAnsi" w:hAnsiTheme="majorHAnsi" w:cstheme="majorHAnsi"/>
+          <w:b/>
+          <w:bCs/>
+          <w:sz w:val="28"/>
+          <w:szCs w:val="28"/>
+        </w:rPr>
+        <w:t>2. Which metric measures how many processes finish in a given time?</w:t>
+      </w:r>
+    </w:p>
+    <w:p>
+      <w:pPr>
+        <w:rPr>
+          <w:rFonts w:asciiTheme="majorHAnsi" w:hAnsiTheme="majorHAnsi" w:cstheme="majorHAnsi"/>
+          <w:color w:val="000000" w:themeColor="text1"/>
+          <w:sz w:val="28"/>
+          <w:szCs w:val="28"/>
+        </w:rPr>
+      </w:pPr>
+      <w:r>
+        <w:rPr>
+          <w:rFonts w:asciiTheme="majorHAnsi" w:hAnsiTheme="majorHAnsi" w:cstheme="majorHAnsi"/>
+          <w:color w:val="000000" w:themeColor="text1"/>
+          <w:sz w:val="28"/>
+          <w:szCs w:val="28"/>
+        </w:rPr>
+        <w:t>A. Waiting time</w:t>
+      </w:r>
+      <w:r>
+        <w:rPr>
+          <w:rFonts w:asciiTheme="majorHAnsi" w:hAnsiTheme="majorHAnsi" w:cstheme="majorHAnsi"/>
+          <w:color w:val="000000" w:themeColor="text1"/>
+          <w:sz w:val="28"/>
+          <w:szCs w:val="28"/>
+        </w:rPr>
+        <w:br/>
+        <w:t>B. Throughput</w:t>
+      </w:r>
+      <w:r>
+        <w:rPr>
+          <w:rFonts w:asciiTheme="majorHAnsi" w:hAnsiTheme="majorHAnsi" w:cstheme="majorHAnsi"/>
+          <w:color w:val="000000" w:themeColor="text1"/>
+          <w:sz w:val="28"/>
+          <w:szCs w:val="28"/>
+        </w:rPr>
+        <w:br/>
+        <w:t>C. Response time</w:t>
+      </w:r>
+      <w:r>
+        <w:rPr>
+          <w:rFonts w:asciiTheme="majorHAnsi" w:hAnsiTheme="majorHAnsi" w:cstheme="majorHAnsi"/>
+          <w:color w:val="000000" w:themeColor="text1"/>
+          <w:sz w:val="28"/>
+          <w:szCs w:val="28"/>
+        </w:rPr>
+        <w:br/>
+        <w:t>D. CPU burst</w:t>
+      </w:r>
+    </w:p>
+    <w:p>
+      <w:pPr>
+        <w:rPr>
+          <w:rFonts w:asciiTheme="majorHAnsi" w:hAnsiTheme="majorHAnsi" w:cstheme="majorHAnsi"/>
+          <w:color w:val="000000" w:themeColor="text1"/>
+          <w:sz w:val="28"/>
+          <w:szCs w:val="28"/>
+        </w:rPr>
+      </w:pPr>
+      <w:r>
+        <w:rPr>
+          <w:rFonts w:asciiTheme="majorHAnsi" w:hAnsiTheme="majorHAnsi" w:cstheme="majorHAnsi"/>
+          <w:b/>
+          <w:bCs/>
+          <w:color w:val="000000" w:themeColor="text1"/>
+          <w:sz w:val="28"/>
+          <w:szCs w:val="28"/>
+        </w:rPr>
+        <w:t>Answer:</w:t>
+      </w:r>
+      <w:r>
+        <w:rPr>
+          <w:rFonts w:asciiTheme="majorHAnsi" w:hAnsiTheme="majorHAnsi" w:cstheme="majorHAnsi"/>
+          <w:color w:val="000000" w:themeColor="text1"/>
+          <w:sz w:val="28"/>
+          <w:szCs w:val="28"/>
+        </w:rPr>
+        <w:t xml:space="preserve"> B</w:t>
+      </w:r>
+    </w:p>
+    <w:p>
+      <w:pPr>
+        <w:rPr>
+          <w:rFonts w:asciiTheme="majorHAnsi" w:hAnsiTheme="majorHAnsi" w:cstheme="majorHAnsi"/>
+          <w:color w:val="000000" w:themeColor="text1"/>
+          <w:sz w:val="28"/>
+          <w:szCs w:val="28"/>
+        </w:rPr>
+      </w:pPr>
+      <w:r>
+        <w:rPr>
+          <w:rFonts w:asciiTheme="majorHAnsi" w:hAnsiTheme="majorHAnsi" w:cstheme="majorHAnsi"/>
+          <w:b/>
+          <w:bCs/>
+          <w:color w:val="000000" w:themeColor="text1"/>
+          <w:sz w:val="28"/>
+          <w:szCs w:val="28"/>
+        </w:rPr>
+        <w:t>3. In Round-Robin scheduling, each process receives:</w:t>
+      </w:r>
+    </w:p>
+    <w:p>
+      <w:pPr>
+        <w:rPr>
+          <w:rFonts w:asciiTheme="majorHAnsi" w:hAnsiTheme="majorHAnsi" w:cstheme="majorHAnsi"/>
+          <w:color w:val="000000" w:themeColor="text1"/>
+          <w:sz w:val="28"/>
+          <w:szCs w:val="28"/>
+        </w:rPr>
+      </w:pPr>
+      <w:r>
+        <w:rPr>
+          <w:rFonts w:asciiTheme="majorHAnsi" w:hAnsiTheme="majorHAnsi" w:cstheme="majorHAnsi"/>
+          <w:color w:val="000000" w:themeColor="text1"/>
+          <w:sz w:val="28"/>
+          <w:szCs w:val="28"/>
+        </w:rPr>
+        <w:t>A. Unlimited CPU time</w:t>
+      </w:r>
+      <w:r>
+        <w:rPr>
+          <w:rFonts w:asciiTheme="majorHAnsi" w:hAnsiTheme="majorHAnsi" w:cstheme="majorHAnsi"/>
+          <w:color w:val="000000" w:themeColor="text1"/>
+          <w:sz w:val="28"/>
+          <w:szCs w:val="28"/>
+        </w:rPr>
+        <w:br/>
+        <w:t>B. A fixed time slice</w:t>
+      </w:r>
+      <w:r>
+        <w:rPr>
+          <w:rFonts w:asciiTheme="majorHAnsi" w:hAnsiTheme="majorHAnsi" w:cstheme="majorHAnsi"/>
+          <w:color w:val="000000" w:themeColor="text1"/>
+          <w:sz w:val="28"/>
+          <w:szCs w:val="28"/>
+        </w:rPr>
+        <w:br/>
+        <w:t>C. Priority-based execution</w:t>
+      </w:r>
+      <w:r>
+        <w:rPr>
+          <w:rFonts w:asciiTheme="majorHAnsi" w:hAnsiTheme="majorHAnsi" w:cstheme="majorHAnsi"/>
+          <w:color w:val="000000" w:themeColor="text1"/>
+          <w:sz w:val="28"/>
+          <w:szCs w:val="28"/>
+        </w:rPr>
+        <w:br/>
+        <w:t>D. Memory allocation</w:t>
+      </w:r>
+    </w:p>
+    <w:p>
+      <w:pPr>
+        <w:rPr>
+          <w:rFonts w:asciiTheme="majorHAnsi" w:hAnsiTheme="majorHAnsi" w:cstheme="majorHAnsi"/>
+          <w:color w:val="000000" w:themeColor="text1"/>
+          <w:sz w:val="28"/>
+          <w:szCs w:val="28"/>
+        </w:rPr>
+      </w:pPr>
+      <w:r>
+        <w:rPr>
+          <w:rFonts w:asciiTheme="majorHAnsi" w:hAnsiTheme="majorHAnsi" w:cstheme="majorHAnsi"/>
+          <w:b/>
+          <w:bCs/>
+          <w:color w:val="000000" w:themeColor="text1"/>
+          <w:sz w:val="28"/>
+          <w:szCs w:val="28"/>
+        </w:rPr>
+        <w:t>Answer:</w:t>
+      </w:r>
+      <w:r>
+        <w:rPr>
+          <w:rFonts w:asciiTheme="majorHAnsi" w:hAnsiTheme="majorHAnsi" w:cstheme="majorHAnsi"/>
+          <w:color w:val="000000" w:themeColor="text1"/>
+          <w:sz w:val="28"/>
+          <w:szCs w:val="28"/>
+        </w:rPr>
+        <w:t xml:space="preserve"> B</w:t>
+      </w:r>
+    </w:p>
+    <w:p>
+      <w:pPr>
+        <w:rPr>
+          <w:rFonts w:asciiTheme="majorHAnsi" w:hAnsiTheme="majorHAnsi" w:cstheme="majorHAnsi"/>
+          <w:color w:val="000000" w:themeColor="text1"/>
+          <w:sz w:val="28"/>
+          <w:szCs w:val="28"/>
+        </w:rPr>
+      </w:pPr>
+      <w:r>
+        <w:rPr>
+          <w:rFonts w:asciiTheme="majorHAnsi" w:hAnsiTheme="majorHAnsi" w:cstheme="majorHAnsi"/>
+          <w:b/>
+          <w:bCs/>
+          <w:color w:val="000000" w:themeColor="text1"/>
+          <w:sz w:val="28"/>
+          <w:szCs w:val="28"/>
+        </w:rPr>
+        <w:t>4. Which scheduling type allows the OS to interrupt a running process?</w:t>
+      </w:r>
+    </w:p>
+    <w:p>
+      <w:pPr>
+        <w:rPr>
+          <w:rFonts w:asciiTheme="majorHAnsi" w:hAnsiTheme="majorHAnsi" w:cstheme="majorHAnsi"/>
+          <w:color w:val="000000" w:themeColor="text1"/>
+          <w:sz w:val="28"/>
+          <w:szCs w:val="28"/>
+        </w:rPr>
+      </w:pPr>
+      <w:r>
+        <w:rPr>
+          <w:rFonts w:asciiTheme="majorHAnsi" w:hAnsiTheme="majorHAnsi" w:cstheme="majorHAnsi"/>
+          <w:color w:val="000000" w:themeColor="text1"/>
+          <w:sz w:val="28"/>
+          <w:szCs w:val="28"/>
+        </w:rPr>
+        <w:t>A. Non-preemptive scheduling</w:t>
+      </w:r>
+      <w:r>
+        <w:rPr>
+          <w:rFonts w:asciiTheme="majorHAnsi" w:hAnsiTheme="majorHAnsi" w:cstheme="majorHAnsi"/>
+          <w:color w:val="000000" w:themeColor="text1"/>
+          <w:sz w:val="28"/>
+          <w:szCs w:val="28"/>
+        </w:rPr>
+        <w:br/>
+        <w:t>B. Preemptive scheduling</w:t>
+      </w:r>
+      <w:r>
+        <w:rPr>
+          <w:rFonts w:asciiTheme="majorHAnsi" w:hAnsiTheme="majorHAnsi" w:cstheme="majorHAnsi"/>
+          <w:color w:val="000000" w:themeColor="text1"/>
+          <w:sz w:val="28"/>
+          <w:szCs w:val="28"/>
+        </w:rPr>
+        <w:br/>
+        <w:t>C. Batch scheduling</w:t>
+      </w:r>
+      <w:r>
+        <w:rPr>
+          <w:rFonts w:asciiTheme="majorHAnsi" w:hAnsiTheme="majorHAnsi" w:cstheme="majorHAnsi"/>
+          <w:color w:val="000000" w:themeColor="text1"/>
+          <w:sz w:val="28"/>
+          <w:szCs w:val="28"/>
+        </w:rPr>
+        <w:br/>
+        <w:t>D. FIFO scheduling</w:t>
+      </w:r>
+    </w:p>
+    <w:p>
+      <w:pPr>
+        <w:rPr>
+          <w:rFonts w:asciiTheme="majorHAnsi" w:hAnsiTheme="majorHAnsi" w:cstheme="majorHAnsi"/>
+          <w:color w:val="000000" w:themeColor="text1"/>
+          <w:sz w:val="28"/>
+          <w:szCs w:val="28"/>
+        </w:rPr>
+      </w:pPr>
+      <w:r>
+        <w:rPr>
+          <w:rFonts w:asciiTheme="majorHAnsi" w:hAnsiTheme="majorHAnsi" w:cstheme="majorHAnsi"/>
+          <w:b/>
+          <w:bCs/>
+          <w:color w:val="000000" w:themeColor="text1"/>
+          <w:sz w:val="28"/>
+          <w:szCs w:val="28"/>
+        </w:rPr>
+        <w:t>Answer:</w:t>
+      </w:r>
+      <w:r>
+        <w:rPr>
+          <w:rFonts w:asciiTheme="majorHAnsi" w:hAnsiTheme="majorHAnsi" w:cstheme="majorHAnsi"/>
+          <w:color w:val="000000" w:themeColor="text1"/>
+          <w:sz w:val="28"/>
+          <w:szCs w:val="28"/>
+        </w:rPr>
+        <w:t xml:space="preserve"> B</w:t>
+      </w:r>
+    </w:p>
+    <w:p>
+      <w:pPr>
+        <w:rPr>
+          <w:rFonts w:asciiTheme="majorHAnsi" w:hAnsiTheme="majorHAnsi" w:cstheme="majorHAnsi"/>
+          <w:b/>
+          <w:bCs/>
+          <w:i/>
+          <w:iCs/>
+          <w:color w:val="000000" w:themeColor="text1"/>
+          <w:sz w:val="28"/>
+          <w:szCs w:val="28"/>
+        </w:rPr>
+      </w:pPr>
+      <w:r>
+        <w:rPr>
+          <w:rFonts w:asciiTheme="majorHAnsi" w:hAnsiTheme="majorHAnsi" w:cstheme="majorHAnsi"/>
+          <w:b/>
+          <w:bCs/>
+          <w:i/>
+          <w:iCs/>
+          <w:color w:val="00B0F0"/>
+          <w:sz w:val="28"/>
+          <w:szCs w:val="28"/>
+        </w:rPr>
+        <w:t>2. Process Synchronization</w:t>
+      </w:r>
+    </w:p>
+    <w:p>
+      <w:pPr>
+        <w:rPr>
+          <w:rFonts w:asciiTheme="majorHAnsi" w:hAnsiTheme="majorHAnsi" w:cstheme="majorHAnsi"/>
+          <w:color w:val="000000" w:themeColor="text1"/>
+          <w:sz w:val="28"/>
+          <w:szCs w:val="28"/>
+        </w:rPr>
+      </w:pPr>
+      <w:r>
+        <w:rPr>
+          <w:rFonts w:asciiTheme="majorHAnsi" w:hAnsiTheme="majorHAnsi" w:cstheme="majorHAnsi"/>
+          <w:b/>
+          <w:bCs/>
+          <w:color w:val="000000" w:themeColor="text1"/>
+          <w:sz w:val="28"/>
+          <w:szCs w:val="28"/>
+        </w:rPr>
+        <w:t>5. What is a race condition?</w:t>
+      </w:r>
+    </w:p>
+    <w:p>
+      <w:pPr>
+        <w:rPr>
+          <w:rFonts w:asciiTheme="majorHAnsi" w:hAnsiTheme="majorHAnsi" w:cstheme="majorHAnsi"/>
+          <w:color w:val="000000" w:themeColor="text1"/>
+          <w:sz w:val="28"/>
+          <w:szCs w:val="28"/>
+        </w:rPr>
+      </w:pPr>
+      <w:r>
+        <w:rPr>
+          <w:rFonts w:asciiTheme="majorHAnsi" w:hAnsiTheme="majorHAnsi" w:cstheme="majorHAnsi"/>
+          <w:color w:val="000000" w:themeColor="text1"/>
+          <w:sz w:val="28"/>
+          <w:szCs w:val="28"/>
+        </w:rPr>
+        <w:t>A. Processes running too fast</w:t>
+      </w:r>
+      <w:r>
+        <w:rPr>
+          <w:rFonts w:asciiTheme="majorHAnsi" w:hAnsiTheme="majorHAnsi" w:cstheme="majorHAnsi"/>
+          <w:color w:val="000000" w:themeColor="text1"/>
+          <w:sz w:val="28"/>
+          <w:szCs w:val="28"/>
+        </w:rPr>
+        <w:br/>
+        <w:t>B. Multiple processes accessing shared data simultaneously causing incorrect results</w:t>
+      </w:r>
+      <w:r>
+        <w:rPr>
+          <w:rFonts w:asciiTheme="majorHAnsi" w:hAnsiTheme="majorHAnsi" w:cstheme="majorHAnsi"/>
+          <w:color w:val="000000" w:themeColor="text1"/>
+          <w:sz w:val="28"/>
+          <w:szCs w:val="28"/>
+        </w:rPr>
+        <w:br/>
+        <w:t>C. CPU overheating</w:t>
+      </w:r>
+      <w:r>
+        <w:rPr>
+          <w:rFonts w:asciiTheme="majorHAnsi" w:hAnsiTheme="majorHAnsi" w:cstheme="majorHAnsi"/>
+          <w:color w:val="000000" w:themeColor="text1"/>
+          <w:sz w:val="28"/>
+          <w:szCs w:val="28"/>
+        </w:rPr>
+        <w:br/>
+        <w:t>D. Disk failure</w:t>
+      </w:r>
+    </w:p>
+    <w:p>
+      <w:pPr>
+        <w:rPr>
+          <w:rFonts w:asciiTheme="majorHAnsi" w:hAnsiTheme="majorHAnsi" w:cstheme="majorHAnsi"/>
+          <w:color w:val="000000" w:themeColor="text1"/>
+          <w:sz w:val="28"/>
+          <w:szCs w:val="28"/>
+        </w:rPr>
+      </w:pPr>
+      <w:r>
+        <w:rPr>
+          <w:rFonts w:asciiTheme="majorHAnsi" w:hAnsiTheme="majorHAnsi" w:cstheme="majorHAnsi"/>
+          <w:b/>
+          <w:bCs/>
+          <w:color w:val="000000" w:themeColor="text1"/>
+          <w:sz w:val="28"/>
+          <w:szCs w:val="28"/>
+        </w:rPr>
+        <w:t>Answer:</w:t>
+      </w:r>
+      <w:r>
+        <w:rPr>
+          <w:rFonts w:asciiTheme="majorHAnsi" w:hAnsiTheme="majorHAnsi" w:cstheme="majorHAnsi"/>
+          <w:color w:val="000000" w:themeColor="text1"/>
+          <w:sz w:val="28"/>
+          <w:szCs w:val="28"/>
+        </w:rPr>
+        <w:t xml:space="preserve"> B</w:t>
+      </w:r>
+    </w:p>
+    <w:p>
+      <w:pPr>
+        <w:rPr>
+          <w:rFonts w:asciiTheme="majorHAnsi" w:hAnsiTheme="majorHAnsi" w:cstheme="majorHAnsi"/>
+          <w:color w:val="000000" w:themeColor="text1"/>
+          <w:sz w:val="28"/>
+          <w:szCs w:val="28"/>
+        </w:rPr>
+      </w:pPr>
+      <w:r>
+        <w:rPr>
+          <w:rFonts w:asciiTheme="majorHAnsi" w:hAnsiTheme="majorHAnsi" w:cstheme="majorHAnsi"/>
+          <w:b/>
+          <w:bCs/>
+          <w:color w:val="000000" w:themeColor="text1"/>
+          <w:sz w:val="28"/>
+          <w:szCs w:val="28"/>
+        </w:rPr>
+        <w:t>6. What is a critical section?</w:t>
+      </w:r>
+    </w:p>
+    <w:p>
+      <w:pPr>
+        <w:rPr>
+          <w:rFonts w:asciiTheme="majorHAnsi" w:hAnsiTheme="majorHAnsi" w:cstheme="majorHAnsi"/>
+          <w:color w:val="000000" w:themeColor="text1"/>
+          <w:sz w:val="28"/>
+          <w:szCs w:val="28"/>
+        </w:rPr>
+      </w:pPr>
+      <w:r>
+        <w:rPr>
+          <w:rFonts w:asciiTheme="majorHAnsi" w:hAnsiTheme="majorHAnsi" w:cstheme="majorHAnsi"/>
+          <w:color w:val="000000" w:themeColor="text1"/>
+          <w:sz w:val="28"/>
+          <w:szCs w:val="28"/>
+        </w:rPr>
+        <w:t>A. A part of memory used for files</w:t>
+      </w:r>
+      <w:r>
+        <w:rPr>
+          <w:rFonts w:asciiTheme="majorHAnsi" w:hAnsiTheme="majorHAnsi" w:cstheme="majorHAnsi"/>
+          <w:color w:val="000000" w:themeColor="text1"/>
+          <w:sz w:val="28"/>
+          <w:szCs w:val="28"/>
+        </w:rPr>
+        <w:br/>
+        <w:t>B. A part of a program where shared data is accessed</w:t>
+      </w:r>
+      <w:r>
+        <w:rPr>
+          <w:rFonts w:asciiTheme="majorHAnsi" w:hAnsiTheme="majorHAnsi" w:cstheme="majorHAnsi"/>
+          <w:color w:val="000000" w:themeColor="text1"/>
+          <w:sz w:val="28"/>
+          <w:szCs w:val="28"/>
+        </w:rPr>
+        <w:br/>
+      </w:r>
+      <w:r>
+        <w:rPr>
+          <w:rFonts w:asciiTheme="majorHAnsi" w:hAnsiTheme="majorHAnsi" w:cstheme="majorHAnsi"/>
+          <w:color w:val="000000" w:themeColor="text1"/>
+          <w:sz w:val="28"/>
+          <w:szCs w:val="28"/>
+        </w:rPr>
+        <w:lastRenderedPageBreak/>
+        <w:t>C. CPU cache area</w:t>
+      </w:r>
+      <w:r>
+        <w:rPr>
+          <w:rFonts w:asciiTheme="majorHAnsi" w:hAnsiTheme="majorHAnsi" w:cstheme="majorHAnsi"/>
+          <w:color w:val="000000" w:themeColor="text1"/>
+          <w:sz w:val="28"/>
+          <w:szCs w:val="28"/>
+        </w:rPr>
+        <w:br/>
+        <w:t>D. Disk storage space</w:t>
+      </w:r>
+    </w:p>
+    <w:p>
+      <w:pPr>
+        <w:rPr>
+          <w:rFonts w:asciiTheme="majorHAnsi" w:hAnsiTheme="majorHAnsi" w:cstheme="majorHAnsi"/>
+          <w:color w:val="000000" w:themeColor="text1"/>
+          <w:sz w:val="28"/>
+          <w:szCs w:val="28"/>
+        </w:rPr>
+      </w:pPr>
+      <w:r>
+        <w:rPr>
+          <w:rFonts w:asciiTheme="majorHAnsi" w:hAnsiTheme="majorHAnsi" w:cstheme="majorHAnsi"/>
+          <w:b/>
+          <w:bCs/>
+          <w:color w:val="000000" w:themeColor="text1"/>
+          <w:sz w:val="28"/>
+          <w:szCs w:val="28"/>
+        </w:rPr>
+        <w:t>Answer:</w:t>
+      </w:r>
+      <w:r>
+        <w:rPr>
+          <w:rFonts w:asciiTheme="majorHAnsi" w:hAnsiTheme="majorHAnsi" w:cstheme="majorHAnsi"/>
+          <w:color w:val="000000" w:themeColor="text1"/>
+          <w:sz w:val="28"/>
+          <w:szCs w:val="28"/>
+        </w:rPr>
+        <w:t xml:space="preserve"> B</w:t>
+      </w:r>
+    </w:p>
+    <w:p>
+      <w:pPr>
+        <w:rPr>
+          <w:rFonts w:asciiTheme="majorHAnsi" w:hAnsiTheme="majorHAnsi" w:cstheme="majorHAnsi"/>
+          <w:color w:val="000000" w:themeColor="text1"/>
+          <w:sz w:val="28"/>
+          <w:szCs w:val="28"/>
+        </w:rPr>
+      </w:pPr>
+      <w:r>
+        <w:rPr>
+          <w:rFonts w:asciiTheme="majorHAnsi" w:hAnsiTheme="majorHAnsi" w:cstheme="majorHAnsi"/>
+          <w:b/>
+          <w:bCs/>
+          <w:color w:val="000000" w:themeColor="text1"/>
+          <w:sz w:val="28"/>
+          <w:szCs w:val="28"/>
+        </w:rPr>
+        <w:t>7. Which tool is used to control access to shared resources?</w:t>
+      </w:r>
+    </w:p>
+    <w:p>
+      <w:pPr>
+        <w:rPr>
+          <w:rFonts w:asciiTheme="majorHAnsi" w:hAnsiTheme="majorHAnsi" w:cstheme="majorHAnsi"/>
+          <w:color w:val="000000" w:themeColor="text1"/>
+          <w:sz w:val="28"/>
+          <w:szCs w:val="28"/>
+        </w:rPr>
+      </w:pPr>
+      <w:r>
+        <w:rPr>
+          <w:rFonts w:asciiTheme="majorHAnsi" w:hAnsiTheme="majorHAnsi" w:cstheme="majorHAnsi"/>
+          <w:color w:val="000000" w:themeColor="text1"/>
+          <w:sz w:val="28"/>
+          <w:szCs w:val="28"/>
+        </w:rPr>
+        <w:t>A. Compiler</w:t>
+      </w:r>
+      <w:r>
+        <w:rPr>
+          <w:rFonts w:asciiTheme="majorHAnsi" w:hAnsiTheme="majorHAnsi" w:cstheme="majorHAnsi"/>
+          <w:color w:val="000000" w:themeColor="text1"/>
+          <w:sz w:val="28"/>
+          <w:szCs w:val="28"/>
+        </w:rPr>
+        <w:br/>
+        <w:t>B. Semaphore</w:t>
+      </w:r>
+      <w:r>
+        <w:rPr>
+          <w:rFonts w:asciiTheme="majorHAnsi" w:hAnsiTheme="majorHAnsi" w:cstheme="majorHAnsi"/>
+          <w:color w:val="000000" w:themeColor="text1"/>
+          <w:sz w:val="28"/>
+          <w:szCs w:val="28"/>
+        </w:rPr>
+        <w:br/>
+        <w:t>C. Scheduler</w:t>
+      </w:r>
+      <w:r>
+        <w:rPr>
+          <w:rFonts w:asciiTheme="majorHAnsi" w:hAnsiTheme="majorHAnsi" w:cstheme="majorHAnsi"/>
+          <w:color w:val="000000" w:themeColor="text1"/>
+          <w:sz w:val="28"/>
+          <w:szCs w:val="28"/>
+        </w:rPr>
+        <w:br/>
+        <w:t>D. Loader</w:t>
+      </w:r>
+    </w:p>
+    <w:p>
+      <w:pPr>
+        <w:rPr>
+          <w:rFonts w:asciiTheme="majorHAnsi" w:hAnsiTheme="majorHAnsi" w:cstheme="majorHAnsi"/>
+          <w:color w:val="000000" w:themeColor="text1"/>
+          <w:sz w:val="28"/>
+          <w:szCs w:val="28"/>
+        </w:rPr>
+      </w:pPr>
+      <w:r>
+        <w:rPr>
+          <w:rFonts w:asciiTheme="majorHAnsi" w:hAnsiTheme="majorHAnsi" w:cstheme="majorHAnsi"/>
+          <w:b/>
+          <w:bCs/>
+          <w:color w:val="000000" w:themeColor="text1"/>
+          <w:sz w:val="28"/>
+          <w:szCs w:val="28"/>
+        </w:rPr>
+        <w:t>Answer:</w:t>
+      </w:r>
+      <w:r>
+        <w:rPr>
+          <w:rFonts w:asciiTheme="majorHAnsi" w:hAnsiTheme="majorHAnsi" w:cstheme="majorHAnsi"/>
+          <w:color w:val="000000" w:themeColor="text1"/>
+          <w:sz w:val="28"/>
+          <w:szCs w:val="28"/>
+        </w:rPr>
+        <w:t xml:space="preserve"> B</w:t>
+      </w:r>
+    </w:p>
+    <w:p>
+      <w:pPr>
+        <w:rPr>
+          <w:rFonts w:asciiTheme="majorHAnsi" w:hAnsiTheme="majorHAnsi" w:cstheme="majorHAnsi"/>
+          <w:b/>
+          <w:bCs/>
+          <w:i/>
+          <w:iCs/>
+          <w:color w:val="00B0F0"/>
+          <w:sz w:val="28"/>
+          <w:szCs w:val="28"/>
+        </w:rPr>
+      </w:pPr>
+      <w:r>
+        <w:rPr>
+          <w:rFonts w:asciiTheme="majorHAnsi" w:hAnsiTheme="majorHAnsi" w:cstheme="majorHAnsi"/>
+          <w:b/>
+          <w:bCs/>
+          <w:i/>
+          <w:iCs/>
+          <w:color w:val="00B0F0"/>
+          <w:sz w:val="28"/>
+          <w:szCs w:val="28"/>
+        </w:rPr>
+        <w:t>3. Deadlocks</w:t>
+      </w:r>
+    </w:p>
+    <w:p>
+      <w:pPr>
+        <w:rPr>
+          <w:rFonts w:asciiTheme="majorHAnsi" w:hAnsiTheme="majorHAnsi" w:cstheme="majorHAnsi"/>
+          <w:color w:val="000000" w:themeColor="text1"/>
+          <w:sz w:val="28"/>
+          <w:szCs w:val="28"/>
+        </w:rPr>
+      </w:pPr>
+      <w:r>
+        <w:rPr>
+          <w:rFonts w:asciiTheme="majorHAnsi" w:hAnsiTheme="majorHAnsi" w:cstheme="majorHAnsi"/>
+          <w:b/>
+          <w:bCs/>
+          <w:color w:val="000000" w:themeColor="text1"/>
+          <w:sz w:val="28"/>
+          <w:szCs w:val="28"/>
+        </w:rPr>
+        <w:t>8. What is a deadlock?</w:t>
+      </w:r>
+    </w:p>
+    <w:p>
+      <w:pPr>
+        <w:rPr>
+          <w:rFonts w:asciiTheme="majorHAnsi" w:hAnsiTheme="majorHAnsi" w:cstheme="majorHAnsi"/>
+          <w:color w:val="000000" w:themeColor="text1"/>
+          <w:sz w:val="28"/>
+          <w:szCs w:val="28"/>
+        </w:rPr>
+      </w:pPr>
+      <w:r>
+        <w:rPr>
+          <w:rFonts w:asciiTheme="majorHAnsi" w:hAnsiTheme="majorHAnsi" w:cstheme="majorHAnsi"/>
+          <w:color w:val="000000" w:themeColor="text1"/>
+          <w:sz w:val="28"/>
+          <w:szCs w:val="28"/>
+        </w:rPr>
+        <w:t>A. A process running too slowly</w:t>
+      </w:r>
+      <w:r>
+        <w:rPr>
+          <w:rFonts w:asciiTheme="majorHAnsi" w:hAnsiTheme="majorHAnsi" w:cstheme="majorHAnsi"/>
+          <w:color w:val="000000" w:themeColor="text1"/>
+          <w:sz w:val="28"/>
+          <w:szCs w:val="28"/>
+        </w:rPr>
+        <w:br/>
+        <w:t>B. Processes waiting forever for resources held by each other</w:t>
+      </w:r>
+      <w:r>
+        <w:rPr>
+          <w:rFonts w:asciiTheme="majorHAnsi" w:hAnsiTheme="majorHAnsi" w:cstheme="majorHAnsi"/>
+          <w:color w:val="000000" w:themeColor="text1"/>
+          <w:sz w:val="28"/>
+          <w:szCs w:val="28"/>
+        </w:rPr>
+        <w:br/>
+        <w:t>C. CPU failure</w:t>
+      </w:r>
+      <w:r>
+        <w:rPr>
+          <w:rFonts w:asciiTheme="majorHAnsi" w:hAnsiTheme="majorHAnsi" w:cstheme="majorHAnsi"/>
+          <w:color w:val="000000" w:themeColor="text1"/>
+          <w:sz w:val="28"/>
+          <w:szCs w:val="28"/>
+        </w:rPr>
+        <w:br/>
+        <w:t>D. Memory leak</w:t>
+      </w:r>
+    </w:p>
+    <w:p>
+      <w:pPr>
+        <w:rPr>
+          <w:rFonts w:asciiTheme="majorHAnsi" w:hAnsiTheme="majorHAnsi" w:cstheme="majorHAnsi"/>
+          <w:color w:val="000000" w:themeColor="text1"/>
+          <w:sz w:val="28"/>
+          <w:szCs w:val="28"/>
+        </w:rPr>
+      </w:pPr>
+      <w:r>
+        <w:rPr>
+          <w:rFonts w:asciiTheme="majorHAnsi" w:hAnsiTheme="majorHAnsi" w:cstheme="majorHAnsi"/>
+          <w:b/>
+          <w:bCs/>
+          <w:color w:val="000000" w:themeColor="text1"/>
+          <w:sz w:val="28"/>
+          <w:szCs w:val="28"/>
+        </w:rPr>
+        <w:t>Answer:</w:t>
+      </w:r>
+      <w:r>
+        <w:rPr>
+          <w:rFonts w:asciiTheme="majorHAnsi" w:hAnsiTheme="majorHAnsi" w:cstheme="majorHAnsi"/>
+          <w:color w:val="000000" w:themeColor="text1"/>
+          <w:sz w:val="28"/>
+          <w:szCs w:val="28"/>
+        </w:rPr>
+        <w:t xml:space="preserve"> B</w:t>
+      </w:r>
+    </w:p>
+    <w:p>
+      <w:pPr>
+        <w:rPr>
+          <w:rFonts w:asciiTheme="majorHAnsi" w:hAnsiTheme="majorHAnsi" w:cstheme="majorHAnsi"/>
+          <w:color w:val="000000" w:themeColor="text1"/>
+          <w:sz w:val="28"/>
+          <w:szCs w:val="28"/>
+        </w:rPr>
+      </w:pPr>
+      <w:r>
+        <w:rPr>
+          <w:rFonts w:asciiTheme="majorHAnsi" w:hAnsiTheme="majorHAnsi" w:cstheme="majorHAnsi"/>
+          <w:b/>
+          <w:bCs/>
+          <w:color w:val="000000" w:themeColor="text1"/>
+          <w:sz w:val="28"/>
+          <w:szCs w:val="28"/>
+        </w:rPr>
+        <w:t>9. Which condition is required for a deadlock to occur?</w:t>
+      </w:r>
+    </w:p>
+    <w:p>
+      <w:pPr>
+        <w:rPr>
+          <w:rFonts w:asciiTheme="majorHAnsi" w:hAnsiTheme="majorHAnsi" w:cstheme="majorHAnsi"/>
+          <w:color w:val="000000" w:themeColor="text1"/>
+          <w:sz w:val="28"/>
+          <w:szCs w:val="28"/>
+        </w:rPr>
+      </w:pPr>
+      <w:r>
+        <w:rPr>
+          <w:rFonts w:asciiTheme="majorHAnsi" w:hAnsiTheme="majorHAnsi" w:cstheme="majorHAnsi"/>
+          <w:color w:val="000000" w:themeColor="text1"/>
+          <w:sz w:val="28"/>
+          <w:szCs w:val="28"/>
+        </w:rPr>
+        <w:t>A. Resource sharing</w:t>
+      </w:r>
+      <w:r>
+        <w:rPr>
+          <w:rFonts w:asciiTheme="majorHAnsi" w:hAnsiTheme="majorHAnsi" w:cstheme="majorHAnsi"/>
+          <w:color w:val="000000" w:themeColor="text1"/>
+          <w:sz w:val="28"/>
+          <w:szCs w:val="28"/>
+        </w:rPr>
+        <w:br/>
+        <w:t>B. Circular wait</w:t>
+      </w:r>
+      <w:r>
+        <w:rPr>
+          <w:rFonts w:asciiTheme="majorHAnsi" w:hAnsiTheme="majorHAnsi" w:cstheme="majorHAnsi"/>
+          <w:color w:val="000000" w:themeColor="text1"/>
+          <w:sz w:val="28"/>
+          <w:szCs w:val="28"/>
+        </w:rPr>
+        <w:br/>
+        <w:t>C. Memory paging</w:t>
+      </w:r>
+      <w:r>
+        <w:rPr>
+          <w:rFonts w:asciiTheme="majorHAnsi" w:hAnsiTheme="majorHAnsi" w:cstheme="majorHAnsi"/>
+          <w:color w:val="000000" w:themeColor="text1"/>
+          <w:sz w:val="28"/>
+          <w:szCs w:val="28"/>
+        </w:rPr>
+        <w:br/>
+        <w:t>D. Virtual memory</w:t>
+      </w:r>
+    </w:p>
+    <w:p>
+      <w:pPr>
+        <w:rPr>
+          <w:rFonts w:asciiTheme="majorHAnsi" w:hAnsiTheme="majorHAnsi" w:cstheme="majorHAnsi"/>
+          <w:color w:val="000000" w:themeColor="text1"/>
+          <w:sz w:val="28"/>
+          <w:szCs w:val="28"/>
+        </w:rPr>
+      </w:pPr>
+      <w:r>
+        <w:rPr>
+          <w:rFonts w:asciiTheme="majorHAnsi" w:hAnsiTheme="majorHAnsi" w:cstheme="majorHAnsi"/>
+          <w:b/>
+          <w:bCs/>
+          <w:color w:val="000000" w:themeColor="text1"/>
+          <w:sz w:val="28"/>
+          <w:szCs w:val="28"/>
+        </w:rPr>
+        <w:t>Answer:</w:t>
+      </w:r>
+      <w:r>
+        <w:rPr>
+          <w:rFonts w:asciiTheme="majorHAnsi" w:hAnsiTheme="majorHAnsi" w:cstheme="majorHAnsi"/>
+          <w:color w:val="000000" w:themeColor="text1"/>
+          <w:sz w:val="28"/>
+          <w:szCs w:val="28"/>
+        </w:rPr>
+        <w:t xml:space="preserve"> B</w:t>
+      </w:r>
+    </w:p>
+    <w:p>
+      <w:pPr>
+        <w:rPr>
+          <w:rFonts w:asciiTheme="majorHAnsi" w:hAnsiTheme="majorHAnsi" w:cstheme="majorHAnsi"/>
+          <w:color w:val="000000" w:themeColor="text1"/>
+          <w:sz w:val="28"/>
+          <w:szCs w:val="28"/>
+        </w:rPr>
+      </w:pPr>
+      <w:r>
+        <w:rPr>
+          <w:rFonts w:asciiTheme="majorHAnsi" w:hAnsiTheme="majorHAnsi" w:cstheme="majorHAnsi"/>
+          <w:b/>
+          <w:bCs/>
+          <w:color w:val="000000" w:themeColor="text1"/>
+          <w:sz w:val="28"/>
+          <w:szCs w:val="28"/>
+        </w:rPr>
+        <w:t>10. Which method can prevent deadlock?</w:t>
+      </w:r>
+    </w:p>
+    <w:p>
+      <w:pPr>
+        <w:rPr>
+          <w:rFonts w:asciiTheme="majorHAnsi" w:hAnsiTheme="majorHAnsi" w:cstheme="majorHAnsi"/>
+          <w:color w:val="000000" w:themeColor="text1"/>
+          <w:sz w:val="28"/>
+          <w:szCs w:val="28"/>
+        </w:rPr>
+      </w:pPr>
+      <w:r>
+        <w:rPr>
+          <w:rFonts w:asciiTheme="majorHAnsi" w:hAnsiTheme="majorHAnsi" w:cstheme="majorHAnsi"/>
+          <w:color w:val="000000" w:themeColor="text1"/>
+          <w:sz w:val="28"/>
+          <w:szCs w:val="28"/>
+        </w:rPr>
+        <w:t>A. Breaking one of the four necessary conditions</w:t>
+      </w:r>
+      <w:r>
+        <w:rPr>
+          <w:rFonts w:asciiTheme="majorHAnsi" w:hAnsiTheme="majorHAnsi" w:cstheme="majorHAnsi"/>
+          <w:color w:val="000000" w:themeColor="text1"/>
+          <w:sz w:val="28"/>
+          <w:szCs w:val="28"/>
+        </w:rPr>
+        <w:br/>
+        <w:t>B. Increasing CPU speed</w:t>
+      </w:r>
+      <w:r>
+        <w:rPr>
+          <w:rFonts w:asciiTheme="majorHAnsi" w:hAnsiTheme="majorHAnsi" w:cstheme="majorHAnsi"/>
+          <w:color w:val="000000" w:themeColor="text1"/>
+          <w:sz w:val="28"/>
+          <w:szCs w:val="28"/>
+        </w:rPr>
+        <w:br/>
+        <w:t>C. Deleting processes</w:t>
+      </w:r>
+      <w:r>
+        <w:rPr>
+          <w:rFonts w:asciiTheme="majorHAnsi" w:hAnsiTheme="majorHAnsi" w:cstheme="majorHAnsi"/>
+          <w:color w:val="000000" w:themeColor="text1"/>
+          <w:sz w:val="28"/>
+          <w:szCs w:val="28"/>
+        </w:rPr>
+        <w:br/>
+        <w:t>D. Restarting the system</w:t>
+      </w:r>
+    </w:p>
+    <w:p>
+      <w:pPr>
+        <w:rPr>
+          <w:rFonts w:asciiTheme="majorHAnsi" w:hAnsiTheme="majorHAnsi" w:cstheme="majorHAnsi"/>
+          <w:color w:val="000000" w:themeColor="text1"/>
+          <w:sz w:val="28"/>
+          <w:szCs w:val="28"/>
+        </w:rPr>
+      </w:pPr>
+      <w:r>
+        <w:rPr>
+          <w:rFonts w:asciiTheme="majorHAnsi" w:hAnsiTheme="majorHAnsi" w:cstheme="majorHAnsi"/>
+          <w:b/>
+          <w:bCs/>
+          <w:color w:val="000000" w:themeColor="text1"/>
+          <w:sz w:val="28"/>
+          <w:szCs w:val="28"/>
+        </w:rPr>
+        <w:t>Answer:</w:t>
+      </w:r>
+      <w:r>
+        <w:rPr>
+          <w:rFonts w:asciiTheme="majorHAnsi" w:hAnsiTheme="majorHAnsi" w:cstheme="majorHAnsi"/>
+          <w:color w:val="000000" w:themeColor="text1"/>
+          <w:sz w:val="28"/>
+          <w:szCs w:val="28"/>
+        </w:rPr>
+        <w:t xml:space="preserve"> A</w:t>
+      </w:r>
+    </w:p>
+    <w:p>
+      <w:pPr>
+        <w:rPr>
+          <w:rFonts w:asciiTheme="majorHAnsi" w:hAnsiTheme="majorHAnsi" w:cstheme="majorHAnsi"/>
+          <w:b/>
+          <w:bCs/>
+          <w:i/>
+          <w:iCs/>
+          <w:color w:val="00B0F0"/>
+          <w:sz w:val="28"/>
+          <w:szCs w:val="28"/>
+        </w:rPr>
+      </w:pPr>
+      <w:r>
+        <w:rPr>
+          <w:rFonts w:asciiTheme="majorHAnsi" w:hAnsiTheme="majorHAnsi" w:cstheme="majorHAnsi"/>
+          <w:b/>
+          <w:bCs/>
+          <w:i/>
+          <w:iCs/>
+          <w:color w:val="00B0F0"/>
+          <w:sz w:val="28"/>
+          <w:szCs w:val="28"/>
+        </w:rPr>
+        <w:t>4. Memory Management</w:t>
+      </w:r>
+    </w:p>
+    <w:p>
+      <w:pPr>
+        <w:rPr>
+          <w:rFonts w:asciiTheme="majorHAnsi" w:hAnsiTheme="majorHAnsi" w:cstheme="majorHAnsi"/>
+          <w:color w:val="000000" w:themeColor="text1"/>
+          <w:sz w:val="28"/>
+          <w:szCs w:val="28"/>
+        </w:rPr>
+      </w:pPr>
+      <w:r>
+        <w:rPr>
+          <w:rFonts w:asciiTheme="majorHAnsi" w:hAnsiTheme="majorHAnsi" w:cstheme="majorHAnsi"/>
+          <w:b/>
+          <w:bCs/>
+          <w:color w:val="000000" w:themeColor="text1"/>
+          <w:sz w:val="28"/>
+          <w:szCs w:val="28"/>
+        </w:rPr>
+        <w:t>11. What is paging?</w:t>
+      </w:r>
+    </w:p>
+    <w:p>
+      <w:pPr>
+        <w:rPr>
+          <w:rFonts w:asciiTheme="majorHAnsi" w:hAnsiTheme="majorHAnsi" w:cstheme="majorHAnsi"/>
+          <w:color w:val="000000" w:themeColor="text1"/>
+          <w:sz w:val="28"/>
+          <w:szCs w:val="28"/>
+        </w:rPr>
+      </w:pPr>
+      <w:r>
+        <w:rPr>
+          <w:rFonts w:asciiTheme="majorHAnsi" w:hAnsiTheme="majorHAnsi" w:cstheme="majorHAnsi"/>
+          <w:color w:val="000000" w:themeColor="text1"/>
+          <w:sz w:val="28"/>
+          <w:szCs w:val="28"/>
+        </w:rPr>
+        <w:t>A. A memory management technique dividing memory into pages and frames</w:t>
+      </w:r>
+      <w:r>
+        <w:rPr>
+          <w:rFonts w:asciiTheme="majorHAnsi" w:hAnsiTheme="majorHAnsi" w:cstheme="majorHAnsi"/>
+          <w:color w:val="000000" w:themeColor="text1"/>
+          <w:sz w:val="28"/>
+          <w:szCs w:val="28"/>
+        </w:rPr>
+        <w:br/>
+        <w:t>B. A CPU scheduling method</w:t>
+      </w:r>
+      <w:r>
+        <w:rPr>
+          <w:rFonts w:asciiTheme="majorHAnsi" w:hAnsiTheme="majorHAnsi" w:cstheme="majorHAnsi"/>
+          <w:color w:val="000000" w:themeColor="text1"/>
+          <w:sz w:val="28"/>
+          <w:szCs w:val="28"/>
+        </w:rPr>
+        <w:br/>
+        <w:t>C. A file system method</w:t>
+      </w:r>
+      <w:r>
+        <w:rPr>
+          <w:rFonts w:asciiTheme="majorHAnsi" w:hAnsiTheme="majorHAnsi" w:cstheme="majorHAnsi"/>
+          <w:color w:val="000000" w:themeColor="text1"/>
+          <w:sz w:val="28"/>
+          <w:szCs w:val="28"/>
+        </w:rPr>
+        <w:br/>
+        <w:t>D. A disk format process</w:t>
+      </w:r>
+    </w:p>
+    <w:p>
+      <w:pPr>
+        <w:rPr>
+          <w:rFonts w:asciiTheme="majorHAnsi" w:hAnsiTheme="majorHAnsi" w:cstheme="majorHAnsi"/>
+          <w:color w:val="000000" w:themeColor="text1"/>
+          <w:sz w:val="28"/>
+          <w:szCs w:val="28"/>
+        </w:rPr>
+      </w:pPr>
+      <w:r>
+        <w:rPr>
+          <w:rFonts w:asciiTheme="majorHAnsi" w:hAnsiTheme="majorHAnsi" w:cstheme="majorHAnsi"/>
+          <w:b/>
+          <w:bCs/>
+          <w:color w:val="000000" w:themeColor="text1"/>
+          <w:sz w:val="28"/>
+          <w:szCs w:val="28"/>
+        </w:rPr>
+        <w:t>Answer:</w:t>
+      </w:r>
+      <w:r>
+        <w:rPr>
+          <w:rFonts w:asciiTheme="majorHAnsi" w:hAnsiTheme="majorHAnsi" w:cstheme="majorHAnsi"/>
+          <w:color w:val="000000" w:themeColor="text1"/>
+          <w:sz w:val="28"/>
+          <w:szCs w:val="28"/>
+        </w:rPr>
+        <w:t xml:space="preserve"> A</w:t>
+      </w:r>
+    </w:p>
+    <w:p>
+      <w:pPr>
+        <w:rPr>
+          <w:rFonts w:asciiTheme="majorHAnsi" w:hAnsiTheme="majorHAnsi" w:cstheme="majorHAnsi"/>
+          <w:color w:val="000000" w:themeColor="text1"/>
+          <w:sz w:val="28"/>
+          <w:szCs w:val="28"/>
+        </w:rPr>
+      </w:pPr>
+      <w:r>
+        <w:rPr>
+          <w:rFonts w:asciiTheme="majorHAnsi" w:hAnsiTheme="majorHAnsi" w:cstheme="majorHAnsi"/>
+          <w:b/>
+          <w:bCs/>
+          <w:color w:val="000000" w:themeColor="text1"/>
+          <w:sz w:val="28"/>
+          <w:szCs w:val="28"/>
+        </w:rPr>
+        <w:t>12. What happens when a page is not in RAM?</w:t>
+      </w:r>
+    </w:p>
+    <w:p>
+      <w:pPr>
+        <w:rPr>
+          <w:rFonts w:asciiTheme="majorHAnsi" w:hAnsiTheme="majorHAnsi" w:cstheme="majorHAnsi"/>
+          <w:color w:val="000000" w:themeColor="text1"/>
+          <w:sz w:val="28"/>
+          <w:szCs w:val="28"/>
+        </w:rPr>
+      </w:pPr>
+      <w:r>
+        <w:rPr>
+          <w:rFonts w:asciiTheme="majorHAnsi" w:hAnsiTheme="majorHAnsi" w:cstheme="majorHAnsi"/>
+          <w:color w:val="000000" w:themeColor="text1"/>
+          <w:sz w:val="28"/>
+          <w:szCs w:val="28"/>
+        </w:rPr>
+        <w:t>A. System crash</w:t>
+      </w:r>
+      <w:r>
+        <w:rPr>
+          <w:rFonts w:asciiTheme="majorHAnsi" w:hAnsiTheme="majorHAnsi" w:cstheme="majorHAnsi"/>
+          <w:color w:val="000000" w:themeColor="text1"/>
+          <w:sz w:val="28"/>
+          <w:szCs w:val="28"/>
+        </w:rPr>
+        <w:br/>
+        <w:t>B. Page fault occurs</w:t>
+      </w:r>
+      <w:r>
+        <w:rPr>
+          <w:rFonts w:asciiTheme="majorHAnsi" w:hAnsiTheme="majorHAnsi" w:cstheme="majorHAnsi"/>
+          <w:color w:val="000000" w:themeColor="text1"/>
+          <w:sz w:val="28"/>
+          <w:szCs w:val="28"/>
+        </w:rPr>
+        <w:br/>
+        <w:t>C. CPU stops</w:t>
+      </w:r>
+      <w:r>
+        <w:rPr>
+          <w:rFonts w:asciiTheme="majorHAnsi" w:hAnsiTheme="majorHAnsi" w:cstheme="majorHAnsi"/>
+          <w:color w:val="000000" w:themeColor="text1"/>
+          <w:sz w:val="28"/>
+          <w:szCs w:val="28"/>
+        </w:rPr>
+        <w:br/>
+        <w:t>D. File deletion</w:t>
+      </w:r>
+    </w:p>
+    <w:p>
+      <w:pPr>
+        <w:rPr>
+          <w:rFonts w:asciiTheme="majorHAnsi" w:hAnsiTheme="majorHAnsi" w:cstheme="majorHAnsi"/>
+          <w:color w:val="000000" w:themeColor="text1"/>
+          <w:sz w:val="28"/>
+          <w:szCs w:val="28"/>
+        </w:rPr>
+      </w:pPr>
+      <w:r>
+        <w:rPr>
+          <w:rFonts w:asciiTheme="majorHAnsi" w:hAnsiTheme="majorHAnsi" w:cstheme="majorHAnsi"/>
+          <w:b/>
+          <w:bCs/>
+          <w:color w:val="000000" w:themeColor="text1"/>
+          <w:sz w:val="28"/>
+          <w:szCs w:val="28"/>
+        </w:rPr>
+        <w:t>Answer:</w:t>
+      </w:r>
+      <w:r>
+        <w:rPr>
+          <w:rFonts w:asciiTheme="majorHAnsi" w:hAnsiTheme="majorHAnsi" w:cstheme="majorHAnsi"/>
+          <w:color w:val="000000" w:themeColor="text1"/>
+          <w:sz w:val="28"/>
+          <w:szCs w:val="28"/>
+        </w:rPr>
+        <w:t xml:space="preserve"> B</w:t>
+      </w:r>
+    </w:p>
+    <w:p>
+      <w:pPr>
+        <w:rPr>
+          <w:rFonts w:asciiTheme="majorHAnsi" w:hAnsiTheme="majorHAnsi" w:cstheme="majorHAnsi"/>
+          <w:color w:val="000000" w:themeColor="text1"/>
+          <w:sz w:val="28"/>
+          <w:szCs w:val="28"/>
+        </w:rPr>
+      </w:pPr>
+      <w:r>
+        <w:rPr>
+          <w:rFonts w:asciiTheme="majorHAnsi" w:hAnsiTheme="majorHAnsi" w:cstheme="majorHAnsi"/>
+          <w:b/>
+          <w:bCs/>
+          <w:color w:val="000000" w:themeColor="text1"/>
+          <w:sz w:val="28"/>
+          <w:szCs w:val="28"/>
+        </w:rPr>
+        <w:t>13. What is virtual memory used for?</w:t>
+      </w:r>
+    </w:p>
+    <w:p>
+      <w:pPr>
+        <w:rPr>
+          <w:rFonts w:asciiTheme="majorHAnsi" w:hAnsiTheme="majorHAnsi" w:cstheme="majorHAnsi"/>
+          <w:color w:val="000000" w:themeColor="text1"/>
+          <w:sz w:val="28"/>
+          <w:szCs w:val="28"/>
+        </w:rPr>
+      </w:pPr>
+      <w:r>
+        <w:rPr>
+          <w:rFonts w:asciiTheme="majorHAnsi" w:hAnsiTheme="majorHAnsi" w:cstheme="majorHAnsi"/>
+          <w:color w:val="000000" w:themeColor="text1"/>
+          <w:sz w:val="28"/>
+          <w:szCs w:val="28"/>
+        </w:rPr>
+        <w:lastRenderedPageBreak/>
+        <w:t>A. Increasing CPU speed</w:t>
+      </w:r>
+      <w:r>
+        <w:rPr>
+          <w:rFonts w:asciiTheme="majorHAnsi" w:hAnsiTheme="majorHAnsi" w:cstheme="majorHAnsi"/>
+          <w:color w:val="000000" w:themeColor="text1"/>
+          <w:sz w:val="28"/>
+          <w:szCs w:val="28"/>
+        </w:rPr>
+        <w:br/>
+        <w:t>B. Running programs larger than physical memory</w:t>
+      </w:r>
+      <w:r>
+        <w:rPr>
+          <w:rFonts w:asciiTheme="majorHAnsi" w:hAnsiTheme="majorHAnsi" w:cstheme="majorHAnsi"/>
+          <w:color w:val="000000" w:themeColor="text1"/>
+          <w:sz w:val="28"/>
+          <w:szCs w:val="28"/>
+        </w:rPr>
+        <w:br/>
+        <w:t>C. Managing files</w:t>
+      </w:r>
+      <w:r>
+        <w:rPr>
+          <w:rFonts w:asciiTheme="majorHAnsi" w:hAnsiTheme="majorHAnsi" w:cstheme="majorHAnsi"/>
+          <w:color w:val="000000" w:themeColor="text1"/>
+          <w:sz w:val="28"/>
+          <w:szCs w:val="28"/>
+        </w:rPr>
+        <w:br/>
+        <w:t>D. Controlling devices</w:t>
+      </w:r>
+    </w:p>
+    <w:p>
+      <w:pPr>
+        <w:rPr>
+          <w:rFonts w:asciiTheme="majorHAnsi" w:hAnsiTheme="majorHAnsi" w:cstheme="majorHAnsi"/>
+          <w:color w:val="000000" w:themeColor="text1"/>
+          <w:sz w:val="28"/>
+          <w:szCs w:val="28"/>
+        </w:rPr>
+      </w:pPr>
+      <w:r>
+        <w:rPr>
+          <w:rFonts w:asciiTheme="majorHAnsi" w:hAnsiTheme="majorHAnsi" w:cstheme="majorHAnsi"/>
+          <w:b/>
+          <w:bCs/>
+          <w:color w:val="000000" w:themeColor="text1"/>
+          <w:sz w:val="28"/>
+          <w:szCs w:val="28"/>
+        </w:rPr>
+        <w:t>Answer:</w:t>
+      </w:r>
+      <w:r>
+        <w:rPr>
+          <w:rFonts w:asciiTheme="majorHAnsi" w:hAnsiTheme="majorHAnsi" w:cstheme="majorHAnsi"/>
+          <w:color w:val="000000" w:themeColor="text1"/>
+          <w:sz w:val="28"/>
+          <w:szCs w:val="28"/>
+        </w:rPr>
+        <w:t xml:space="preserve"> B</w:t>
+      </w:r>
+    </w:p>
+    <w:p>
+      <w:pPr>
+        <w:rPr>
+          <w:rFonts w:asciiTheme="majorHAnsi" w:hAnsiTheme="majorHAnsi" w:cstheme="majorHAnsi"/>
+          <w:b/>
+          <w:bCs/>
+          <w:i/>
+          <w:iCs/>
+          <w:color w:val="00B0F0"/>
+          <w:sz w:val="28"/>
+          <w:szCs w:val="28"/>
+        </w:rPr>
+      </w:pPr>
+      <w:r>
+        <w:rPr>
+          <w:rFonts w:asciiTheme="majorHAnsi" w:hAnsiTheme="majorHAnsi" w:cstheme="majorHAnsi"/>
+          <w:b/>
+          <w:bCs/>
+          <w:i/>
+          <w:iCs/>
+          <w:color w:val="00B0F0"/>
+          <w:sz w:val="28"/>
+          <w:szCs w:val="28"/>
+        </w:rPr>
+        <w:t>5. File Systems</w:t>
+      </w:r>
+    </w:p>
+    <w:p>
+      <w:pPr>
+        <w:rPr>
+          <w:rFonts w:asciiTheme="majorHAnsi" w:hAnsiTheme="majorHAnsi" w:cstheme="majorHAnsi"/>
+          <w:color w:val="000000" w:themeColor="text1"/>
+          <w:sz w:val="28"/>
+          <w:szCs w:val="28"/>
+        </w:rPr>
+      </w:pPr>
+      <w:r>
+        <w:rPr>
+          <w:rFonts w:asciiTheme="majorHAnsi" w:hAnsiTheme="majorHAnsi" w:cstheme="majorHAnsi"/>
+          <w:b/>
+          <w:bCs/>
+          <w:color w:val="000000" w:themeColor="text1"/>
+          <w:sz w:val="28"/>
+          <w:szCs w:val="28"/>
+        </w:rPr>
+        <w:t>14. What is a file in an operating system?</w:t>
+      </w:r>
+    </w:p>
+    <w:p>
+      <w:pPr>
+        <w:rPr>
+          <w:rFonts w:asciiTheme="majorHAnsi" w:hAnsiTheme="majorHAnsi" w:cstheme="majorHAnsi"/>
+          <w:color w:val="000000" w:themeColor="text1"/>
+          <w:sz w:val="28"/>
+          <w:szCs w:val="28"/>
+        </w:rPr>
+      </w:pPr>
+      <w:r>
+        <w:rPr>
+          <w:rFonts w:asciiTheme="majorHAnsi" w:hAnsiTheme="majorHAnsi" w:cstheme="majorHAnsi"/>
+          <w:color w:val="000000" w:themeColor="text1"/>
+          <w:sz w:val="28"/>
+          <w:szCs w:val="28"/>
+        </w:rPr>
+        <w:t>A. A logical unit for storing data</w:t>
+      </w:r>
+      <w:r>
+        <w:rPr>
+          <w:rFonts w:asciiTheme="majorHAnsi" w:hAnsiTheme="majorHAnsi" w:cstheme="majorHAnsi"/>
+          <w:color w:val="000000" w:themeColor="text1"/>
+          <w:sz w:val="28"/>
+          <w:szCs w:val="28"/>
+        </w:rPr>
+        <w:br/>
+        <w:t>B. A type of CPU process</w:t>
+      </w:r>
+      <w:r>
+        <w:rPr>
+          <w:rFonts w:asciiTheme="majorHAnsi" w:hAnsiTheme="majorHAnsi" w:cstheme="majorHAnsi"/>
+          <w:color w:val="000000" w:themeColor="text1"/>
+          <w:sz w:val="28"/>
+          <w:szCs w:val="28"/>
+        </w:rPr>
+        <w:br/>
+        <w:t>C. A scheduling method</w:t>
+      </w:r>
+      <w:r>
+        <w:rPr>
+          <w:rFonts w:asciiTheme="majorHAnsi" w:hAnsiTheme="majorHAnsi" w:cstheme="majorHAnsi"/>
+          <w:color w:val="000000" w:themeColor="text1"/>
+          <w:sz w:val="28"/>
+          <w:szCs w:val="28"/>
+        </w:rPr>
+        <w:br/>
+        <w:t>D. A memory frame</w:t>
+      </w:r>
+    </w:p>
+    <w:p>
+      <w:pPr>
+        <w:rPr>
+          <w:rFonts w:asciiTheme="majorHAnsi" w:hAnsiTheme="majorHAnsi" w:cstheme="majorHAnsi"/>
+          <w:color w:val="000000" w:themeColor="text1"/>
+          <w:sz w:val="28"/>
+          <w:szCs w:val="28"/>
+        </w:rPr>
+      </w:pPr>
+      <w:r>
+        <w:rPr>
+          <w:rFonts w:asciiTheme="majorHAnsi" w:hAnsiTheme="majorHAnsi" w:cstheme="majorHAnsi"/>
+          <w:b/>
+          <w:bCs/>
+          <w:color w:val="000000" w:themeColor="text1"/>
+          <w:sz w:val="28"/>
+          <w:szCs w:val="28"/>
+        </w:rPr>
+        <w:t>Answer:</w:t>
+      </w:r>
+      <w:r>
+        <w:rPr>
+          <w:rFonts w:asciiTheme="majorHAnsi" w:hAnsiTheme="majorHAnsi" w:cstheme="majorHAnsi"/>
+          <w:color w:val="000000" w:themeColor="text1"/>
+          <w:sz w:val="28"/>
+          <w:szCs w:val="28"/>
+        </w:rPr>
+        <w:t xml:space="preserve"> A</w:t>
+      </w:r>
+    </w:p>
+    <w:p>
+      <w:pPr>
+        <w:rPr>
+          <w:rFonts w:asciiTheme="majorHAnsi" w:hAnsiTheme="majorHAnsi" w:cstheme="majorHAnsi"/>
+          <w:color w:val="000000" w:themeColor="text1"/>
+          <w:sz w:val="28"/>
+          <w:szCs w:val="28"/>
+        </w:rPr>
+      </w:pPr>
+      <w:r>
+        <w:rPr>
+          <w:rFonts w:asciiTheme="majorHAnsi" w:hAnsiTheme="majorHAnsi" w:cstheme="majorHAnsi"/>
+          <w:b/>
+          <w:bCs/>
+          <w:color w:val="000000" w:themeColor="text1"/>
+          <w:sz w:val="28"/>
+          <w:szCs w:val="28"/>
+        </w:rPr>
+        <w:t>15. Which allocation method stores files in consecutive blocks?</w:t>
+      </w:r>
+    </w:p>
+    <w:p>
+      <w:pPr>
+        <w:rPr>
+          <w:rFonts w:asciiTheme="majorHAnsi" w:hAnsiTheme="majorHAnsi" w:cstheme="majorHAnsi"/>
+          <w:color w:val="000000" w:themeColor="text1"/>
+          <w:sz w:val="28"/>
+          <w:szCs w:val="28"/>
+        </w:rPr>
+      </w:pPr>
+      <w:r>
+        <w:rPr>
+          <w:rFonts w:asciiTheme="majorHAnsi" w:hAnsiTheme="majorHAnsi" w:cstheme="majorHAnsi"/>
+          <w:color w:val="000000" w:themeColor="text1"/>
+          <w:sz w:val="28"/>
+          <w:szCs w:val="28"/>
+        </w:rPr>
+        <w:t>A. Linked allocation</w:t>
+      </w:r>
+      <w:r>
+        <w:rPr>
+          <w:rFonts w:asciiTheme="majorHAnsi" w:hAnsiTheme="majorHAnsi" w:cstheme="majorHAnsi"/>
+          <w:color w:val="000000" w:themeColor="text1"/>
+          <w:sz w:val="28"/>
+          <w:szCs w:val="28"/>
+        </w:rPr>
+        <w:br/>
+        <w:t>B. Indexed allocation</w:t>
+      </w:r>
+      <w:r>
+        <w:rPr>
+          <w:rFonts w:asciiTheme="majorHAnsi" w:hAnsiTheme="majorHAnsi" w:cstheme="majorHAnsi"/>
+          <w:color w:val="000000" w:themeColor="text1"/>
+          <w:sz w:val="28"/>
+          <w:szCs w:val="28"/>
+        </w:rPr>
+        <w:br/>
+        <w:t>C. Contiguous allocation</w:t>
+      </w:r>
+      <w:r>
+        <w:rPr>
+          <w:rFonts w:asciiTheme="majorHAnsi" w:hAnsiTheme="majorHAnsi" w:cstheme="majorHAnsi"/>
+          <w:color w:val="000000" w:themeColor="text1"/>
+          <w:sz w:val="28"/>
+          <w:szCs w:val="28"/>
+        </w:rPr>
+        <w:br/>
+        <w:t>D. Dynamic allocation</w:t>
+      </w:r>
+    </w:p>
+    <w:p>
+      <w:pPr>
+        <w:rPr>
+          <w:rFonts w:asciiTheme="majorHAnsi" w:hAnsiTheme="majorHAnsi" w:cstheme="majorHAnsi"/>
+          <w:color w:val="000000" w:themeColor="text1"/>
+          <w:sz w:val="28"/>
+          <w:szCs w:val="28"/>
+        </w:rPr>
+      </w:pPr>
+      <w:r>
+        <w:rPr>
+          <w:rFonts w:asciiTheme="majorHAnsi" w:hAnsiTheme="majorHAnsi" w:cstheme="majorHAnsi"/>
+          <w:b/>
+          <w:bCs/>
+          <w:color w:val="000000" w:themeColor="text1"/>
+          <w:sz w:val="28"/>
+          <w:szCs w:val="28"/>
+        </w:rPr>
+        <w:t>Answer:</w:t>
+      </w:r>
+      <w:r>
+        <w:rPr>
+          <w:rFonts w:asciiTheme="majorHAnsi" w:hAnsiTheme="majorHAnsi" w:cstheme="majorHAnsi"/>
+          <w:color w:val="000000" w:themeColor="text1"/>
+          <w:sz w:val="28"/>
+          <w:szCs w:val="28"/>
+        </w:rPr>
+        <w:t xml:space="preserve"> C</w:t>
+      </w:r>
+    </w:p>
+    <w:p>
+      <w:pPr>
+        <w:rPr>
+          <w:rFonts w:asciiTheme="majorHAnsi" w:hAnsiTheme="majorHAnsi" w:cstheme="majorHAnsi"/>
+          <w:color w:val="000000" w:themeColor="text1"/>
+          <w:sz w:val="28"/>
+          <w:szCs w:val="28"/>
+        </w:rPr>
+      </w:pPr>
+      <w:r>
+        <w:rPr>
+          <w:rFonts w:asciiTheme="majorHAnsi" w:hAnsiTheme="majorHAnsi" w:cstheme="majorHAnsi"/>
+          <w:b/>
+          <w:bCs/>
+          <w:color w:val="000000" w:themeColor="text1"/>
+          <w:sz w:val="28"/>
+          <w:szCs w:val="28"/>
+        </w:rPr>
+        <w:t>16. What is the role of the Virtual File System (VFS)?</w:t>
+      </w:r>
+    </w:p>
+    <w:p>
+      <w:pPr>
+        <w:rPr>
+          <w:rFonts w:asciiTheme="majorHAnsi" w:hAnsiTheme="majorHAnsi" w:cstheme="majorHAnsi"/>
+          <w:color w:val="000000" w:themeColor="text1"/>
+          <w:sz w:val="28"/>
+          <w:szCs w:val="28"/>
+        </w:rPr>
+      </w:pPr>
+      <w:r>
+        <w:rPr>
+          <w:rFonts w:asciiTheme="majorHAnsi" w:hAnsiTheme="majorHAnsi" w:cstheme="majorHAnsi"/>
+          <w:color w:val="000000" w:themeColor="text1"/>
+          <w:sz w:val="28"/>
+          <w:szCs w:val="28"/>
+        </w:rPr>
+        <w:t>A. Increase CPU performance</w:t>
+      </w:r>
+      <w:r>
+        <w:rPr>
+          <w:rFonts w:asciiTheme="majorHAnsi" w:hAnsiTheme="majorHAnsi" w:cstheme="majorHAnsi"/>
+          <w:color w:val="000000" w:themeColor="text1"/>
+          <w:sz w:val="28"/>
+          <w:szCs w:val="28"/>
+        </w:rPr>
+        <w:br/>
+        <w:t>B. Provide a unified interface for different file systems</w:t>
+      </w:r>
+      <w:r>
+        <w:rPr>
+          <w:rFonts w:asciiTheme="majorHAnsi" w:hAnsiTheme="majorHAnsi" w:cstheme="majorHAnsi"/>
+          <w:color w:val="000000" w:themeColor="text1"/>
+          <w:sz w:val="28"/>
+          <w:szCs w:val="28"/>
+        </w:rPr>
+        <w:br/>
+        <w:t>C. Replace RAM</w:t>
+      </w:r>
+      <w:r>
+        <w:rPr>
+          <w:rFonts w:asciiTheme="majorHAnsi" w:hAnsiTheme="majorHAnsi" w:cstheme="majorHAnsi"/>
+          <w:color w:val="000000" w:themeColor="text1"/>
+          <w:sz w:val="28"/>
+          <w:szCs w:val="28"/>
+        </w:rPr>
+        <w:br/>
+        <w:t>D. Manage network connections</w:t>
+      </w:r>
+    </w:p>
+    <w:p>
+      <w:pPr>
+        <w:rPr>
+          <w:rFonts w:asciiTheme="majorHAnsi" w:hAnsiTheme="majorHAnsi" w:cstheme="majorHAnsi"/>
+          <w:color w:val="000000" w:themeColor="text1"/>
+          <w:sz w:val="28"/>
+          <w:szCs w:val="28"/>
+        </w:rPr>
+      </w:pPr>
+      <w:r>
+        <w:rPr>
+          <w:rFonts w:asciiTheme="majorHAnsi" w:hAnsiTheme="majorHAnsi" w:cstheme="majorHAnsi"/>
+          <w:b/>
+          <w:bCs/>
+          <w:color w:val="000000" w:themeColor="text1"/>
+          <w:sz w:val="28"/>
+          <w:szCs w:val="28"/>
+        </w:rPr>
+        <w:t>Answer:</w:t>
+      </w:r>
+      <w:r>
+        <w:rPr>
+          <w:rFonts w:asciiTheme="majorHAnsi" w:hAnsiTheme="majorHAnsi" w:cstheme="majorHAnsi"/>
+          <w:color w:val="000000" w:themeColor="text1"/>
+          <w:sz w:val="28"/>
+          <w:szCs w:val="28"/>
+        </w:rPr>
+        <w:t xml:space="preserve"> B</w:t>
+      </w:r>
+    </w:p>
+    <w:p>
+      <w:pPr>
+        <w:rPr>
+          <w:rFonts w:asciiTheme="majorHAnsi" w:hAnsiTheme="majorHAnsi" w:cstheme="majorHAnsi"/>
+          <w:color w:val="000000" w:themeColor="text1"/>
           <w:sz w:val="28"/>
           <w:szCs w:val="28"/>
         </w:rPr>

</xml_diff>